<commit_message>
eCRF-titelnummers rechtgezet: interne 'Appendix'-titel klopte niet met het toegekende documentnummer
Doc 10 zei intern nog "Appendix 9" (verschuiving door eerdere nummeropruiming),
doc 42 en 43 zeiden allebei "Appendix 41" (kopieerfout). Titels aangepast aan het
bestandsnummer, niet omgekeerd.
</commit_message>
<xml_diff>
--- a/(e)CRF/Per nummer/10_Voorschrift aangepaste voetorthese (CMFO).docx
+++ b/(e)CRF/Per nummer/10_Voorschrift aangepaste voetorthese (CMFO).docx
@@ -1,70 +1,253 @@
 
 <file path=word/document.xml><?xml version="1.0" encoding="utf-8"?>
-<w:document xmlns:wpc="http://schemas.microsoft.com/office/word/2010/wordprocessingCanvas" xmlns:cx="http://schemas.microsoft.com/office/drawing/2014/chartex" xmlns:cx1="http://schemas.microsoft.com/office/drawing/2015/9/8/chartex" xmlns:cx2="http://schemas.microsoft.com/office/drawing/2015/10/21/chartex" xmlns:cx3="http://schemas.microsoft.com/office/drawing/2016/5/9/chartex" xmlns:cx4="http://schemas.microsoft.com/office/drawing/2016/5/10/chartex" xmlns:cx5="http://schemas.microsoft.com/office/drawing/2016/5/11/chartex" xmlns:cx6="http://schemas.microsoft.com/office/drawing/2016/5/12/chartex" xmlns:cx7="http://schemas.microsoft.com/office/drawing/2016/5/13/chartex" xmlns:cx8="http://schemas.microsoft.com/office/drawing/2016/5/14/chartex" xmlns:mc="http://schemas.openxmlformats.org/markup-compatibility/2006" xmlns:aink="http://schemas.microsoft.com/office/drawing/2016/ink" xmlns:am3d="http://schemas.microsoft.com/office/drawing/2017/model3d" xmlns:o="urn:schemas-microsoft-com:office:office" xmlns:oel="http://schemas.microsoft.com/office/2019/extlst" xmlns:r="http://schemas.openxmlformats.org/officeDocument/2006/relationships" xmlns:m="http://schemas.openxmlformats.org/officeDocument/2006/math" xmlns:v="urn:schemas-microsoft-com:vml" xmlns:wp14="http://schemas.microsoft.com/office/word/2010/wordprocessingDrawing" xmlns:wp="http://schemas.openxmlformats.org/drawingml/2006/wordprocessingDrawing" xmlns:w10="urn:schemas-microsoft-com:office:word" xmlns:w="http://schemas.openxmlformats.org/wordprocessingml/2006/main" xmlns:w14="http://schemas.microsoft.com/office/word/2010/wordml" xmlns:w15="http://schemas.microsoft.com/office/word/2012/wordml" xmlns:w16cex="http://schemas.microsoft.com/office/word/2018/wordml/cex" xmlns:w16cid="http://schemas.microsoft.com/office/word/2016/wordml/cid" xmlns:w16="http://schemas.microsoft.com/office/word/2018/wordml" xmlns:w16du="http://schemas.microsoft.com/office/word/2023/wordml/word16du" xmlns:w16sdtdh="http://schemas.microsoft.com/office/word/2020/wordml/sdtdatahash" xmlns:w16sdtfl="http://schemas.microsoft.com/office/word/2024/wordml/sdtformatlock" xmlns:w16se="http://schemas.microsoft.com/office/word/2015/wordml/symex" xmlns:wpg="http://schemas.microsoft.com/office/word/2010/wordprocessingGroup" xmlns:wpi="http://schemas.microsoft.com/office/word/2010/wordprocessingInk" xmlns:wne="http://schemas.microsoft.com/office/word/2006/wordml" xmlns:wps="http://schemas.microsoft.com/office/word/2010/wordprocessingShape" xmlns:a="http://schemas.openxmlformats.org/drawingml/2006/main" xmlns:pic="http://schemas.openxmlformats.org/drawingml/2006/picture" xmlns:a14="http://schemas.microsoft.com/office/drawing/2010/main" mc:Ignorable="w14 w15 w16se w16cid w16 w16cex w16sdtdh w16sdtfl w16du wp14">
+<w:document xmlns:wpc="http://schemas.microsoft.com/office/word/2010/wordprocessingCanvas" xmlns:cx="http://schemas.microsoft.com/office/drawing/2014/chartex" xmlns:cx1="http://schemas.microsoft.com/office/drawing/2015/9/8/chartex" xmlns:cx2="http://schemas.microsoft.com/office/drawing/2015/10/21/chartex" xmlns:cx3="http://schemas.microsoft.com/office/drawing/2016/5/9/chartex" xmlns:cx4="http://schemas.microsoft.com/office/drawing/2016/5/10/chartex" xmlns:cx5="http://schemas.microsoft.com/office/drawing/2016/5/11/chartex" xmlns:cx6="http://schemas.microsoft.com/office/drawing/2016/5/12/chartex" xmlns:cx7="http://schemas.microsoft.com/office/drawing/2016/5/13/chartex" xmlns:cx8="http://schemas.microsoft.com/office/drawing/2016/5/14/chartex" xmlns:mc="http://schemas.openxmlformats.org/markup-compatibility/2006" xmlns:aink="http://schemas.microsoft.com/office/drawing/2016/ink" xmlns:am3d="http://schemas.microsoft.com/office/drawing/2017/model3d" xmlns:o="urn:schemas-microsoft-com:office:office" xmlns:oel="http://schemas.microsoft.com/office/2019/extlst" xmlns:r="http://schemas.openxmlformats.org/officeDocument/2006/relationships" xmlns:m="http://schemas.openxmlformats.org/officeDocument/2006/math" xmlns:v="urn:schemas-microsoft-com:vml" xmlns:wp14="http://schemas.microsoft.com/office/word/2010/wordprocessingDrawing" xmlns:wp="http://schemas.openxmlformats.org/drawingml/2006/wordprocessingDrawing" xmlns:w10="urn:schemas-microsoft-com:office:word" xmlns:w="http://schemas.openxmlformats.org/wordprocessingml/2006/main" xmlns:w14="http://schemas.microsoft.com/office/word/2010/wordml" xmlns:w15="http://schemas.microsoft.com/office/word/2012/wordml" xmlns:w16cei="http://schemas.microsoft.com/office/word/2026/wordml/cei" xmlns:w16cex="http://schemas.microsoft.com/office/word/2018/wordml/cex" xmlns:w16cid="http://schemas.microsoft.com/office/word/2016/wordml/cid" xmlns:w16="http://schemas.microsoft.com/office/word/2018/wordml" xmlns:w16du="http://schemas.microsoft.com/office/word/2023/wordml/word16du" xmlns:w16sdtdh="http://schemas.microsoft.com/office/word/2020/wordml/sdtdatahash" xmlns:w16sdtfl="http://schemas.microsoft.com/office/word/2024/wordml/sdtformatlock" xmlns:w16se="http://schemas.microsoft.com/office/word/2015/wordml/symex" xmlns:wpg="http://schemas.microsoft.com/office/word/2010/wordprocessingGroup" xmlns:wpi="http://schemas.microsoft.com/office/word/2010/wordprocessingInk" xmlns:wne="http://schemas.microsoft.com/office/word/2006/wordml" xmlns:wps="http://schemas.microsoft.com/office/word/2010/wordprocessingShape" mc:Ignorable="w14 w15 w16se w16cid w16 w16cex w16sdtdh w16sdtfl w16du wp14">
   <w:body>
     <w:p>
       <w:pPr>
-        <w:pStyle w:val="ListParagraph"/>
+        <w:pStyle w:val="Lijstalinea"/>
         <w:spacing w:after="120" w:line="360" w:lineRule="auto"/>
         <w:ind w:left="1080"/>
         <w:jc w:val="center"/>
         <w:rPr>
-          <w:rFonts w:ascii="Calibri" w:hAnsi="Calibri" w:cs="Calibri"/>
-          <w:b w:val="1"/>
-          <w:bCs w:val="1"/>
-          <w:color w:val="EE0000"/>
-          <w:sz w:val="28"/>
-          <w:szCs w:val="28"/>
-          <w:lang w:val="en-US"/>
-        </w:rPr>
-      </w:pPr>
-      <w:r>
-        <w:rPr>
-          <w:rFonts w:ascii="Arial" w:hAnsi="Arial" w:cs="Arial" w:eastAsia="Arial"/>
-          <w:b w:val="1"/>
-          <w:bCs w:val="1"/>
+          <w:b/>
+          <w:bCs/>
           <w:color w:val="123A5F"/>
           <w:sz w:val="28"/>
           <w:szCs w:val="28"/>
           <w:lang w:val="en-US"/>
         </w:rPr>
-        <w:t xml:space="preserve">Appendix </w:t>
-      </w:r>
-      <w:r>
-        <w:rPr>
-          <w:rFonts w:ascii="Calibri" w:hAnsi="Calibri" w:cs="Calibri"/>
-          <w:b w:val="1"/>
-          <w:bCs w:val="1"/>
-          <w:color w:val="000000" w:themeColor="text1" w:themeTint="FF" w:themeShade="FF"/>
-          <w:sz w:val="28"/>
-          <w:szCs w:val="28"/>
-          <w:lang w:val="en-US"/>
-        </w:rPr>
-        <w:t>10</w:t>
-      </w:r>
-      <w:r>
-        <w:rPr>
-          <w:rFonts w:ascii="Arial" w:hAnsi="Arial" w:cs="Arial" w:eastAsia="Arial"/>
-          <w:b w:val="1"/>
-          <w:bCs w:val="1"/>
+      </w:pPr>
+      <w:r>
+        <w:rPr>
+          <w:b/>
+          <w:bCs/>
           <w:color w:val="123A5F"/>
           <w:sz w:val="28"/>
           <w:szCs w:val="28"/>
           <w:lang w:val="en-US"/>
         </w:rPr>
-        <w:t xml:space="preserve">- </w:t>
-      </w:r>
-      <w:r>
-        <w:rPr>
-          <w:rFonts w:ascii="Arial" w:hAnsi="Arial" w:cs="Arial" w:eastAsia="Arial"/>
-          <w:b w:val="1"/>
-          <w:bCs w:val="1"/>
+        <w:t>Appendix</w:t>
+      </w:r>
+      <w:r>
+        <w:rPr>
+          <w:b/>
+          <w:bCs/>
           <w:color w:val="123A5F"/>
           <w:sz w:val="28"/>
           <w:szCs w:val="28"/>
           <w:lang w:val="en-US"/>
         </w:rPr>
-        <w:t>Prescription Diabetic Custom-made Foot Orthotic</w:t>
+        <w:t xml:space="preserve"> 10</w:t>
+      </w:r>
+      <w:r>
+        <w:rPr>
+          <w:b/>
+          <w:bCs/>
+          <w:color w:val="123A5F"/>
+          <w:sz w:val="28"/>
+          <w:szCs w:val="28"/>
+          <w:lang w:val="en-US"/>
+        </w:rPr>
+        <w:t xml:space="preserve">- </w:t>
+      </w:r>
+      <w:r>
+        <w:rPr>
+          <w:b/>
+          <w:bCs/>
+          <w:color w:val="123A5F"/>
+          <w:sz w:val="28"/>
+          <w:szCs w:val="28"/>
+          <w:lang w:val="en-US"/>
+        </w:rPr>
+        <w:t>Prescription Di</w:t>
+      </w:r>
+      <w:r>
+        <w:rPr>
+          <w:b/>
+          <w:bCs/>
+          <w:color w:val="123A5F"/>
+          <w:sz w:val="28"/>
+          <w:szCs w:val="28"/>
+          <w:lang w:val="en-US"/>
+        </w:rPr>
+        <w:t xml:space="preserve">abetic </w:t>
+      </w:r>
+      <w:r>
+        <w:rPr>
+          <w:b/>
+          <w:bCs/>
+          <w:color w:val="123A5F"/>
+          <w:sz w:val="28"/>
+          <w:szCs w:val="28"/>
+          <w:lang w:val="en-US"/>
+        </w:rPr>
+        <w:t>Custom-made Foot Orthotic</w:t>
+      </w:r>
+    </w:p>
+    <w:p>
+      <w:pPr>
+        <w:tabs>
+          <w:tab w:val="left" w:leader="underscore" w:pos="8505"/>
+        </w:tabs>
+        <w:spacing w:line="360" w:lineRule="auto"/>
+        <w:rPr>
+          <w:rFonts w:ascii="Calibri" w:hAnsi="Calibri" w:cs="Calibri"/>
+          <w:b/>
+          <w:bCs/>
+          <w:sz w:val="24"/>
+          <w:szCs w:val="24"/>
+        </w:rPr>
+      </w:pPr>
+      <w:r>
+        <w:rPr>
+          <w:b/>
+          <w:bCs/>
+          <w:color w:val="123A5F"/>
+          <w:sz w:val="24"/>
+          <w:szCs w:val="24"/>
+        </w:rPr>
+        <w:t>Studie-informatie</w:t>
+      </w:r>
+    </w:p>
+    <w:p>
+      <w:pPr>
+        <w:numPr>
+          <w:ilvl w:val="0"/>
+          <w:numId w:val="3"/>
+        </w:numPr>
+        <w:tabs>
+          <w:tab w:val="left" w:leader="underscore" w:pos="8505"/>
+        </w:tabs>
+        <w:spacing w:line="360" w:lineRule="auto"/>
+        <w:rPr>
+          <w:rFonts w:ascii="Calibri" w:hAnsi="Calibri" w:cs="Calibri"/>
+          <w:lang w:val="en-GB"/>
+        </w:rPr>
+      </w:pPr>
+      <w:r>
+        <w:rPr>
+          <w:color w:val="24303B"/>
+          <w:lang w:val="en-GB"/>
+        </w:rPr>
+        <w:t xml:space="preserve">Studie </w:t>
+      </w:r>
+      <w:proofErr w:type="spellStart"/>
+      <w:r>
+        <w:rPr>
+          <w:color w:val="24303B"/>
+          <w:lang w:val="en-GB"/>
+        </w:rPr>
+        <w:t>titel</w:t>
+      </w:r>
+      <w:proofErr w:type="spellEnd"/>
+      <w:r>
+        <w:rPr>
+          <w:color w:val="24303B"/>
+          <w:lang w:val="en-GB"/>
+        </w:rPr>
+        <w:t>: Towards Pressure-Adherence &amp; Education Driven Service in Diabetic Foot Disease (PARADISE trial)</w:t>
+      </w:r>
+    </w:p>
+    <w:p>
+      <w:pPr>
+        <w:numPr>
+          <w:ilvl w:val="0"/>
+          <w:numId w:val="3"/>
+        </w:numPr>
+        <w:tabs>
+          <w:tab w:val="left" w:leader="underscore" w:pos="8505"/>
+        </w:tabs>
+        <w:spacing w:line="360" w:lineRule="auto"/>
+        <w:rPr>
+          <w:rFonts w:ascii="Calibri" w:hAnsi="Calibri" w:cs="Calibri"/>
+        </w:rPr>
+      </w:pPr>
+      <w:r>
+        <w:rPr>
+          <w:color w:val="24303B"/>
+        </w:rPr>
+        <w:t>Protocolnummer: S71769</w:t>
+      </w:r>
+    </w:p>
+    <w:p>
+      <w:pPr>
+        <w:numPr>
+          <w:ilvl w:val="0"/>
+          <w:numId w:val="3"/>
+        </w:numPr>
+        <w:tabs>
+          <w:tab w:val="left" w:leader="underscore" w:pos="8505"/>
+        </w:tabs>
+        <w:spacing w:line="360" w:lineRule="auto"/>
+        <w:rPr>
+          <w:rFonts w:ascii="Calibri" w:hAnsi="Calibri" w:cs="Calibri"/>
+        </w:rPr>
+      </w:pPr>
+      <w:r>
+        <w:rPr>
+          <w:color w:val="24303B"/>
+        </w:rPr>
+        <w:t xml:space="preserve">Studielocatie: </w:t>
+      </w:r>
+      <w:r>
+        <w:rPr>
+          <w:color w:val="24303B"/>
+        </w:rPr>
+        <w:tab/>
+      </w:r>
+    </w:p>
+    <w:p>
+      <w:pPr>
+        <w:numPr>
+          <w:ilvl w:val="0"/>
+          <w:numId w:val="3"/>
+        </w:numPr>
+        <w:tabs>
+          <w:tab w:val="left" w:leader="underscore" w:pos="8505"/>
+        </w:tabs>
+        <w:spacing w:line="360" w:lineRule="auto"/>
+        <w:rPr>
+          <w:rFonts w:ascii="Calibri" w:hAnsi="Calibri" w:cs="Calibri"/>
+        </w:rPr>
+      </w:pPr>
+      <w:r>
+        <w:rPr>
+          <w:color w:val="24303B"/>
+        </w:rPr>
+        <w:t xml:space="preserve">Hoofdonderzoeker (PI): </w:t>
+      </w:r>
+      <w:r>
+        <w:rPr>
+          <w:color w:val="24303B"/>
+        </w:rPr>
+        <w:tab/>
+      </w:r>
+    </w:p>
+    <w:p>
+      <w:pPr>
+        <w:numPr>
+          <w:ilvl w:val="0"/>
+          <w:numId w:val="3"/>
+        </w:numPr>
+        <w:tabs>
+          <w:tab w:val="left" w:leader="underscore" w:pos="8505"/>
+        </w:tabs>
+        <w:spacing w:line="360" w:lineRule="auto"/>
+        <w:rPr>
+          <w:rFonts w:ascii="Calibri" w:hAnsi="Calibri" w:cs="Calibri"/>
+        </w:rPr>
+      </w:pPr>
+      <w:r>
+        <w:rPr>
+          <w:color w:val="24303B"/>
+        </w:rPr>
+        <w:t xml:space="preserve">Deelnemerscode: </w:t>
+      </w:r>
+      <w:r>
+        <w:rPr>
+          <w:color w:val="24303B"/>
+        </w:rPr>
+        <w:tab/>
       </w:r>
     </w:p>
     <w:p>
@@ -79,9 +262,9 @@
           <w:lang w:val="en-US"/>
         </w:rPr>
       </w:pPr>
-      <w:r>
-        <w:rPr>
-          <w:rFonts w:ascii="Arial" w:hAnsi="Arial" w:cs="Arial" w:eastAsia="Arial"/>
+      <w:proofErr w:type="spellStart"/>
+      <w:r>
+        <w:rPr>
           <w:b/>
           <w:bCs/>
           <w:color w:val="123A5F"/>
@@ -89,12 +272,24 @@
           <w:szCs w:val="24"/>
           <w:lang w:val="en-US"/>
         </w:rPr>
-        <w:t xml:space="preserve">Voetscreening: </w:t>
+        <w:t>Voetscreening</w:t>
+      </w:r>
+      <w:proofErr w:type="spellEnd"/>
+      <w:r>
+        <w:rPr>
+          <w:b/>
+          <w:bCs/>
+          <w:color w:val="123A5F"/>
+          <w:sz w:val="24"/>
+          <w:szCs w:val="24"/>
+          <w:lang w:val="en-US"/>
+        </w:rPr>
+        <w:t xml:space="preserve">: </w:t>
       </w:r>
     </w:p>
     <w:tbl>
       <w:tblPr>
-        <w:tblStyle w:val="TableGrid"/>
+        <w:tblStyle w:val="Tabelraster"/>
         <w:tblW w:w="0" w:type="auto"/>
         <w:tblLook w:val="04A0" w:firstRow="1" w:lastRow="0" w:firstColumn="1" w:lastColumn="0" w:noHBand="0" w:noVBand="1"/>
       </w:tblPr>
@@ -122,9 +317,9 @@
                 <w:lang w:val="en-US"/>
               </w:rPr>
             </w:pPr>
+            <w:proofErr w:type="spellStart"/>
             <w:r>
               <w:rPr>
-                <w:rFonts w:ascii="Arial" w:hAnsi="Arial" w:cs="Arial" w:eastAsia="Arial"/>
                 <w:b/>
                 <w:bCs/>
                 <w:color w:val="123A5F"/>
@@ -134,6 +329,7 @@
               </w:rPr>
               <w:t>Voetdeformiteiten</w:t>
             </w:r>
+            <w:proofErr w:type="spellEnd"/>
           </w:p>
         </w:tc>
         <w:tc>
@@ -156,7 +352,6 @@
             </w:pPr>
             <w:r>
               <w:rPr>
-                <w:rFonts w:ascii="Arial" w:hAnsi="Arial" w:cs="Arial" w:eastAsia="Arial"/>
                 <w:b/>
                 <w:bCs/>
                 <w:color w:val="123A5F"/>
@@ -186,9 +381,9 @@
                 <w:lang w:val="en-US"/>
               </w:rPr>
             </w:pPr>
+            <w:proofErr w:type="spellStart"/>
             <w:r>
               <w:rPr>
-                <w:rFonts w:ascii="Arial" w:hAnsi="Arial" w:cs="Arial" w:eastAsia="Arial"/>
                 <w:b/>
                 <w:bCs/>
                 <w:color w:val="123A5F"/>
@@ -198,6 +393,7 @@
               </w:rPr>
               <w:t>Rechts</w:t>
             </w:r>
+            <w:proofErr w:type="spellEnd"/>
           </w:p>
         </w:tc>
       </w:tr>
@@ -215,14 +411,47 @@
                 <w:lang w:val="en-US"/>
               </w:rPr>
             </w:pPr>
+            <w:proofErr w:type="spellStart"/>
             <w:r>
               <w:rPr>
-                <w:rFonts w:ascii="Arial" w:hAnsi="Arial" w:cs="Arial" w:eastAsia="Arial"/>
                 <w:color w:val="24303B"/>
                 <w:lang w:val="en-US"/>
               </w:rPr>
-              <w:t>Atrofie intrinsieke voetspieren</w:t>
+              <w:t>Atrofie</w:t>
             </w:r>
+            <w:proofErr w:type="spellEnd"/>
+            <w:r>
+              <w:rPr>
+                <w:color w:val="24303B"/>
+                <w:lang w:val="en-US"/>
+              </w:rPr>
+              <w:t xml:space="preserve"> </w:t>
+            </w:r>
+            <w:proofErr w:type="spellStart"/>
+            <w:r>
+              <w:rPr>
+                <w:color w:val="24303B"/>
+                <w:lang w:val="en-US"/>
+              </w:rPr>
+              <w:t>intrinsieke</w:t>
+            </w:r>
+            <w:proofErr w:type="spellEnd"/>
+            <w:r>
+              <w:rPr>
+                <w:color w:val="24303B"/>
+                <w:lang w:val="en-US"/>
+              </w:rPr>
+              <w:t xml:space="preserve"> </w:t>
+            </w:r>
+            <w:proofErr w:type="spellStart"/>
+            <w:r>
+              <w:rPr>
+                <w:color w:val="24303B"/>
+                <w:lang w:val="en-US"/>
+              </w:rPr>
+              <w:t>voetspieren</w:t>
+            </w:r>
+            <w:proofErr w:type="spellEnd"/>
           </w:p>
         </w:tc>
         <w:tc>
@@ -276,14 +505,15 @@
                 <w:lang w:val="en-US"/>
               </w:rPr>
             </w:pPr>
+            <w:proofErr w:type="spellStart"/>
             <w:r>
               <w:rPr>
-                <w:rFonts w:ascii="Arial" w:hAnsi="Arial" w:cs="Arial" w:eastAsia="Arial"/>
                 <w:color w:val="24303B"/>
                 <w:lang w:val="en-US"/>
               </w:rPr>
               <w:t>Teendeformiteiten</w:t>
             </w:r>
+            <w:proofErr w:type="spellEnd"/>
           </w:p>
         </w:tc>
         <w:tc>
@@ -337,14 +567,31 @@
                 <w:lang w:val="en-US"/>
               </w:rPr>
             </w:pPr>
+            <w:proofErr w:type="spellStart"/>
             <w:r>
               <w:rPr>
-                <w:rFonts w:ascii="Arial" w:hAnsi="Arial" w:cs="Arial" w:eastAsia="Arial"/>
                 <w:color w:val="24303B"/>
                 <w:lang w:val="en-US"/>
               </w:rPr>
-              <w:t>Prominente metatarsaalkoppen</w:t>
+              <w:t>Prominente</w:t>
             </w:r>
+            <w:proofErr w:type="spellEnd"/>
+            <w:r>
+              <w:rPr>
+                <w:color w:val="24303B"/>
+                <w:lang w:val="en-US"/>
+              </w:rPr>
+              <w:t xml:space="preserve"> </w:t>
+            </w:r>
+            <w:proofErr w:type="spellStart"/>
+            <w:r>
+              <w:rPr>
+                <w:color w:val="24303B"/>
+                <w:lang w:val="en-US"/>
+              </w:rPr>
+              <w:t>metatarsaalkoppen</w:t>
+            </w:r>
+            <w:proofErr w:type="spellEnd"/>
           </w:p>
         </w:tc>
         <w:tc>
@@ -398,14 +645,31 @@
                 <w:lang w:val="en-US"/>
               </w:rPr>
             </w:pPr>
+            <w:proofErr w:type="spellStart"/>
             <w:r>
               <w:rPr>
-                <w:rFonts w:ascii="Arial" w:hAnsi="Arial" w:cs="Arial" w:eastAsia="Arial"/>
                 <w:color w:val="24303B"/>
                 <w:lang w:val="en-US"/>
               </w:rPr>
-              <w:t>Prominente (bot)uitsteeksels</w:t>
+              <w:t>Prominente</w:t>
             </w:r>
+            <w:proofErr w:type="spellEnd"/>
+            <w:r>
+              <w:rPr>
+                <w:color w:val="24303B"/>
+                <w:lang w:val="en-US"/>
+              </w:rPr>
+              <w:t xml:space="preserve"> (bot)</w:t>
+            </w:r>
+            <w:proofErr w:type="spellStart"/>
+            <w:r>
+              <w:rPr>
+                <w:color w:val="24303B"/>
+                <w:lang w:val="en-US"/>
+              </w:rPr>
+              <w:t>uitsteeksels</w:t>
+            </w:r>
+            <w:proofErr w:type="spellEnd"/>
           </w:p>
         </w:tc>
         <w:tc>
@@ -459,14 +723,31 @@
                 <w:lang w:val="en-US"/>
               </w:rPr>
             </w:pPr>
+            <w:proofErr w:type="spellStart"/>
             <w:r>
               <w:rPr>
-                <w:rFonts w:ascii="Arial" w:hAnsi="Arial" w:cs="Arial" w:eastAsia="Arial"/>
                 <w:color w:val="24303B"/>
                 <w:lang w:val="en-US"/>
               </w:rPr>
-              <w:t>Deformiteiten middenvoet</w:t>
+              <w:t>Deformiteiten</w:t>
             </w:r>
+            <w:proofErr w:type="spellEnd"/>
+            <w:r>
+              <w:rPr>
+                <w:color w:val="24303B"/>
+                <w:lang w:val="en-US"/>
+              </w:rPr>
+              <w:t xml:space="preserve"> </w:t>
+            </w:r>
+            <w:proofErr w:type="spellStart"/>
+            <w:r>
+              <w:rPr>
+                <w:color w:val="24303B"/>
+                <w:lang w:val="en-US"/>
+              </w:rPr>
+              <w:t>middenvoet</w:t>
+            </w:r>
+            <w:proofErr w:type="spellEnd"/>
           </w:p>
         </w:tc>
         <w:tc>
@@ -522,11 +803,26 @@
             </w:pPr>
             <w:r>
               <w:rPr>
-                <w:rFonts w:ascii="Arial" w:hAnsi="Arial" w:cs="Arial" w:eastAsia="Arial"/>
                 <w:color w:val="24303B"/>
                 <w:lang w:val="nl-NL"/>
               </w:rPr>
-              <w:t>Andere structurele deformiteiten (bv. amputatie)</w:t>
+              <w:t xml:space="preserve">Andere structurele </w:t>
+            </w:r>
+            <w:proofErr w:type="spellStart"/>
+            <w:r>
+              <w:rPr>
+                <w:color w:val="24303B"/>
+                <w:lang w:val="nl-NL"/>
+              </w:rPr>
+              <w:t>deformiteiten</w:t>
+            </w:r>
+            <w:proofErr w:type="spellEnd"/>
+            <w:r>
+              <w:rPr>
+                <w:color w:val="24303B"/>
+                <w:lang w:val="nl-NL"/>
+              </w:rPr>
+              <w:t xml:space="preserve"> (bv. amputatie)</w:t>
             </w:r>
           </w:p>
         </w:tc>
@@ -573,98 +869,17 @@
         <w:spacing w:line="240" w:lineRule="auto"/>
         <w:rPr>
           <w:rFonts w:ascii="Calibri" w:hAnsi="Calibri" w:cs="Calibri"/>
-          <w:b w:val="1"/>
-          <w:bCs w:val="1"/>
+          <w:b/>
+          <w:bCs/>
           <w:sz w:val="24"/>
           <w:szCs w:val="24"/>
           <w:lang w:val="nl-NL"/>
         </w:rPr>
       </w:pPr>
-    </w:p>
-    <w:p>
-      <w:pPr>
-        <w:spacing w:line="240" w:lineRule="auto"/>
-        <w:rPr>
-          <w:rFonts w:ascii="Calibri" w:hAnsi="Calibri" w:cs="Calibri"/>
-          <w:b w:val="1"/>
-          <w:bCs w:val="1"/>
-          <w:sz w:val="24"/>
-          <w:szCs w:val="24"/>
-          <w:lang w:val="nl-NL"/>
-        </w:rPr>
-      </w:pPr>
-      <w:r>
-        <w:rPr>
-          <w:rFonts w:ascii="Arial" w:hAnsi="Arial" w:cs="Arial" w:eastAsia="Arial"/>
-          <w:noProof/>
-          <w:color w:val="24303B"/>
-          <w:sz w:val="20"/>
-          <w:szCs w:val="20"/>
-        </w:rPr>
-        <w:drawing>
-          <wp:anchor distT="0" distB="0" distL="114300" distR="114300" simplePos="0" relativeHeight="251657216" behindDoc="0" locked="0" layoutInCell="1" allowOverlap="1" wp14:anchorId="1B81036B" wp14:editId="66E989F2">
-            <wp:simplePos x="0" y="0"/>
-            <wp:positionH relativeFrom="column">
-              <wp:posOffset>3637915</wp:posOffset>
-            </wp:positionH>
-            <wp:positionV relativeFrom="paragraph">
-              <wp:posOffset>215265</wp:posOffset>
-            </wp:positionV>
-            <wp:extent cx="2349500" cy="1860550"/>
-            <wp:effectExtent l="0" t="0" r="0" b="6350"/>
-            <wp:wrapSquare wrapText="bothSides"/>
-            <wp:docPr id="750945846" name="Picture 3"/>
-            <wp:cNvGraphicFramePr>
-              <a:graphicFrameLocks xmlns:a="http://schemas.openxmlformats.org/drawingml/2006/main" noChangeAspect="1"/>
-            </wp:cNvGraphicFramePr>
-            <a:graphic xmlns:a="http://schemas.openxmlformats.org/drawingml/2006/main">
-              <a:graphicData uri="http://schemas.openxmlformats.org/drawingml/2006/picture">
-                <pic:pic xmlns:pic="http://schemas.openxmlformats.org/drawingml/2006/picture">
-                  <pic:nvPicPr>
-                    <pic:cNvPr id="0" name="Picture 2"/>
-                    <pic:cNvPicPr>
-                      <a:picLocks noChangeAspect="1" noChangeArrowheads="1"/>
-                    </pic:cNvPicPr>
-                  </pic:nvPicPr>
-                  <pic:blipFill>
-                    <a:blip r:embed="rId7">
-                      <a:extLst>
-                        <a:ext uri="{28A0092B-C50C-407E-A947-70E740481C1C}">
-                          <a14:useLocalDpi xmlns:a14="http://schemas.microsoft.com/office/drawing/2010/main" val="0"/>
-                        </a:ext>
-                      </a:extLst>
-                    </a:blip>
-                    <a:srcRect/>
-                    <a:stretch>
-                      <a:fillRect/>
-                    </a:stretch>
-                  </pic:blipFill>
-                  <pic:spPr bwMode="auto">
-                    <a:xfrm>
-                      <a:off x="0" y="0"/>
-                      <a:ext cx="2349500" cy="1860550"/>
-                    </a:xfrm>
-                    <a:prstGeom prst="rect">
-                      <a:avLst/>
-                    </a:prstGeom>
-                    <a:noFill/>
-                  </pic:spPr>
-                </pic:pic>
-              </a:graphicData>
-            </a:graphic>
-            <wp14:sizeRelH relativeFrom="page">
-              <wp14:pctWidth>0</wp14:pctWidth>
-            </wp14:sizeRelH>
-            <wp14:sizeRelV relativeFrom="page">
-              <wp14:pctHeight>0</wp14:pctHeight>
-            </wp14:sizeRelV>
-          </wp:anchor>
-        </w:drawing>
-      </w:r>
     </w:p>
     <w:tbl>
       <w:tblPr>
-        <w:tblStyle w:val="TableGrid"/>
+        <w:tblStyle w:val="Tabelraster"/>
         <w:tblW w:w="8940" w:type="dxa"/>
         <w:tblLook w:val="04A0" w:firstRow="1" w:lastRow="0" w:firstColumn="1" w:lastColumn="0" w:noHBand="0" w:noVBand="1"/>
       </w:tblPr>
@@ -678,1289 +893,222 @@
         <w:tc>
           <w:tcPr>
             <w:tcW w:w="8940" w:type="dxa"/>
-            <w:tcMar/>
           </w:tcPr>
           <w:p>
             <w:pPr>
-              <w:rPr>
-                <w:rFonts w:ascii="Calibri" w:hAnsi="Calibri" w:cs="Calibri"/>
-                <w:b w:val="1"/>
-                <w:bCs w:val="1"/>
+              <w:spacing w:line="240" w:lineRule="auto"/>
+              <w:jc w:val="both"/>
+            </w:pPr>
+            <w:r>
+              <w:rPr>
+                <w:rFonts w:ascii="Calibri" w:eastAsia="Calibri" w:hAnsi="Calibri" w:cs="Calibri"/>
+                <w:color w:val="000000" w:themeColor="text1"/>
                 <w:sz w:val="24"/>
                 <w:szCs w:val="24"/>
-                <w:lang w:val="nl-NL"/>
-              </w:rPr>
+              </w:rPr>
+              <w:t xml:space="preserve">Voet (links/rechts) , Locatie van het ulcus ,  </w:t>
+            </w:r>
+            <w:r>
+              <w:rPr>
+                <w:rFonts w:ascii="Calibri" w:eastAsia="Calibri" w:hAnsi="Calibri" w:cs="Calibri"/>
+                <w:color w:val="000000" w:themeColor="text1"/>
+                <w:sz w:val="24"/>
+                <w:szCs w:val="24"/>
+              </w:rPr>
+              <w:t xml:space="preserve">                                      </w:t>
+            </w:r>
+            <w:r>
+              <w:rPr>
+                <w:rFonts w:ascii="Calibri" w:eastAsia="Calibri" w:hAnsi="Calibri" w:cs="Calibri"/>
+                <w:color w:val="000000" w:themeColor="text1"/>
+                <w:sz w:val="24"/>
+                <w:szCs w:val="24"/>
+              </w:rPr>
+              <w:t xml:space="preserve">Datum van genezing </w:t>
+            </w:r>
+          </w:p>
+          <w:p>
+            <w:pPr>
+              <w:spacing w:line="240" w:lineRule="auto"/>
+              <w:jc w:val="both"/>
+            </w:pPr>
+            <w:r>
+              <w:rPr>
+                <w:rFonts w:ascii="Calibri" w:eastAsia="Calibri" w:hAnsi="Calibri" w:cs="Calibri"/>
+                <w:color w:val="000000" w:themeColor="text1"/>
+                <w:sz w:val="24"/>
+                <w:szCs w:val="24"/>
+              </w:rPr>
+              <w:t xml:space="preserve">1 , ☐ Links ☐ Rechts , __________________ ,                                    ____ / ____ / ______ </w:t>
+            </w:r>
+          </w:p>
+          <w:p>
+            <w:pPr>
+              <w:spacing w:line="240" w:lineRule="auto"/>
+              <w:jc w:val="both"/>
+            </w:pPr>
+            <w:r>
+              <w:rPr>
+                <w:rFonts w:ascii="Calibri" w:eastAsia="Calibri" w:hAnsi="Calibri" w:cs="Calibri"/>
+                <w:color w:val="000000" w:themeColor="text1"/>
+                <w:sz w:val="24"/>
+                <w:szCs w:val="24"/>
+              </w:rPr>
+              <w:t xml:space="preserve">2 , ☐ Links ☐ Rechts , __________________ ,                                    ____ / ____ / ______ </w:t>
+            </w:r>
+          </w:p>
+          <w:p>
+            <w:pPr>
+              <w:spacing w:line="240" w:lineRule="auto"/>
+              <w:jc w:val="both"/>
+            </w:pPr>
+            <w:r>
+              <w:rPr>
+                <w:rFonts w:ascii="Calibri" w:eastAsia="Calibri" w:hAnsi="Calibri" w:cs="Calibri"/>
+                <w:color w:val="000000" w:themeColor="text1"/>
+                <w:sz w:val="24"/>
+                <w:szCs w:val="24"/>
+              </w:rPr>
+              <w:t xml:space="preserve">3 , ☐ Links ☐ Rechts , __________________ ,                                    ____ / ____ / ______ </w:t>
+            </w:r>
+          </w:p>
+          <w:p>
+            <w:pPr>
+              <w:spacing w:line="240" w:lineRule="auto"/>
+              <w:jc w:val="both"/>
+            </w:pPr>
+            <w:r>
+              <w:rPr>
+                <w:rFonts w:ascii="Calibri" w:eastAsia="Calibri" w:hAnsi="Calibri" w:cs="Calibri"/>
+                <w:color w:val="000000" w:themeColor="text1"/>
+                <w:sz w:val="24"/>
+                <w:szCs w:val="24"/>
+              </w:rPr>
+              <w:t xml:space="preserve">4 , ☐ Links ☐ Rechts , __________________ ,                                    ____ / ____ / ______ </w:t>
+            </w:r>
+          </w:p>
+          <w:p>
+            <w:pPr>
+              <w:spacing w:line="240" w:lineRule="auto"/>
+              <w:jc w:val="both"/>
+              <w:rPr>
+                <w:rFonts w:ascii="Calibri" w:eastAsia="Calibri" w:hAnsi="Calibri" w:cs="Calibri"/>
+                <w:color w:val="000000" w:themeColor="text1"/>
+                <w:sz w:val="24"/>
+                <w:szCs w:val="24"/>
+              </w:rPr>
+            </w:pPr>
+            <w:r>
+              <w:rPr>
+                <w:rFonts w:ascii="Calibri" w:eastAsia="Calibri" w:hAnsi="Calibri" w:cs="Calibri"/>
+                <w:color w:val="000000" w:themeColor="text1"/>
+                <w:sz w:val="24"/>
+                <w:szCs w:val="24"/>
+              </w:rPr>
+              <w:t xml:space="preserve">5 , ☐ Links ☐ Rechts , __________________ ,                                    ____ / ____ / ______ </w:t>
+            </w:r>
+          </w:p>
+          <w:p>
+            <w:pPr>
+              <w:spacing w:line="240" w:lineRule="auto"/>
+              <w:jc w:val="both"/>
             </w:pPr>
           </w:p>
           <w:p>
             <w:pPr>
-              <w:rPr>
-                <w:rFonts w:ascii="Calibri" w:hAnsi="Calibri" w:cs="Calibri"/>
-                <w:b w:val="1"/>
-                <w:bCs w:val="1"/>
-                <w:color w:val="EE0000"/>
-                <w:sz w:val="28"/>
-                <w:szCs w:val="28"/>
-                <w:lang w:val="nl-NL"/>
-              </w:rPr>
-            </w:pPr>
-          </w:p>
-          <w:p>
-            <w:pPr>
-              <w:rPr>
-                <w:rFonts w:ascii="Calibri" w:hAnsi="Calibri" w:cs="Calibri"/>
-                <w:b w:val="1"/>
-                <w:bCs w:val="1"/>
-                <w:color w:val="EE0000"/>
-                <w:sz w:val="28"/>
-                <w:szCs w:val="28"/>
-                <w:lang w:val="nl-NL"/>
-              </w:rPr>
-            </w:pPr>
-          </w:p>
-          <w:p>
-            <w:pPr>
-              <w:rPr>
-                <w:rFonts w:ascii="Calibri" w:hAnsi="Calibri" w:cs="Calibri"/>
-                <w:b w:val="1"/>
-                <w:bCs w:val="1"/>
+              <w:spacing w:line="240" w:lineRule="auto"/>
+              <w:jc w:val="both"/>
+              <w:rPr>
+                <w:rFonts w:ascii="Calibri" w:eastAsia="Calibri" w:hAnsi="Calibri" w:cs="Calibri"/>
+                <w:color w:val="000000" w:themeColor="text1"/>
                 <w:sz w:val="24"/>
                 <w:szCs w:val="24"/>
-                <w:lang w:val="nl-NL"/>
-              </w:rPr>
-            </w:pPr>
-          </w:p>
-          <w:tbl>
-            <w:tblPr>
-              <w:tblStyle w:val="TableNormal"/>
-              <w:bidiVisual w:val="0"/>
-              <w:tblW w:w="0" w:type="auto"/>
-              <w:tblLook w:val="06A0" w:firstRow="1" w:lastRow="0" w:firstColumn="1" w:lastColumn="0" w:noHBand="1" w:noVBand="1"/>
-            </w:tblPr>
-            <w:tblGrid>
-              <w:gridCol w:w="427"/>
-              <w:gridCol w:w="1499"/>
-              <w:gridCol w:w="1707"/>
-              <w:gridCol w:w="1655"/>
-            </w:tblGrid>
-            <w:tr>
-              <w:trPr>
-                <w:trHeight w:val="300"/>
-              </w:trPr>
-              <w:tc>
-                <w:tcPr>
-                  <w:tcW w:w="427" w:type="dxa"/>
-                  <w:tcMar>
-                    <w:left w:w="105" w:type="dxa"/>
-                    <w:right w:w="105" w:type="dxa"/>
-                  </w:tcMar>
-                  <w:vAlign w:val="center"/>
-                </w:tcPr>
-                <w:p>
-                  <w:pPr>
-                    <w:spacing w:before="0" w:beforeAutospacing="off" w:after="0" w:afterAutospacing="off" w:line="259" w:lineRule="auto"/>
-                    <w:rPr>
-                      <w:rFonts w:ascii="Aptos" w:hAnsi="Aptos" w:eastAsia="Aptos" w:cs="Aptos"/>
-                      <w:b w:val="0"/>
-                      <w:bCs w:val="0"/>
-                      <w:i w:val="0"/>
-                      <w:iCs w:val="0"/>
-                      <w:sz w:val="22"/>
-                      <w:szCs w:val="22"/>
-                      <w:lang w:val="nl-BE"/>
-                    </w:rPr>
-                  </w:pPr>
-                </w:p>
-              </w:tc>
-              <w:tc>
-                <w:tcPr>
-                  <w:tcW w:w="1499" w:type="dxa"/>
-                  <w:tcMar>
-                    <w:left w:w="105" w:type="dxa"/>
-                    <w:right w:w="105" w:type="dxa"/>
-                  </w:tcMar>
-                  <w:vAlign w:val="center"/>
-                </w:tcPr>
-                <w:p>
-                  <w:pPr>
-                    <w:spacing w:before="0" w:beforeAutospacing="off" w:after="0" w:afterAutospacing="off" w:line="259" w:lineRule="auto"/>
-                    <w:rPr>
-                      <w:rFonts w:ascii="Aptos" w:hAnsi="Aptos" w:eastAsia="Aptos" w:cs="Aptos"/>
-                      <w:b w:val="0"/>
-                      <w:bCs w:val="0"/>
-                      <w:i w:val="0"/>
-                      <w:iCs w:val="0"/>
-                      <w:sz w:val="22"/>
-                      <w:szCs w:val="22"/>
-                      <w:lang w:val="nl-BE"/>
-                    </w:rPr>
-                  </w:pPr>
-                </w:p>
-              </w:tc>
-              <w:tc>
-                <w:tcPr>
-                  <w:tcW w:w="1707" w:type="dxa"/>
-                  <w:tcMar>
-                    <w:left w:w="105" w:type="dxa"/>
-                    <w:right w:w="105" w:type="dxa"/>
-                  </w:tcMar>
-                  <w:vAlign w:val="center"/>
-                </w:tcPr>
-                <w:p>
-                  <w:pPr>
-                    <w:spacing w:before="0" w:beforeAutospacing="off" w:after="0" w:afterAutospacing="off" w:line="259" w:lineRule="auto"/>
-                    <w:rPr>
-                      <w:rFonts w:ascii="Aptos" w:hAnsi="Aptos" w:eastAsia="Aptos" w:cs="Aptos"/>
-                      <w:b w:val="0"/>
-                      <w:bCs w:val="0"/>
-                      <w:i w:val="0"/>
-                      <w:iCs w:val="0"/>
-                      <w:sz w:val="22"/>
-                      <w:szCs w:val="22"/>
-                      <w:lang w:val="nl-BE"/>
-                    </w:rPr>
-                  </w:pPr>
-                </w:p>
-              </w:tc>
-              <w:tc>
-                <w:tcPr>
-                  <w:tcW w:w="1655" w:type="dxa"/>
-                  <w:tcMar>
-                    <w:left w:w="105" w:type="dxa"/>
-                    <w:right w:w="105" w:type="dxa"/>
-                  </w:tcMar>
-                  <w:vAlign w:val="center"/>
-                </w:tcPr>
-                <w:p>
-                  <w:pPr>
-                    <w:spacing w:before="0" w:beforeAutospacing="off" w:after="0" w:afterAutospacing="off" w:line="259" w:lineRule="auto"/>
-                    <w:rPr>
-                      <w:rFonts w:ascii="Aptos" w:hAnsi="Aptos" w:eastAsia="Aptos" w:cs="Aptos"/>
-                      <w:b w:val="0"/>
-                      <w:bCs w:val="0"/>
-                      <w:i w:val="0"/>
-                      <w:iCs w:val="0"/>
-                      <w:sz w:val="22"/>
-                      <w:szCs w:val="22"/>
-                      <w:lang w:val="nl-BE"/>
-                    </w:rPr>
-                  </w:pPr>
-                </w:p>
-              </w:tc>
-            </w:tr>
-          </w:tbl>
-          <w:p>
-            <w:pPr>
-              <w:pStyle w:val="Normal"/>
-              <w:suppressLineNumbers w:val="0"/>
-              <w:bidi w:val="0"/>
-              <w:spacing w:before="0" w:beforeAutospacing="off" w:after="0" w:afterAutospacing="off" w:line="240" w:lineRule="auto"/>
-              <w:ind w:left="0" w:right="0"/>
-              <w:jc w:val="both"/>
-              <w:rPr/>
+              </w:rPr>
             </w:pPr>
             <w:r>
               <w:rPr>
-                <w:rFonts w:ascii="Calibri" w:hAnsi="Calibri" w:eastAsia="Calibri" w:cs="Calibri"/>
-                <w:b w:val="0"/>
-                <w:bCs w:val="0"/>
-                <w:i w:val="0"/>
-                <w:iCs w:val="0"/>
-                <w:caps w:val="0"/>
-                <w:smallCaps w:val="0"/>
-                <w:noProof w:val="0"/>
-                <w:color w:val="000000" w:themeColor="text1" w:themeTint="FF" w:themeShade="FF"/>
+                <w:rFonts w:ascii="Calibri" w:eastAsia="Calibri" w:hAnsi="Calibri" w:cs="Calibri"/>
+                <w:color w:val="000000" w:themeColor="text1"/>
                 <w:sz w:val="24"/>
                 <w:szCs w:val="24"/>
-                <w:lang w:val="nl-BE"/>
-              </w:rPr>
-              <w:t>Voet (links/rechts</w:t>
-            </w:r>
-            <w:r>
-              <w:rPr>
-                <w:rFonts w:ascii="Calibri" w:hAnsi="Calibri" w:eastAsia="Calibri" w:cs="Calibri"/>
-                <w:b w:val="0"/>
-                <w:bCs w:val="0"/>
-                <w:i w:val="0"/>
-                <w:iCs w:val="0"/>
-                <w:caps w:val="0"/>
-                <w:smallCaps w:val="0"/>
-                <w:noProof w:val="0"/>
-                <w:color w:val="000000" w:themeColor="text1" w:themeTint="FF" w:themeShade="FF"/>
-                <w:sz w:val="24"/>
-                <w:szCs w:val="24"/>
-                <w:lang w:val="nl-BE"/>
-              </w:rPr>
-              <w:t>) ,</w:t>
-            </w:r>
-            <w:r>
-              <w:rPr>
-                <w:rFonts w:ascii="Calibri" w:hAnsi="Calibri" w:eastAsia="Calibri" w:cs="Calibri"/>
-                <w:b w:val="0"/>
-                <w:bCs w:val="0"/>
-                <w:i w:val="0"/>
-                <w:iCs w:val="0"/>
-                <w:caps w:val="0"/>
-                <w:smallCaps w:val="0"/>
-                <w:noProof w:val="0"/>
-                <w:color w:val="000000" w:themeColor="text1" w:themeTint="FF" w:themeShade="FF"/>
-                <w:sz w:val="24"/>
-                <w:szCs w:val="24"/>
-                <w:lang w:val="nl-BE"/>
-              </w:rPr>
-              <w:t xml:space="preserve"> Locatie van het </w:t>
-            </w:r>
-            <w:r>
-              <w:rPr>
-                <w:rFonts w:ascii="Calibri" w:hAnsi="Calibri" w:eastAsia="Calibri" w:cs="Calibri"/>
-                <w:b w:val="0"/>
-                <w:bCs w:val="0"/>
-                <w:i w:val="0"/>
-                <w:iCs w:val="0"/>
-                <w:caps w:val="0"/>
-                <w:smallCaps w:val="0"/>
-                <w:noProof w:val="0"/>
-                <w:color w:val="000000" w:themeColor="text1" w:themeTint="FF" w:themeShade="FF"/>
-                <w:sz w:val="24"/>
-                <w:szCs w:val="24"/>
-                <w:lang w:val="nl-BE"/>
-              </w:rPr>
-              <w:t>ulcus ,</w:t>
-            </w:r>
-            <w:r>
-              <w:rPr>
-                <w:rFonts w:ascii="Calibri" w:hAnsi="Calibri" w:eastAsia="Calibri" w:cs="Calibri"/>
-                <w:b w:val="0"/>
-                <w:bCs w:val="0"/>
-                <w:i w:val="0"/>
-                <w:iCs w:val="0"/>
-                <w:caps w:val="0"/>
-                <w:smallCaps w:val="0"/>
-                <w:noProof w:val="0"/>
-                <w:color w:val="000000" w:themeColor="text1" w:themeTint="FF" w:themeShade="FF"/>
-                <w:sz w:val="24"/>
-                <w:szCs w:val="24"/>
-                <w:lang w:val="nl-BE"/>
-              </w:rPr>
-              <w:t xml:space="preserve"> </w:t>
-            </w:r>
-            <w:r>
-              <w:rPr>
-                <w:rFonts w:ascii="Calibri" w:hAnsi="Calibri" w:eastAsia="Calibri" w:cs="Calibri"/>
-                <w:b w:val="0"/>
-                <w:bCs w:val="0"/>
-                <w:i w:val="0"/>
-                <w:iCs w:val="0"/>
-                <w:caps w:val="0"/>
-                <w:smallCaps w:val="0"/>
-                <w:noProof w:val="0"/>
-                <w:color w:val="000000" w:themeColor="text1" w:themeTint="FF" w:themeShade="FF"/>
-                <w:sz w:val="24"/>
-                <w:szCs w:val="24"/>
-                <w:lang w:val="nl-BE"/>
-              </w:rPr>
-              <w:t xml:space="preserve"> </w:t>
-            </w:r>
-            <w:r>
-              <w:rPr>
-                <w:rFonts w:ascii="Calibri" w:hAnsi="Calibri" w:eastAsia="Calibri" w:cs="Calibri"/>
-                <w:b w:val="0"/>
-                <w:bCs w:val="0"/>
-                <w:i w:val="0"/>
-                <w:iCs w:val="0"/>
-                <w:caps w:val="0"/>
-                <w:smallCaps w:val="0"/>
-                <w:noProof w:val="0"/>
-                <w:color w:val="000000" w:themeColor="text1" w:themeTint="FF" w:themeShade="FF"/>
-                <w:sz w:val="24"/>
-                <w:szCs w:val="24"/>
-                <w:lang w:val="nl-BE"/>
-              </w:rPr>
-              <w:t xml:space="preserve">                                      </w:t>
-            </w:r>
-            <w:r>
-              <w:rPr>
-                <w:rFonts w:ascii="Calibri" w:hAnsi="Calibri" w:eastAsia="Calibri" w:cs="Calibri"/>
-                <w:b w:val="0"/>
-                <w:bCs w:val="0"/>
-                <w:i w:val="0"/>
-                <w:iCs w:val="0"/>
-                <w:caps w:val="0"/>
-                <w:smallCaps w:val="0"/>
-                <w:noProof w:val="0"/>
-                <w:color w:val="000000" w:themeColor="text1" w:themeTint="FF" w:themeShade="FF"/>
-                <w:sz w:val="24"/>
-                <w:szCs w:val="24"/>
-                <w:lang w:val="nl-BE"/>
-              </w:rPr>
-              <w:t>D</w:t>
-            </w:r>
-            <w:r>
-              <w:rPr>
-                <w:rFonts w:ascii="Calibri" w:hAnsi="Calibri" w:eastAsia="Calibri" w:cs="Calibri"/>
-                <w:b w:val="0"/>
-                <w:bCs w:val="0"/>
-                <w:i w:val="0"/>
-                <w:iCs w:val="0"/>
-                <w:caps w:val="0"/>
-                <w:smallCaps w:val="0"/>
-                <w:noProof w:val="0"/>
-                <w:color w:val="000000" w:themeColor="text1" w:themeTint="FF" w:themeShade="FF"/>
-                <w:sz w:val="24"/>
-                <w:szCs w:val="24"/>
-                <w:lang w:val="nl-BE"/>
-              </w:rPr>
-              <w:t xml:space="preserve">atum van genezing </w:t>
+              </w:rPr>
+              <w:t>Datum eerste genezen ulcus: ____ / ____ / ______</w:t>
             </w:r>
           </w:p>
           <w:p>
             <w:pPr>
-              <w:pStyle w:val="Normal"/>
-              <w:bidi w:val="0"/>
               <w:spacing w:line="240" w:lineRule="auto"/>
               <w:jc w:val="both"/>
-              <w:rPr/>
+              <w:rPr>
+                <w:rFonts w:ascii="Calibri" w:eastAsia="Calibri" w:hAnsi="Calibri" w:cs="Calibri"/>
+                <w:color w:val="000000" w:themeColor="text1"/>
+                <w:sz w:val="24"/>
+                <w:szCs w:val="24"/>
+              </w:rPr>
             </w:pPr>
             <w:r>
               <w:rPr>
-                <w:rFonts w:ascii="Calibri" w:hAnsi="Calibri" w:eastAsia="Calibri" w:cs="Calibri"/>
-                <w:b w:val="0"/>
-                <w:bCs w:val="0"/>
-                <w:i w:val="0"/>
-                <w:iCs w:val="0"/>
-                <w:caps w:val="0"/>
-                <w:smallCaps w:val="0"/>
-                <w:noProof w:val="0"/>
-                <w:color w:val="000000" w:themeColor="text1" w:themeTint="FF" w:themeShade="FF"/>
+                <w:rFonts w:ascii="Calibri" w:eastAsia="Calibri" w:hAnsi="Calibri" w:cs="Calibri"/>
+                <w:color w:val="000000" w:themeColor="text1"/>
                 <w:sz w:val="24"/>
                 <w:szCs w:val="24"/>
-                <w:lang w:val="de-DE"/>
-              </w:rPr>
-              <w:t>1 ,</w:t>
-            </w:r>
-            <w:r>
-              <w:rPr>
-                <w:rFonts w:ascii="Calibri" w:hAnsi="Calibri" w:eastAsia="Calibri" w:cs="Calibri"/>
-                <w:b w:val="0"/>
-                <w:bCs w:val="0"/>
-                <w:i w:val="0"/>
-                <w:iCs w:val="0"/>
-                <w:caps w:val="0"/>
-                <w:smallCaps w:val="0"/>
-                <w:noProof w:val="0"/>
-                <w:color w:val="000000" w:themeColor="text1" w:themeTint="FF" w:themeShade="FF"/>
-                <w:sz w:val="24"/>
-                <w:szCs w:val="24"/>
-                <w:lang w:val="de-DE"/>
-              </w:rPr>
-              <w:t xml:space="preserve"> ☐ Links ☐ </w:t>
-            </w:r>
-            <w:r>
-              <w:rPr>
-                <w:rFonts w:ascii="Calibri" w:hAnsi="Calibri" w:eastAsia="Calibri" w:cs="Calibri"/>
-                <w:b w:val="0"/>
-                <w:bCs w:val="0"/>
-                <w:i w:val="0"/>
-                <w:iCs w:val="0"/>
-                <w:caps w:val="0"/>
-                <w:smallCaps w:val="0"/>
-                <w:noProof w:val="0"/>
-                <w:color w:val="000000" w:themeColor="text1" w:themeTint="FF" w:themeShade="FF"/>
-                <w:sz w:val="24"/>
-                <w:szCs w:val="24"/>
-                <w:lang w:val="de-DE"/>
-              </w:rPr>
-              <w:t>Rechts ,</w:t>
-            </w:r>
-            <w:r>
-              <w:rPr>
-                <w:rFonts w:ascii="Calibri" w:hAnsi="Calibri" w:eastAsia="Calibri" w:cs="Calibri"/>
-                <w:b w:val="0"/>
-                <w:bCs w:val="0"/>
-                <w:i w:val="0"/>
-                <w:iCs w:val="0"/>
-                <w:caps w:val="0"/>
-                <w:smallCaps w:val="0"/>
-                <w:noProof w:val="0"/>
-                <w:color w:val="000000" w:themeColor="text1" w:themeTint="FF" w:themeShade="FF"/>
-                <w:sz w:val="24"/>
-                <w:szCs w:val="24"/>
-                <w:lang w:val="de-DE"/>
-              </w:rPr>
-              <w:t xml:space="preserve"> _________________</w:t>
-            </w:r>
-            <w:r>
-              <w:rPr>
-                <w:rFonts w:ascii="Calibri" w:hAnsi="Calibri" w:eastAsia="Calibri" w:cs="Calibri"/>
-                <w:b w:val="0"/>
-                <w:bCs w:val="0"/>
-                <w:i w:val="0"/>
-                <w:iCs w:val="0"/>
-                <w:caps w:val="0"/>
-                <w:smallCaps w:val="0"/>
-                <w:noProof w:val="0"/>
-                <w:color w:val="000000" w:themeColor="text1" w:themeTint="FF" w:themeShade="FF"/>
-                <w:sz w:val="24"/>
-                <w:szCs w:val="24"/>
-                <w:lang w:val="de-DE"/>
-              </w:rPr>
-              <w:t>_ ,</w:t>
-            </w:r>
-            <w:r>
-              <w:rPr>
-                <w:rFonts w:ascii="Calibri" w:hAnsi="Calibri" w:eastAsia="Calibri" w:cs="Calibri"/>
-                <w:b w:val="0"/>
-                <w:bCs w:val="0"/>
-                <w:i w:val="0"/>
-                <w:iCs w:val="0"/>
-                <w:caps w:val="0"/>
-                <w:smallCaps w:val="0"/>
-                <w:noProof w:val="0"/>
-                <w:color w:val="000000" w:themeColor="text1" w:themeTint="FF" w:themeShade="FF"/>
-                <w:sz w:val="24"/>
-                <w:szCs w:val="24"/>
-                <w:lang w:val="de-DE"/>
               </w:rPr>
               <w:t xml:space="preserve"> </w:t>
-            </w:r>
-            <w:r>
-              <w:rPr>
-                <w:rFonts w:ascii="Calibri" w:hAnsi="Calibri" w:eastAsia="Calibri" w:cs="Calibri"/>
-                <w:b w:val="0"/>
-                <w:bCs w:val="0"/>
-                <w:i w:val="0"/>
-                <w:iCs w:val="0"/>
-                <w:caps w:val="0"/>
-                <w:smallCaps w:val="0"/>
-                <w:noProof w:val="0"/>
-                <w:color w:val="000000" w:themeColor="text1" w:themeTint="FF" w:themeShade="FF"/>
-                <w:sz w:val="24"/>
-                <w:szCs w:val="24"/>
-                <w:lang w:val="de-DE"/>
-              </w:rPr>
-              <w:t xml:space="preserve">                                   </w:t>
-            </w:r>
-            <w:r>
-              <w:rPr>
-                <w:rFonts w:ascii="Calibri" w:hAnsi="Calibri" w:eastAsia="Calibri" w:cs="Calibri"/>
-                <w:b w:val="0"/>
-                <w:bCs w:val="0"/>
-                <w:i w:val="0"/>
-                <w:iCs w:val="0"/>
-                <w:caps w:val="0"/>
-                <w:smallCaps w:val="0"/>
-                <w:noProof w:val="0"/>
-                <w:color w:val="000000" w:themeColor="text1" w:themeTint="FF" w:themeShade="FF"/>
-                <w:sz w:val="24"/>
-                <w:szCs w:val="24"/>
-                <w:lang w:val="de-DE"/>
-              </w:rPr>
-              <w:t>___</w:t>
-            </w:r>
-            <w:r>
-              <w:rPr>
-                <w:rFonts w:ascii="Calibri" w:hAnsi="Calibri" w:eastAsia="Calibri" w:cs="Calibri"/>
-                <w:b w:val="0"/>
-                <w:bCs w:val="0"/>
-                <w:i w:val="0"/>
-                <w:iCs w:val="0"/>
-                <w:caps w:val="0"/>
-                <w:smallCaps w:val="0"/>
-                <w:noProof w:val="0"/>
-                <w:color w:val="000000" w:themeColor="text1" w:themeTint="FF" w:themeShade="FF"/>
-                <w:sz w:val="24"/>
-                <w:szCs w:val="24"/>
-                <w:lang w:val="de-DE"/>
-              </w:rPr>
-              <w:t>_ /</w:t>
-            </w:r>
-            <w:r>
-              <w:rPr>
-                <w:rFonts w:ascii="Calibri" w:hAnsi="Calibri" w:eastAsia="Calibri" w:cs="Calibri"/>
-                <w:b w:val="0"/>
-                <w:bCs w:val="0"/>
-                <w:i w:val="0"/>
-                <w:iCs w:val="0"/>
-                <w:caps w:val="0"/>
-                <w:smallCaps w:val="0"/>
-                <w:noProof w:val="0"/>
-                <w:color w:val="000000" w:themeColor="text1" w:themeTint="FF" w:themeShade="FF"/>
-                <w:sz w:val="24"/>
-                <w:szCs w:val="24"/>
-                <w:lang w:val="de-DE"/>
-              </w:rPr>
-              <w:t xml:space="preserve"> ___</w:t>
-            </w:r>
-            <w:r>
-              <w:rPr>
-                <w:rFonts w:ascii="Calibri" w:hAnsi="Calibri" w:eastAsia="Calibri" w:cs="Calibri"/>
-                <w:b w:val="0"/>
-                <w:bCs w:val="0"/>
-                <w:i w:val="0"/>
-                <w:iCs w:val="0"/>
-                <w:caps w:val="0"/>
-                <w:smallCaps w:val="0"/>
-                <w:noProof w:val="0"/>
-                <w:color w:val="000000" w:themeColor="text1" w:themeTint="FF" w:themeShade="FF"/>
-                <w:sz w:val="24"/>
-                <w:szCs w:val="24"/>
-                <w:lang w:val="de-DE"/>
-              </w:rPr>
-              <w:t>_ /</w:t>
-            </w:r>
-            <w:r>
-              <w:rPr>
-                <w:rFonts w:ascii="Calibri" w:hAnsi="Calibri" w:eastAsia="Calibri" w:cs="Calibri"/>
-                <w:b w:val="0"/>
-                <w:bCs w:val="0"/>
-                <w:i w:val="0"/>
-                <w:iCs w:val="0"/>
-                <w:caps w:val="0"/>
-                <w:smallCaps w:val="0"/>
-                <w:noProof w:val="0"/>
-                <w:color w:val="000000" w:themeColor="text1" w:themeTint="FF" w:themeShade="FF"/>
-                <w:sz w:val="24"/>
-                <w:szCs w:val="24"/>
-                <w:lang w:val="de-DE"/>
-              </w:rPr>
-              <w:t xml:space="preserve"> ______ </w:t>
-            </w:r>
-          </w:p>
-          <w:p>
-            <w:pPr>
-              <w:pStyle w:val="Normal"/>
-              <w:bidi w:val="0"/>
-              <w:spacing w:line="240" w:lineRule="auto"/>
-              <w:jc w:val="both"/>
-              <w:rPr/>
-            </w:pPr>
-            <w:r>
-              <w:rPr>
-                <w:rFonts w:ascii="Calibri" w:hAnsi="Calibri" w:eastAsia="Calibri" w:cs="Calibri"/>
-                <w:b w:val="0"/>
-                <w:bCs w:val="0"/>
-                <w:i w:val="0"/>
-                <w:iCs w:val="0"/>
-                <w:caps w:val="0"/>
-                <w:smallCaps w:val="0"/>
-                <w:noProof w:val="0"/>
-                <w:color w:val="000000" w:themeColor="text1" w:themeTint="FF" w:themeShade="FF"/>
-                <w:sz w:val="24"/>
-                <w:szCs w:val="24"/>
-                <w:lang w:val="de-DE"/>
-              </w:rPr>
-              <w:t>2 ,</w:t>
-            </w:r>
-            <w:r>
-              <w:rPr>
-                <w:rFonts w:ascii="Calibri" w:hAnsi="Calibri" w:eastAsia="Calibri" w:cs="Calibri"/>
-                <w:b w:val="0"/>
-                <w:bCs w:val="0"/>
-                <w:i w:val="0"/>
-                <w:iCs w:val="0"/>
-                <w:caps w:val="0"/>
-                <w:smallCaps w:val="0"/>
-                <w:noProof w:val="0"/>
-                <w:color w:val="000000" w:themeColor="text1" w:themeTint="FF" w:themeShade="FF"/>
-                <w:sz w:val="24"/>
-                <w:szCs w:val="24"/>
-                <w:lang w:val="de-DE"/>
-              </w:rPr>
-              <w:t xml:space="preserve"> ☐ Links ☐ </w:t>
-            </w:r>
-            <w:r>
-              <w:rPr>
-                <w:rFonts w:ascii="Calibri" w:hAnsi="Calibri" w:eastAsia="Calibri" w:cs="Calibri"/>
-                <w:b w:val="0"/>
-                <w:bCs w:val="0"/>
-                <w:i w:val="0"/>
-                <w:iCs w:val="0"/>
-                <w:caps w:val="0"/>
-                <w:smallCaps w:val="0"/>
-                <w:noProof w:val="0"/>
-                <w:color w:val="000000" w:themeColor="text1" w:themeTint="FF" w:themeShade="FF"/>
-                <w:sz w:val="24"/>
-                <w:szCs w:val="24"/>
-                <w:lang w:val="de-DE"/>
-              </w:rPr>
-              <w:t>Rechts ,</w:t>
-            </w:r>
-            <w:r>
-              <w:rPr>
-                <w:rFonts w:ascii="Calibri" w:hAnsi="Calibri" w:eastAsia="Calibri" w:cs="Calibri"/>
-                <w:b w:val="0"/>
-                <w:bCs w:val="0"/>
-                <w:i w:val="0"/>
-                <w:iCs w:val="0"/>
-                <w:caps w:val="0"/>
-                <w:smallCaps w:val="0"/>
-                <w:noProof w:val="0"/>
-                <w:color w:val="000000" w:themeColor="text1" w:themeTint="FF" w:themeShade="FF"/>
-                <w:sz w:val="24"/>
-                <w:szCs w:val="24"/>
-                <w:lang w:val="de-DE"/>
-              </w:rPr>
-              <w:t xml:space="preserve"> _________________</w:t>
-            </w:r>
-            <w:r>
-              <w:rPr>
-                <w:rFonts w:ascii="Calibri" w:hAnsi="Calibri" w:eastAsia="Calibri" w:cs="Calibri"/>
-                <w:b w:val="0"/>
-                <w:bCs w:val="0"/>
-                <w:i w:val="0"/>
-                <w:iCs w:val="0"/>
-                <w:caps w:val="0"/>
-                <w:smallCaps w:val="0"/>
-                <w:noProof w:val="0"/>
-                <w:color w:val="000000" w:themeColor="text1" w:themeTint="FF" w:themeShade="FF"/>
-                <w:sz w:val="24"/>
-                <w:szCs w:val="24"/>
-                <w:lang w:val="de-DE"/>
-              </w:rPr>
-              <w:t>_ ,</w:t>
-            </w:r>
-            <w:r>
-              <w:rPr>
-                <w:rFonts w:ascii="Calibri" w:hAnsi="Calibri" w:eastAsia="Calibri" w:cs="Calibri"/>
-                <w:b w:val="0"/>
-                <w:bCs w:val="0"/>
-                <w:i w:val="0"/>
-                <w:iCs w:val="0"/>
-                <w:caps w:val="0"/>
-                <w:smallCaps w:val="0"/>
-                <w:noProof w:val="0"/>
-                <w:color w:val="000000" w:themeColor="text1" w:themeTint="FF" w:themeShade="FF"/>
-                <w:sz w:val="24"/>
-                <w:szCs w:val="24"/>
-                <w:lang w:val="de-DE"/>
-              </w:rPr>
-              <w:t xml:space="preserve"> </w:t>
-            </w:r>
-            <w:r>
-              <w:rPr>
-                <w:rFonts w:ascii="Calibri" w:hAnsi="Calibri" w:eastAsia="Calibri" w:cs="Calibri"/>
-                <w:b w:val="0"/>
-                <w:bCs w:val="0"/>
-                <w:i w:val="0"/>
-                <w:iCs w:val="0"/>
-                <w:caps w:val="0"/>
-                <w:smallCaps w:val="0"/>
-                <w:noProof w:val="0"/>
-                <w:color w:val="000000" w:themeColor="text1" w:themeTint="FF" w:themeShade="FF"/>
-                <w:sz w:val="24"/>
-                <w:szCs w:val="24"/>
-                <w:lang w:val="de-DE"/>
-              </w:rPr>
-              <w:t xml:space="preserve">                                   </w:t>
-            </w:r>
-            <w:r>
-              <w:rPr>
-                <w:rFonts w:ascii="Calibri" w:hAnsi="Calibri" w:eastAsia="Calibri" w:cs="Calibri"/>
-                <w:b w:val="0"/>
-                <w:bCs w:val="0"/>
-                <w:i w:val="0"/>
-                <w:iCs w:val="0"/>
-                <w:caps w:val="0"/>
-                <w:smallCaps w:val="0"/>
-                <w:noProof w:val="0"/>
-                <w:color w:val="000000" w:themeColor="text1" w:themeTint="FF" w:themeShade="FF"/>
-                <w:sz w:val="24"/>
-                <w:szCs w:val="24"/>
-                <w:lang w:val="de-DE"/>
-              </w:rPr>
-              <w:t xml:space="preserve">____ / ____ / ______ </w:t>
-            </w:r>
-          </w:p>
-          <w:p>
-            <w:pPr>
-              <w:pStyle w:val="Normal"/>
-              <w:bidi w:val="0"/>
-              <w:spacing w:line="240" w:lineRule="auto"/>
-              <w:jc w:val="both"/>
-              <w:rPr/>
-            </w:pPr>
-            <w:r>
-              <w:rPr>
-                <w:rFonts w:ascii="Calibri" w:hAnsi="Calibri" w:eastAsia="Calibri" w:cs="Calibri"/>
-                <w:b w:val="0"/>
-                <w:bCs w:val="0"/>
-                <w:i w:val="0"/>
-                <w:iCs w:val="0"/>
-                <w:caps w:val="0"/>
-                <w:smallCaps w:val="0"/>
-                <w:noProof w:val="0"/>
-                <w:color w:val="000000" w:themeColor="text1" w:themeTint="FF" w:themeShade="FF"/>
-                <w:sz w:val="24"/>
-                <w:szCs w:val="24"/>
-                <w:lang w:val="de-DE"/>
-              </w:rPr>
-              <w:t>3 ,</w:t>
-            </w:r>
-            <w:r>
-              <w:rPr>
-                <w:rFonts w:ascii="Calibri" w:hAnsi="Calibri" w:eastAsia="Calibri" w:cs="Calibri"/>
-                <w:b w:val="0"/>
-                <w:bCs w:val="0"/>
-                <w:i w:val="0"/>
-                <w:iCs w:val="0"/>
-                <w:caps w:val="0"/>
-                <w:smallCaps w:val="0"/>
-                <w:noProof w:val="0"/>
-                <w:color w:val="000000" w:themeColor="text1" w:themeTint="FF" w:themeShade="FF"/>
-                <w:sz w:val="24"/>
-                <w:szCs w:val="24"/>
-                <w:lang w:val="de-DE"/>
-              </w:rPr>
-              <w:t xml:space="preserve"> ☐ Links ☐ </w:t>
-            </w:r>
-            <w:r>
-              <w:rPr>
-                <w:rFonts w:ascii="Calibri" w:hAnsi="Calibri" w:eastAsia="Calibri" w:cs="Calibri"/>
-                <w:b w:val="0"/>
-                <w:bCs w:val="0"/>
-                <w:i w:val="0"/>
-                <w:iCs w:val="0"/>
-                <w:caps w:val="0"/>
-                <w:smallCaps w:val="0"/>
-                <w:noProof w:val="0"/>
-                <w:color w:val="000000" w:themeColor="text1" w:themeTint="FF" w:themeShade="FF"/>
-                <w:sz w:val="24"/>
-                <w:szCs w:val="24"/>
-                <w:lang w:val="de-DE"/>
-              </w:rPr>
-              <w:t>Rechts ,</w:t>
-            </w:r>
-            <w:r>
-              <w:rPr>
-                <w:rFonts w:ascii="Calibri" w:hAnsi="Calibri" w:eastAsia="Calibri" w:cs="Calibri"/>
-                <w:b w:val="0"/>
-                <w:bCs w:val="0"/>
-                <w:i w:val="0"/>
-                <w:iCs w:val="0"/>
-                <w:caps w:val="0"/>
-                <w:smallCaps w:val="0"/>
-                <w:noProof w:val="0"/>
-                <w:color w:val="000000" w:themeColor="text1" w:themeTint="FF" w:themeShade="FF"/>
-                <w:sz w:val="24"/>
-                <w:szCs w:val="24"/>
-                <w:lang w:val="de-DE"/>
-              </w:rPr>
-              <w:t xml:space="preserve"> _________________</w:t>
-            </w:r>
-            <w:r>
-              <w:rPr>
-                <w:rFonts w:ascii="Calibri" w:hAnsi="Calibri" w:eastAsia="Calibri" w:cs="Calibri"/>
-                <w:b w:val="0"/>
-                <w:bCs w:val="0"/>
-                <w:i w:val="0"/>
-                <w:iCs w:val="0"/>
-                <w:caps w:val="0"/>
-                <w:smallCaps w:val="0"/>
-                <w:noProof w:val="0"/>
-                <w:color w:val="000000" w:themeColor="text1" w:themeTint="FF" w:themeShade="FF"/>
-                <w:sz w:val="24"/>
-                <w:szCs w:val="24"/>
-                <w:lang w:val="de-DE"/>
-              </w:rPr>
-              <w:t>_ ,</w:t>
-            </w:r>
-            <w:r>
-              <w:rPr>
-                <w:rFonts w:ascii="Calibri" w:hAnsi="Calibri" w:eastAsia="Calibri" w:cs="Calibri"/>
-                <w:b w:val="0"/>
-                <w:bCs w:val="0"/>
-                <w:i w:val="0"/>
-                <w:iCs w:val="0"/>
-                <w:caps w:val="0"/>
-                <w:smallCaps w:val="0"/>
-                <w:noProof w:val="0"/>
-                <w:color w:val="000000" w:themeColor="text1" w:themeTint="FF" w:themeShade="FF"/>
-                <w:sz w:val="24"/>
-                <w:szCs w:val="24"/>
-                <w:lang w:val="de-DE"/>
-              </w:rPr>
-              <w:t xml:space="preserve"> </w:t>
-            </w:r>
-            <w:r>
-              <w:rPr>
-                <w:rFonts w:ascii="Calibri" w:hAnsi="Calibri" w:eastAsia="Calibri" w:cs="Calibri"/>
-                <w:b w:val="0"/>
-                <w:bCs w:val="0"/>
-                <w:i w:val="0"/>
-                <w:iCs w:val="0"/>
-                <w:caps w:val="0"/>
-                <w:smallCaps w:val="0"/>
-                <w:noProof w:val="0"/>
-                <w:color w:val="000000" w:themeColor="text1" w:themeTint="FF" w:themeShade="FF"/>
-                <w:sz w:val="24"/>
-                <w:szCs w:val="24"/>
-                <w:lang w:val="de-DE"/>
-              </w:rPr>
-              <w:t xml:space="preserve">                                   </w:t>
-            </w:r>
-            <w:r>
-              <w:rPr>
-                <w:rFonts w:ascii="Calibri" w:hAnsi="Calibri" w:eastAsia="Calibri" w:cs="Calibri"/>
-                <w:b w:val="0"/>
-                <w:bCs w:val="0"/>
-                <w:i w:val="0"/>
-                <w:iCs w:val="0"/>
-                <w:caps w:val="0"/>
-                <w:smallCaps w:val="0"/>
-                <w:noProof w:val="0"/>
-                <w:color w:val="000000" w:themeColor="text1" w:themeTint="FF" w:themeShade="FF"/>
-                <w:sz w:val="24"/>
-                <w:szCs w:val="24"/>
-                <w:lang w:val="de-DE"/>
-              </w:rPr>
-              <w:t xml:space="preserve">____ / ____ / ______ </w:t>
-            </w:r>
-          </w:p>
-          <w:p>
-            <w:pPr>
-              <w:pStyle w:val="Normal"/>
-              <w:bidi w:val="0"/>
-              <w:spacing w:line="240" w:lineRule="auto"/>
-              <w:jc w:val="both"/>
-              <w:rPr/>
-            </w:pPr>
-            <w:r>
-              <w:rPr>
-                <w:rFonts w:ascii="Calibri" w:hAnsi="Calibri" w:eastAsia="Calibri" w:cs="Calibri"/>
-                <w:b w:val="0"/>
-                <w:bCs w:val="0"/>
-                <w:i w:val="0"/>
-                <w:iCs w:val="0"/>
-                <w:caps w:val="0"/>
-                <w:smallCaps w:val="0"/>
-                <w:noProof w:val="0"/>
-                <w:color w:val="000000" w:themeColor="text1" w:themeTint="FF" w:themeShade="FF"/>
-                <w:sz w:val="24"/>
-                <w:szCs w:val="24"/>
-                <w:lang w:val="de-DE"/>
-              </w:rPr>
-              <w:t>4 ,</w:t>
-            </w:r>
-            <w:r>
-              <w:rPr>
-                <w:rFonts w:ascii="Calibri" w:hAnsi="Calibri" w:eastAsia="Calibri" w:cs="Calibri"/>
-                <w:b w:val="0"/>
-                <w:bCs w:val="0"/>
-                <w:i w:val="0"/>
-                <w:iCs w:val="0"/>
-                <w:caps w:val="0"/>
-                <w:smallCaps w:val="0"/>
-                <w:noProof w:val="0"/>
-                <w:color w:val="000000" w:themeColor="text1" w:themeTint="FF" w:themeShade="FF"/>
-                <w:sz w:val="24"/>
-                <w:szCs w:val="24"/>
-                <w:lang w:val="de-DE"/>
-              </w:rPr>
-              <w:t xml:space="preserve"> ☐ Links ☐ </w:t>
-            </w:r>
-            <w:r>
-              <w:rPr>
-                <w:rFonts w:ascii="Calibri" w:hAnsi="Calibri" w:eastAsia="Calibri" w:cs="Calibri"/>
-                <w:b w:val="0"/>
-                <w:bCs w:val="0"/>
-                <w:i w:val="0"/>
-                <w:iCs w:val="0"/>
-                <w:caps w:val="0"/>
-                <w:smallCaps w:val="0"/>
-                <w:noProof w:val="0"/>
-                <w:color w:val="000000" w:themeColor="text1" w:themeTint="FF" w:themeShade="FF"/>
-                <w:sz w:val="24"/>
-                <w:szCs w:val="24"/>
-                <w:lang w:val="de-DE"/>
-              </w:rPr>
-              <w:t>Rechts ,</w:t>
-            </w:r>
-            <w:r>
-              <w:rPr>
-                <w:rFonts w:ascii="Calibri" w:hAnsi="Calibri" w:eastAsia="Calibri" w:cs="Calibri"/>
-                <w:b w:val="0"/>
-                <w:bCs w:val="0"/>
-                <w:i w:val="0"/>
-                <w:iCs w:val="0"/>
-                <w:caps w:val="0"/>
-                <w:smallCaps w:val="0"/>
-                <w:noProof w:val="0"/>
-                <w:color w:val="000000" w:themeColor="text1" w:themeTint="FF" w:themeShade="FF"/>
-                <w:sz w:val="24"/>
-                <w:szCs w:val="24"/>
-                <w:lang w:val="de-DE"/>
-              </w:rPr>
-              <w:t xml:space="preserve"> _________________</w:t>
-            </w:r>
-            <w:r>
-              <w:rPr>
-                <w:rFonts w:ascii="Calibri" w:hAnsi="Calibri" w:eastAsia="Calibri" w:cs="Calibri"/>
-                <w:b w:val="0"/>
-                <w:bCs w:val="0"/>
-                <w:i w:val="0"/>
-                <w:iCs w:val="0"/>
-                <w:caps w:val="0"/>
-                <w:smallCaps w:val="0"/>
-                <w:noProof w:val="0"/>
-                <w:color w:val="000000" w:themeColor="text1" w:themeTint="FF" w:themeShade="FF"/>
-                <w:sz w:val="24"/>
-                <w:szCs w:val="24"/>
-                <w:lang w:val="de-DE"/>
-              </w:rPr>
-              <w:t>_ ,</w:t>
-            </w:r>
-            <w:r>
-              <w:rPr>
-                <w:rFonts w:ascii="Calibri" w:hAnsi="Calibri" w:eastAsia="Calibri" w:cs="Calibri"/>
-                <w:b w:val="0"/>
-                <w:bCs w:val="0"/>
-                <w:i w:val="0"/>
-                <w:iCs w:val="0"/>
-                <w:caps w:val="0"/>
-                <w:smallCaps w:val="0"/>
-                <w:noProof w:val="0"/>
-                <w:color w:val="000000" w:themeColor="text1" w:themeTint="FF" w:themeShade="FF"/>
-                <w:sz w:val="24"/>
-                <w:szCs w:val="24"/>
-                <w:lang w:val="de-DE"/>
-              </w:rPr>
-              <w:t xml:space="preserve"> </w:t>
-            </w:r>
-            <w:r>
-              <w:rPr>
-                <w:rFonts w:ascii="Calibri" w:hAnsi="Calibri" w:eastAsia="Calibri" w:cs="Calibri"/>
-                <w:b w:val="0"/>
-                <w:bCs w:val="0"/>
-                <w:i w:val="0"/>
-                <w:iCs w:val="0"/>
-                <w:caps w:val="0"/>
-                <w:smallCaps w:val="0"/>
-                <w:noProof w:val="0"/>
-                <w:color w:val="000000" w:themeColor="text1" w:themeTint="FF" w:themeShade="FF"/>
-                <w:sz w:val="24"/>
-                <w:szCs w:val="24"/>
-                <w:lang w:val="de-DE"/>
-              </w:rPr>
-              <w:t xml:space="preserve">                                   </w:t>
-            </w:r>
-            <w:r>
-              <w:rPr>
-                <w:rFonts w:ascii="Calibri" w:hAnsi="Calibri" w:eastAsia="Calibri" w:cs="Calibri"/>
-                <w:b w:val="0"/>
-                <w:bCs w:val="0"/>
-                <w:i w:val="0"/>
-                <w:iCs w:val="0"/>
-                <w:caps w:val="0"/>
-                <w:smallCaps w:val="0"/>
-                <w:noProof w:val="0"/>
-                <w:color w:val="000000" w:themeColor="text1" w:themeTint="FF" w:themeShade="FF"/>
-                <w:sz w:val="24"/>
-                <w:szCs w:val="24"/>
-                <w:lang w:val="de-DE"/>
-              </w:rPr>
-              <w:t xml:space="preserve">____ / ____ / ______ </w:t>
-            </w:r>
-          </w:p>
-          <w:p>
-            <w:pPr>
-              <w:pStyle w:val="Normal"/>
-              <w:bidi w:val="0"/>
-              <w:spacing w:line="240" w:lineRule="auto"/>
-              <w:jc w:val="both"/>
-              <w:rPr/>
-            </w:pPr>
-            <w:r>
-              <w:rPr>
-                <w:rFonts w:ascii="Calibri" w:hAnsi="Calibri" w:eastAsia="Calibri" w:cs="Calibri"/>
-                <w:b w:val="0"/>
-                <w:bCs w:val="0"/>
-                <w:i w:val="0"/>
-                <w:iCs w:val="0"/>
-                <w:caps w:val="0"/>
-                <w:smallCaps w:val="0"/>
-                <w:noProof w:val="0"/>
-                <w:color w:val="000000" w:themeColor="text1" w:themeTint="FF" w:themeShade="FF"/>
-                <w:sz w:val="24"/>
-                <w:szCs w:val="24"/>
-                <w:lang w:val="de-DE"/>
-              </w:rPr>
-              <w:t>5 ,</w:t>
-            </w:r>
-            <w:r>
-              <w:rPr>
-                <w:rFonts w:ascii="Calibri" w:hAnsi="Calibri" w:eastAsia="Calibri" w:cs="Calibri"/>
-                <w:b w:val="0"/>
-                <w:bCs w:val="0"/>
-                <w:i w:val="0"/>
-                <w:iCs w:val="0"/>
-                <w:caps w:val="0"/>
-                <w:smallCaps w:val="0"/>
-                <w:noProof w:val="0"/>
-                <w:color w:val="000000" w:themeColor="text1" w:themeTint="FF" w:themeShade="FF"/>
-                <w:sz w:val="24"/>
-                <w:szCs w:val="24"/>
-                <w:lang w:val="de-DE"/>
-              </w:rPr>
-              <w:t xml:space="preserve"> ☐ Links ☐ </w:t>
-            </w:r>
-            <w:r>
-              <w:rPr>
-                <w:rFonts w:ascii="Calibri" w:hAnsi="Calibri" w:eastAsia="Calibri" w:cs="Calibri"/>
-                <w:b w:val="0"/>
-                <w:bCs w:val="0"/>
-                <w:i w:val="0"/>
-                <w:iCs w:val="0"/>
-                <w:caps w:val="0"/>
-                <w:smallCaps w:val="0"/>
-                <w:noProof w:val="0"/>
-                <w:color w:val="000000" w:themeColor="text1" w:themeTint="FF" w:themeShade="FF"/>
-                <w:sz w:val="24"/>
-                <w:szCs w:val="24"/>
-                <w:lang w:val="de-DE"/>
-              </w:rPr>
-              <w:t>Rechts ,</w:t>
-            </w:r>
-            <w:r>
-              <w:rPr>
-                <w:rFonts w:ascii="Calibri" w:hAnsi="Calibri" w:eastAsia="Calibri" w:cs="Calibri"/>
-                <w:b w:val="0"/>
-                <w:bCs w:val="0"/>
-                <w:i w:val="0"/>
-                <w:iCs w:val="0"/>
-                <w:caps w:val="0"/>
-                <w:smallCaps w:val="0"/>
-                <w:noProof w:val="0"/>
-                <w:color w:val="000000" w:themeColor="text1" w:themeTint="FF" w:themeShade="FF"/>
-                <w:sz w:val="24"/>
-                <w:szCs w:val="24"/>
-                <w:lang w:val="de-DE"/>
-              </w:rPr>
-              <w:t xml:space="preserve"> _________________</w:t>
-            </w:r>
-            <w:r>
-              <w:rPr>
-                <w:rFonts w:ascii="Calibri" w:hAnsi="Calibri" w:eastAsia="Calibri" w:cs="Calibri"/>
-                <w:b w:val="0"/>
-                <w:bCs w:val="0"/>
-                <w:i w:val="0"/>
-                <w:iCs w:val="0"/>
-                <w:caps w:val="0"/>
-                <w:smallCaps w:val="0"/>
-                <w:noProof w:val="0"/>
-                <w:color w:val="000000" w:themeColor="text1" w:themeTint="FF" w:themeShade="FF"/>
-                <w:sz w:val="24"/>
-                <w:szCs w:val="24"/>
-                <w:lang w:val="de-DE"/>
-              </w:rPr>
-              <w:t>_ ,</w:t>
-            </w:r>
-            <w:r>
-              <w:rPr>
-                <w:rFonts w:ascii="Calibri" w:hAnsi="Calibri" w:eastAsia="Calibri" w:cs="Calibri"/>
-                <w:b w:val="0"/>
-                <w:bCs w:val="0"/>
-                <w:i w:val="0"/>
-                <w:iCs w:val="0"/>
-                <w:caps w:val="0"/>
-                <w:smallCaps w:val="0"/>
-                <w:noProof w:val="0"/>
-                <w:color w:val="000000" w:themeColor="text1" w:themeTint="FF" w:themeShade="FF"/>
-                <w:sz w:val="24"/>
-                <w:szCs w:val="24"/>
-                <w:lang w:val="de-DE"/>
-              </w:rPr>
-              <w:t xml:space="preserve"> </w:t>
-            </w:r>
-            <w:r>
-              <w:rPr>
-                <w:rFonts w:ascii="Calibri" w:hAnsi="Calibri" w:eastAsia="Calibri" w:cs="Calibri"/>
-                <w:b w:val="0"/>
-                <w:bCs w:val="0"/>
-                <w:i w:val="0"/>
-                <w:iCs w:val="0"/>
-                <w:caps w:val="0"/>
-                <w:smallCaps w:val="0"/>
-                <w:noProof w:val="0"/>
-                <w:color w:val="000000" w:themeColor="text1" w:themeTint="FF" w:themeShade="FF"/>
-                <w:sz w:val="24"/>
-                <w:szCs w:val="24"/>
-                <w:lang w:val="de-DE"/>
-              </w:rPr>
-              <w:t xml:space="preserve">                                   </w:t>
-            </w:r>
-            <w:r>
-              <w:rPr>
-                <w:rFonts w:ascii="Calibri" w:hAnsi="Calibri" w:eastAsia="Calibri" w:cs="Calibri"/>
-                <w:b w:val="0"/>
-                <w:bCs w:val="0"/>
-                <w:i w:val="0"/>
-                <w:iCs w:val="0"/>
-                <w:caps w:val="0"/>
-                <w:smallCaps w:val="0"/>
-                <w:noProof w:val="0"/>
-                <w:color w:val="000000" w:themeColor="text1" w:themeTint="FF" w:themeShade="FF"/>
-                <w:sz w:val="24"/>
-                <w:szCs w:val="24"/>
-                <w:lang w:val="de-DE"/>
-              </w:rPr>
-              <w:t xml:space="preserve">____ / ____ / ______ </w:t>
-            </w:r>
-          </w:p>
-          <w:p>
-            <w:pPr>
-              <w:pStyle w:val="Normal"/>
-              <w:bidi w:val="0"/>
-              <w:spacing w:line="240" w:lineRule="auto"/>
-              <w:jc w:val="both"/>
-              <w:rPr>
-                <w:rFonts w:ascii="Calibri" w:hAnsi="Calibri" w:eastAsia="Calibri" w:cs="Calibri"/>
-                <w:b w:val="0"/>
-                <w:bCs w:val="0"/>
-                <w:i w:val="0"/>
-                <w:iCs w:val="0"/>
-                <w:caps w:val="0"/>
-                <w:smallCaps w:val="0"/>
-                <w:noProof w:val="0"/>
-                <w:color w:val="000000" w:themeColor="text1" w:themeTint="FF" w:themeShade="FF"/>
-                <w:sz w:val="24"/>
-                <w:szCs w:val="24"/>
-                <w:lang w:val="nl-BE"/>
-              </w:rPr>
-            </w:pPr>
-            <w:r>
-              <w:rPr>
-                <w:rFonts w:ascii="Calibri" w:hAnsi="Calibri" w:eastAsia="Calibri" w:cs="Calibri"/>
-                <w:b w:val="0"/>
-                <w:bCs w:val="0"/>
-                <w:i w:val="0"/>
-                <w:iCs w:val="0"/>
-                <w:caps w:val="0"/>
-                <w:smallCaps w:val="0"/>
-                <w:noProof w:val="0"/>
-                <w:color w:val="000000" w:themeColor="text1" w:themeTint="FF" w:themeShade="FF"/>
-                <w:sz w:val="24"/>
-                <w:szCs w:val="24"/>
-                <w:lang w:val="nl-BE"/>
-              </w:rPr>
-              <w:t>Datum eerste genezen ulcus: ___</w:t>
-            </w:r>
-            <w:r>
-              <w:rPr>
-                <w:rFonts w:ascii="Calibri" w:hAnsi="Calibri" w:eastAsia="Calibri" w:cs="Calibri"/>
-                <w:b w:val="0"/>
-                <w:bCs w:val="0"/>
-                <w:i w:val="0"/>
-                <w:iCs w:val="0"/>
-                <w:caps w:val="0"/>
-                <w:smallCaps w:val="0"/>
-                <w:noProof w:val="0"/>
-                <w:color w:val="000000" w:themeColor="text1" w:themeTint="FF" w:themeShade="FF"/>
-                <w:sz w:val="24"/>
-                <w:szCs w:val="24"/>
-                <w:lang w:val="nl-BE"/>
-              </w:rPr>
-              <w:t>_ /</w:t>
-            </w:r>
-            <w:r>
-              <w:rPr>
-                <w:rFonts w:ascii="Calibri" w:hAnsi="Calibri" w:eastAsia="Calibri" w:cs="Calibri"/>
-                <w:b w:val="0"/>
-                <w:bCs w:val="0"/>
-                <w:i w:val="0"/>
-                <w:iCs w:val="0"/>
-                <w:caps w:val="0"/>
-                <w:smallCaps w:val="0"/>
-                <w:noProof w:val="0"/>
-                <w:color w:val="000000" w:themeColor="text1" w:themeTint="FF" w:themeShade="FF"/>
-                <w:sz w:val="24"/>
-                <w:szCs w:val="24"/>
-                <w:lang w:val="nl-BE"/>
-              </w:rPr>
-              <w:t xml:space="preserve"> ___</w:t>
-            </w:r>
-            <w:r>
-              <w:rPr>
-                <w:rFonts w:ascii="Calibri" w:hAnsi="Calibri" w:eastAsia="Calibri" w:cs="Calibri"/>
-                <w:b w:val="0"/>
-                <w:bCs w:val="0"/>
-                <w:i w:val="0"/>
-                <w:iCs w:val="0"/>
-                <w:caps w:val="0"/>
-                <w:smallCaps w:val="0"/>
-                <w:noProof w:val="0"/>
-                <w:color w:val="000000" w:themeColor="text1" w:themeTint="FF" w:themeShade="FF"/>
-                <w:sz w:val="24"/>
-                <w:szCs w:val="24"/>
-                <w:lang w:val="nl-BE"/>
-              </w:rPr>
-              <w:t>_ /</w:t>
-            </w:r>
-            <w:r>
-              <w:rPr>
-                <w:rFonts w:ascii="Calibri" w:hAnsi="Calibri" w:eastAsia="Calibri" w:cs="Calibri"/>
-                <w:b w:val="0"/>
-                <w:bCs w:val="0"/>
-                <w:i w:val="0"/>
-                <w:iCs w:val="0"/>
-                <w:caps w:val="0"/>
-                <w:smallCaps w:val="0"/>
-                <w:noProof w:val="0"/>
-                <w:color w:val="000000" w:themeColor="text1" w:themeTint="FF" w:themeShade="FF"/>
-                <w:sz w:val="24"/>
-                <w:szCs w:val="24"/>
-                <w:lang w:val="nl-BE"/>
-              </w:rPr>
-              <w:t xml:space="preserve"> ______ </w:t>
             </w:r>
             <w:r>
               <w:br/>
             </w:r>
             <w:r>
               <w:rPr>
-                <w:rFonts w:ascii="Calibri" w:hAnsi="Calibri" w:eastAsia="Calibri" w:cs="Calibri"/>
-                <w:b w:val="0"/>
-                <w:bCs w:val="0"/>
-                <w:i w:val="0"/>
-                <w:iCs w:val="0"/>
-                <w:caps w:val="0"/>
-                <w:smallCaps w:val="0"/>
-                <w:noProof w:val="0"/>
-                <w:color w:val="000000" w:themeColor="text1" w:themeTint="FF" w:themeShade="FF"/>
+                <w:rFonts w:ascii="Calibri" w:eastAsia="Calibri" w:hAnsi="Calibri" w:cs="Calibri"/>
+                <w:color w:val="000000" w:themeColor="text1"/>
                 <w:sz w:val="24"/>
                 <w:szCs w:val="24"/>
-                <w:lang w:val="nl-BE"/>
               </w:rPr>
               <w:t>Aantal eerdere voetulcera: ______</w:t>
             </w:r>
+          </w:p>
+          <w:p>
+            <w:pPr>
+              <w:spacing w:line="240" w:lineRule="auto"/>
+              <w:jc w:val="both"/>
+              <w:rPr>
+                <w:rFonts w:ascii="Calibri" w:eastAsia="Calibri" w:hAnsi="Calibri" w:cs="Calibri"/>
+                <w:color w:val="000000" w:themeColor="text1"/>
+                <w:sz w:val="24"/>
+                <w:szCs w:val="24"/>
+              </w:rPr>
+            </w:pPr>
             <w:r>
               <w:br/>
             </w:r>
           </w:p>
           <w:p>
-            <w:pPr>
-              <w:pStyle w:val="Normal"/>
-            </w:pPr>
             <w:r>
+              <w:rPr>
+                <w:noProof/>
+              </w:rPr>
+              <w:lastRenderedPageBreak/>
               <w:drawing>
-                <wp:inline wp14:editId="2A815577" wp14:anchorId="44EB37DF">
-                  <wp:extent cx="2697323" cy="2136840"/>
-                  <wp:effectExtent l="0" t="0" r="0" b="0"/>
+                <wp:inline distT="0" distB="0" distL="0" distR="0" wp14:anchorId="44EB37DF" wp14:editId="53D48FD7">
+                  <wp:extent cx="3619500" cy="2867396"/>
+                  <wp:effectExtent l="0" t="0" r="0" b="9525"/>
                   <wp:docPr id="1223056962" name="drawing"/>
                   <wp:cNvGraphicFramePr>
-                    <a:graphicFrameLocks noChangeAspect="1"/>
+                    <a:graphicFrameLocks xmlns:a="http://schemas.openxmlformats.org/drawingml/2006/main" noChangeAspect="1"/>
                   </wp:cNvGraphicFramePr>
-                  <a:graphic>
+                  <a:graphic xmlns:a="http://schemas.openxmlformats.org/drawingml/2006/main">
                     <a:graphicData uri="http://schemas.openxmlformats.org/drawingml/2006/picture">
-                      <pic:pic>
+                      <pic:pic xmlns:pic="http://schemas.openxmlformats.org/drawingml/2006/picture">
                         <pic:nvPicPr>
                           <pic:cNvPr id="1223056962" name="Picture 1223056962"/>
                           <pic:cNvPicPr/>
                         </pic:nvPicPr>
                         <pic:blipFill>
-                          <a:blip r:embed="rId1111829985">
+                          <a:blip r:embed="rId10">
                             <a:extLst>
                               <a:ext uri="{28A0092B-C50C-407E-A947-70E740481C1C}">
-                                <a14:useLocalDpi/>
+                                <a14:useLocalDpi xmlns:a14="http://schemas.microsoft.com/office/drawing/2010/main"/>
                               </a:ext>
                             </a:extLst>
                           </a:blip>
@@ -1969,9 +1117,9 @@
                           </a:stretch>
                         </pic:blipFill>
                         <pic:spPr>
-                          <a:xfrm rot="0">
+                          <a:xfrm>
                             <a:off x="0" y="0"/>
-                            <a:ext cx="2697323" cy="2136840"/>
+                            <a:ext cx="3630111" cy="2875802"/>
                           </a:xfrm>
                           <a:prstGeom prst="rect">
                             <a:avLst/>
@@ -1999,18 +1147,18 @@
       </w:pPr>
       <w:r>
         <w:rPr>
-          <w:rFonts w:ascii="Arial" w:hAnsi="Arial" w:cs="Arial" w:eastAsia="Arial"/>
           <w:b/>
           <w:bCs/>
           <w:color w:val="123A5F"/>
           <w:lang w:val="nl-NL"/>
         </w:rPr>
+        <w:lastRenderedPageBreak/>
         <w:t>Voorschrift op maat gemaakte Diabetes Multidensiteit Steunzool</w:t>
       </w:r>
     </w:p>
     <w:p>
       <w:pPr>
-        <w:pStyle w:val="ListParagraph"/>
+        <w:pStyle w:val="Lijstalinea"/>
         <w:numPr>
           <w:ilvl w:val="1"/>
           <w:numId w:val="2"/>
@@ -2022,18 +1170,74 @@
           <w:lang w:val="nl-NL"/>
         </w:rPr>
       </w:pPr>
-      <w:r>
-        <w:rPr>
-          <w:rFonts w:ascii="Arial" w:hAnsi="Arial" w:cs="Arial" w:eastAsia="Arial"/>
-          <w:color w:val="24303B"/>
-          <w:lang w:val="nl-NL"/>
-        </w:rPr>
-        <w:t>Basislaag: In een volledig op maat gemaakte schoen dient deze te bestaan uit 5 mm dik microkurk (shore 55), met daarbovenop 5 mm dik Ethyleen Vinyl Acetaat (EVA) (shore 35–40). Bij confectieschoenen dient de basis te bestaan uit 6 mm dik EVA (shore 35–40). Het gebruik van materialen met aantoonbaar vergelijkbare eigenschappen, met name wat betreft samendrukbaarheid en duurzaamheid, is eveneens mogelijk.</w:t>
+      <w:proofErr w:type="spellStart"/>
+      <w:r>
+        <w:rPr>
+          <w:color w:val="24303B"/>
+          <w:lang w:val="nl-NL"/>
+        </w:rPr>
+        <w:t>Basislaag</w:t>
+      </w:r>
+      <w:proofErr w:type="spellEnd"/>
+      <w:r>
+        <w:rPr>
+          <w:color w:val="24303B"/>
+          <w:lang w:val="nl-NL"/>
+        </w:rPr>
+        <w:t>: In een volledig op maat gemaakte schoen dient deze te bestaan uit 5 mm dik microkurk (</w:t>
+      </w:r>
+      <w:proofErr w:type="spellStart"/>
+      <w:r>
+        <w:rPr>
+          <w:color w:val="24303B"/>
+          <w:lang w:val="nl-NL"/>
+        </w:rPr>
+        <w:t>shore</w:t>
+      </w:r>
+      <w:proofErr w:type="spellEnd"/>
+      <w:r>
+        <w:rPr>
+          <w:color w:val="24303B"/>
+          <w:lang w:val="nl-NL"/>
+        </w:rPr>
+        <w:t xml:space="preserve"> 55), met daarbovenop 5 mm dik Ethyleen Vinyl Acetaat (EVA) (</w:t>
+      </w:r>
+      <w:proofErr w:type="spellStart"/>
+      <w:r>
+        <w:rPr>
+          <w:color w:val="24303B"/>
+          <w:lang w:val="nl-NL"/>
+        </w:rPr>
+        <w:t>shore</w:t>
+      </w:r>
+      <w:proofErr w:type="spellEnd"/>
+      <w:r>
+        <w:rPr>
+          <w:color w:val="24303B"/>
+          <w:lang w:val="nl-NL"/>
+        </w:rPr>
+        <w:t xml:space="preserve"> 35–40). Bij confectieschoenen dient de basis te bestaan uit 6 mm dik EVA (</w:t>
+      </w:r>
+      <w:proofErr w:type="spellStart"/>
+      <w:r>
+        <w:rPr>
+          <w:color w:val="24303B"/>
+          <w:lang w:val="nl-NL"/>
+        </w:rPr>
+        <w:t>shore</w:t>
+      </w:r>
+      <w:proofErr w:type="spellEnd"/>
+      <w:r>
+        <w:rPr>
+          <w:color w:val="24303B"/>
+          <w:lang w:val="nl-NL"/>
+        </w:rPr>
+        <w:t xml:space="preserve"> 35–40). Het gebruik van materialen met aantoonbaar vergelijkbare eigenschappen, met name wat betreft samendrukbaarheid en duurzaamheid, is eveneens mogelijk.</w:t>
       </w:r>
     </w:p>
     <w:p>
       <w:pPr>
-        <w:pStyle w:val="ListParagraph"/>
+        <w:pStyle w:val="Lijstalinea"/>
         <w:numPr>
           <w:ilvl w:val="1"/>
           <w:numId w:val="2"/>
@@ -2047,7 +1251,6 @@
       </w:pPr>
       <w:r>
         <w:rPr>
-          <w:rFonts w:ascii="Arial" w:hAnsi="Arial" w:cs="Arial" w:eastAsia="Arial"/>
           <w:color w:val="24303B"/>
           <w:lang w:val="nl-NL"/>
         </w:rPr>
@@ -2055,44 +1258,128 @@
       </w:r>
       <w:r>
         <w:rPr>
-          <w:rFonts w:ascii="Arial" w:hAnsi="Arial" w:cs="Arial" w:eastAsia="Arial"/>
           <w:b/>
           <w:bCs/>
           <w:color w:val="24303B"/>
           <w:lang w:val="nl-NL"/>
         </w:rPr>
-        <w:t>3 mm dik gesloten-cellig schuim</w:t>
-      </w:r>
-      <w:r>
-        <w:rPr>
-          <w:rFonts w:ascii="Arial" w:hAnsi="Arial" w:cs="Arial" w:eastAsia="Arial"/>
-          <w:color w:val="24303B"/>
-          <w:lang w:val="nl-NL"/>
-        </w:rPr>
-        <w:t xml:space="preserve"> (bijvoorbeeld Plastazote type LD45) bovenop </w:t>
-      </w:r>
-      <w:r>
-        <w:rPr>
-          <w:rFonts w:ascii="Arial" w:hAnsi="Arial" w:cs="Arial" w:eastAsia="Arial"/>
+        <w:t>3 mm dik gesloten-</w:t>
+      </w:r>
+      <w:proofErr w:type="spellStart"/>
+      <w:r>
+        <w:rPr>
           <w:b/>
           <w:bCs/>
           <w:color w:val="24303B"/>
           <w:lang w:val="nl-NL"/>
         </w:rPr>
-        <w:t>3 mm dik open-cellig dempend schuim</w:t>
-      </w:r>
-      <w:r>
-        <w:rPr>
-          <w:rFonts w:ascii="Arial" w:hAnsi="Arial" w:cs="Arial" w:eastAsia="Arial"/>
-          <w:color w:val="24303B"/>
-          <w:lang w:val="nl-NL"/>
-        </w:rPr>
-        <w:t xml:space="preserve"> (bijvoorbeeld Professional Protective Technology (PPT)), over de volledige lengte. De combinatie van Plastazote en PPT is effectief gebleken voor drukreductie, maar het gebruik van materialen met vergelijkbare eigenschappen is eveneens mogelijk. </w:t>
+        <w:t>cellig</w:t>
+      </w:r>
+      <w:proofErr w:type="spellEnd"/>
+      <w:r>
+        <w:rPr>
+          <w:b/>
+          <w:bCs/>
+          <w:color w:val="24303B"/>
+          <w:lang w:val="nl-NL"/>
+        </w:rPr>
+        <w:t xml:space="preserve"> schuim</w:t>
+      </w:r>
+      <w:r>
+        <w:rPr>
+          <w:color w:val="24303B"/>
+          <w:lang w:val="nl-NL"/>
+        </w:rPr>
+        <w:t xml:space="preserve"> (bijvoorbeeld </w:t>
+      </w:r>
+      <w:proofErr w:type="spellStart"/>
+      <w:r>
+        <w:rPr>
+          <w:color w:val="24303B"/>
+          <w:lang w:val="nl-NL"/>
+        </w:rPr>
+        <w:t>Plastazote</w:t>
+      </w:r>
+      <w:proofErr w:type="spellEnd"/>
+      <w:r>
+        <w:rPr>
+          <w:color w:val="24303B"/>
+          <w:lang w:val="nl-NL"/>
+        </w:rPr>
+        <w:t xml:space="preserve"> type LD45) bovenop </w:t>
+      </w:r>
+      <w:r>
+        <w:rPr>
+          <w:b/>
+          <w:bCs/>
+          <w:color w:val="24303B"/>
+          <w:lang w:val="nl-NL"/>
+        </w:rPr>
+        <w:t>3 mm dik open-</w:t>
+      </w:r>
+      <w:proofErr w:type="spellStart"/>
+      <w:r>
+        <w:rPr>
+          <w:b/>
+          <w:bCs/>
+          <w:color w:val="24303B"/>
+          <w:lang w:val="nl-NL"/>
+        </w:rPr>
+        <w:t>cellig</w:t>
+      </w:r>
+      <w:proofErr w:type="spellEnd"/>
+      <w:r>
+        <w:rPr>
+          <w:b/>
+          <w:bCs/>
+          <w:color w:val="24303B"/>
+          <w:lang w:val="nl-NL"/>
+        </w:rPr>
+        <w:t xml:space="preserve"> dempend schuim</w:t>
+      </w:r>
+      <w:r>
+        <w:rPr>
+          <w:color w:val="24303B"/>
+          <w:lang w:val="nl-NL"/>
+        </w:rPr>
+        <w:t xml:space="preserve"> (bijvoorbeeld Professional </w:t>
+      </w:r>
+      <w:proofErr w:type="spellStart"/>
+      <w:r>
+        <w:rPr>
+          <w:color w:val="24303B"/>
+          <w:lang w:val="nl-NL"/>
+        </w:rPr>
+        <w:t>Protective</w:t>
+      </w:r>
+      <w:proofErr w:type="spellEnd"/>
+      <w:r>
+        <w:rPr>
+          <w:color w:val="24303B"/>
+          <w:lang w:val="nl-NL"/>
+        </w:rPr>
+        <w:t xml:space="preserve"> Technology (PPT)), over de volledige lengte. De combinatie van </w:t>
+      </w:r>
+      <w:proofErr w:type="spellStart"/>
+      <w:r>
+        <w:rPr>
+          <w:color w:val="24303B"/>
+          <w:lang w:val="nl-NL"/>
+        </w:rPr>
+        <w:t>Plastazote</w:t>
+      </w:r>
+      <w:proofErr w:type="spellEnd"/>
+      <w:r>
+        <w:rPr>
+          <w:color w:val="24303B"/>
+          <w:lang w:val="nl-NL"/>
+        </w:rPr>
+        <w:t xml:space="preserve"> en PPT is effectief gebleken voor drukreductie, maar het gebruik van materialen met vergelijkbare eigenschappen is eveneens mogelijk. </w:t>
       </w:r>
     </w:p>
     <w:p>
       <w:pPr>
-        <w:pStyle w:val="ListParagraph"/>
+        <w:pStyle w:val="Lijstalinea"/>
         <w:numPr>
           <w:ilvl w:val="1"/>
           <w:numId w:val="2"/>
@@ -2105,15 +1392,14 @@
       </w:pPr>
       <w:r>
         <w:rPr>
-          <w:rFonts w:ascii="Arial" w:hAnsi="Arial" w:cs="Arial" w:eastAsia="Arial"/>
           <w:color w:val="24303B"/>
           <w:lang w:val="nl-NL"/>
         </w:rPr>
         <w:t xml:space="preserve">Een </w:t>
       </w:r>
-      <w:r>
-        <w:rPr>
-          <w:rFonts w:ascii="Arial" w:hAnsi="Arial" w:cs="Arial" w:eastAsia="Arial"/>
+      <w:proofErr w:type="spellStart"/>
+      <w:r>
+        <w:rPr>
           <w:b/>
           <w:bCs/>
           <w:color w:val="24303B"/>
@@ -2121,18 +1407,66 @@
         </w:rPr>
         <w:t>metatarsaalbar</w:t>
       </w:r>
-      <w:r>
-        <w:rPr>
-          <w:rFonts w:ascii="Arial" w:hAnsi="Arial" w:cs="Arial" w:eastAsia="Arial"/>
-          <w:color w:val="24303B"/>
-          <w:lang w:val="nl-NL"/>
-        </w:rPr>
-        <w:t xml:space="preserve"> die alle metatarsale kopjes ondersteund. Een metatarsale pad of koepel kan worden gebruikt wanneer slechts één metatarsale regio (tekenen van) verhoogde druk vertoont of een eerdere ulcuslocatie is.</w:t>
+      <w:proofErr w:type="spellEnd"/>
+      <w:r>
+        <w:rPr>
+          <w:color w:val="24303B"/>
+          <w:lang w:val="nl-NL"/>
+        </w:rPr>
+        <w:t xml:space="preserve"> die alle </w:t>
+      </w:r>
+      <w:proofErr w:type="spellStart"/>
+      <w:r>
+        <w:rPr>
+          <w:color w:val="24303B"/>
+          <w:lang w:val="nl-NL"/>
+        </w:rPr>
+        <w:t>metatarsale</w:t>
+      </w:r>
+      <w:proofErr w:type="spellEnd"/>
+      <w:r>
+        <w:rPr>
+          <w:color w:val="24303B"/>
+          <w:lang w:val="nl-NL"/>
+        </w:rPr>
+        <w:t xml:space="preserve"> kopjes ondersteund. Een </w:t>
+      </w:r>
+      <w:proofErr w:type="spellStart"/>
+      <w:r>
+        <w:rPr>
+          <w:color w:val="24303B"/>
+          <w:lang w:val="nl-NL"/>
+        </w:rPr>
+        <w:t>metatarsale</w:t>
+      </w:r>
+      <w:proofErr w:type="spellEnd"/>
+      <w:r>
+        <w:rPr>
+          <w:color w:val="24303B"/>
+          <w:lang w:val="nl-NL"/>
+        </w:rPr>
+        <w:t xml:space="preserve"> pad of koepel kan worden gebruikt wanneer slechts één </w:t>
+      </w:r>
+      <w:proofErr w:type="spellStart"/>
+      <w:r>
+        <w:rPr>
+          <w:color w:val="24303B"/>
+          <w:lang w:val="nl-NL"/>
+        </w:rPr>
+        <w:t>metatarsale</w:t>
+      </w:r>
+      <w:proofErr w:type="spellEnd"/>
+      <w:r>
+        <w:rPr>
+          <w:color w:val="24303B"/>
+          <w:lang w:val="nl-NL"/>
+        </w:rPr>
+        <w:t xml:space="preserve"> regio (tekenen van) verhoogde druk vertoont of een eerdere ulcuslocatie is.</w:t>
       </w:r>
     </w:p>
     <w:p>
       <w:pPr>
-        <w:pStyle w:val="ListParagraph"/>
+        <w:pStyle w:val="Lijstalinea"/>
         <w:numPr>
           <w:ilvl w:val="1"/>
           <w:numId w:val="2"/>
@@ -2145,25 +1479,49 @@
       </w:pPr>
       <w:r>
         <w:rPr>
-          <w:rFonts w:ascii="Arial" w:hAnsi="Arial" w:cs="Arial" w:eastAsia="Arial"/>
-          <w:color w:val="24303B"/>
-          <w:lang w:val="nl-NL"/>
-        </w:rPr>
-        <w:t>Het materiaal van de metatarsaalbar dient te bestaan uit EVA, kurk of een vergelijkbaar materiaal (</w:t>
-      </w:r>
-      <w:r>
-        <w:rPr>
-          <w:rFonts w:ascii="Arial" w:hAnsi="Arial" w:cs="Arial" w:eastAsia="Arial"/>
+          <w:color w:val="24303B"/>
+          <w:lang w:val="nl-NL"/>
+        </w:rPr>
+        <w:t xml:space="preserve">Het materiaal van de </w:t>
+      </w:r>
+      <w:proofErr w:type="spellStart"/>
+      <w:r>
+        <w:rPr>
+          <w:color w:val="24303B"/>
+          <w:lang w:val="nl-NL"/>
+        </w:rPr>
+        <w:t>metatarsaalbar</w:t>
+      </w:r>
+      <w:proofErr w:type="spellEnd"/>
+      <w:r>
+        <w:rPr>
+          <w:color w:val="24303B"/>
+          <w:lang w:val="nl-NL"/>
+        </w:rPr>
+        <w:t xml:space="preserve"> dient te bestaan uit EVA, kurk of een vergelijkbaar materiaal (</w:t>
+      </w:r>
+      <w:proofErr w:type="spellStart"/>
+      <w:r>
+        <w:rPr>
           <w:b/>
           <w:bCs/>
           <w:color w:val="24303B"/>
           <w:lang w:val="nl-NL"/>
         </w:rPr>
-        <w:t>shore 55</w:t>
-      </w:r>
-      <w:r>
-        <w:rPr>
-          <w:rFonts w:ascii="Arial" w:hAnsi="Arial" w:cs="Arial" w:eastAsia="Arial"/>
+        <w:t>shore</w:t>
+      </w:r>
+      <w:proofErr w:type="spellEnd"/>
+      <w:r>
+        <w:rPr>
+          <w:b/>
+          <w:bCs/>
+          <w:color w:val="24303B"/>
+          <w:lang w:val="nl-NL"/>
+        </w:rPr>
+        <w:t xml:space="preserve"> 55</w:t>
+      </w:r>
+      <w:r>
+        <w:rPr>
           <w:color w:val="24303B"/>
           <w:lang w:val="nl-NL"/>
         </w:rPr>
@@ -2172,7 +1530,7 @@
     </w:p>
     <w:p>
       <w:pPr>
-        <w:pStyle w:val="ListParagraph"/>
+        <w:pStyle w:val="Lijstalinea"/>
         <w:numPr>
           <w:ilvl w:val="1"/>
           <w:numId w:val="2"/>
@@ -2185,25 +1543,56 @@
       </w:pPr>
       <w:r>
         <w:rPr>
-          <w:rFonts w:ascii="Arial" w:hAnsi="Arial" w:cs="Arial" w:eastAsia="Arial"/>
-          <w:color w:val="24303B"/>
-          <w:lang w:val="nl-NL"/>
-        </w:rPr>
-        <w:t xml:space="preserve">De hoogte van de metatarsaalbar dient </w:t>
-      </w:r>
-      <w:r>
-        <w:rPr>
-          <w:rFonts w:ascii="Arial" w:hAnsi="Arial" w:cs="Arial" w:eastAsia="Arial"/>
+          <w:color w:val="24303B"/>
+          <w:lang w:val="nl-NL"/>
+        </w:rPr>
+        <w:t xml:space="preserve">De hoogte van de </w:t>
+      </w:r>
+      <w:proofErr w:type="spellStart"/>
+      <w:r>
+        <w:rPr>
+          <w:color w:val="24303B"/>
+          <w:lang w:val="nl-NL"/>
+        </w:rPr>
+        <w:t>metatarsaalbar</w:t>
+      </w:r>
+      <w:proofErr w:type="spellEnd"/>
+      <w:r>
+        <w:rPr>
+          <w:color w:val="24303B"/>
+          <w:lang w:val="nl-NL"/>
+        </w:rPr>
+        <w:t xml:space="preserve"> dient </w:t>
+      </w:r>
+      <w:r>
+        <w:rPr>
           <w:b/>
           <w:bCs/>
           <w:color w:val="24303B"/>
           <w:lang w:val="nl-NL"/>
         </w:rPr>
-        <w:t>9–10 mm</w:t>
-      </w:r>
-      <w:r>
-        <w:rPr>
-          <w:rFonts w:ascii="Arial" w:hAnsi="Arial" w:cs="Arial" w:eastAsia="Arial"/>
+        <w:t>9–1</w:t>
+      </w:r>
+      <w:r>
+        <w:rPr>
+          <w:b/>
+          <w:bCs/>
+          <w:color w:val="24303B"/>
+          <w:lang w:val="nl-NL"/>
+        </w:rPr>
+        <w:t>1</w:t>
+      </w:r>
+      <w:r>
+        <w:rPr>
+          <w:b/>
+          <w:bCs/>
+          <w:color w:val="24303B"/>
+          <w:lang w:val="nl-NL"/>
+        </w:rPr>
+        <w:t xml:space="preserve"> mm</w:t>
+      </w:r>
+      <w:r>
+        <w:rPr>
           <w:color w:val="24303B"/>
           <w:lang w:val="nl-NL"/>
         </w:rPr>
@@ -2212,7 +1601,7 @@
     </w:p>
     <w:p>
       <w:pPr>
-        <w:pStyle w:val="ListParagraph"/>
+        <w:pStyle w:val="Lijstalinea"/>
         <w:numPr>
           <w:ilvl w:val="1"/>
           <w:numId w:val="2"/>
@@ -2230,39 +1619,88 @@
       </w:pPr>
       <w:r>
         <w:rPr>
-          <w:rFonts w:ascii="Arial" w:hAnsi="Arial" w:cs="Arial" w:eastAsia="Arial"/>
-          <w:color w:val="24303B"/>
-          <w:lang w:val="nl-NL"/>
-        </w:rPr>
-        <w:t xml:space="preserve">De positie van de metatarsaalbar dient zich </w:t>
-      </w:r>
-      <w:r>
-        <w:rPr>
-          <w:rFonts w:ascii="Arial" w:hAnsi="Arial" w:cs="Arial" w:eastAsia="Arial"/>
+          <w:color w:val="24303B"/>
+          <w:lang w:val="nl-NL"/>
+        </w:rPr>
+        <w:t xml:space="preserve">De positie van de </w:t>
+      </w:r>
+      <w:proofErr w:type="spellStart"/>
+      <w:r>
+        <w:rPr>
+          <w:color w:val="24303B"/>
+          <w:lang w:val="nl-NL"/>
+        </w:rPr>
+        <w:t>metatarsaalbar</w:t>
+      </w:r>
+      <w:proofErr w:type="spellEnd"/>
+      <w:r>
+        <w:rPr>
+          <w:color w:val="24303B"/>
+          <w:lang w:val="nl-NL"/>
+        </w:rPr>
+        <w:t xml:space="preserve"> dient zich </w:t>
+      </w:r>
+      <w:r>
+        <w:rPr>
           <w:b/>
           <w:bCs/>
           <w:color w:val="24303B"/>
           <w:lang w:val="nl-NL"/>
         </w:rPr>
-        <w:t>6–11 mm proximaal van de metatarsale kop</w:t>
-      </w:r>
-      <w:r>
-        <w:rPr>
-          <w:rFonts w:ascii="Arial" w:hAnsi="Arial" w:cs="Arial" w:eastAsia="Arial"/>
-          <w:color w:val="24303B"/>
-          <w:lang w:val="nl-NL"/>
-        </w:rPr>
-        <w:t xml:space="preserve"> te bevinden in statische positie. Dit betekent dat, bij een ondersteuning met een apex op 10 mm van de distale rand, de distale rand zich 6–11 mm proximaal van het centrum van de metatarsale kop bevindt. </w:t>
+        <w:t xml:space="preserve">6–11 mm proximaal van de </w:t>
+      </w:r>
+      <w:proofErr w:type="spellStart"/>
+      <w:r>
+        <w:rPr>
+          <w:b/>
+          <w:bCs/>
+          <w:color w:val="24303B"/>
+          <w:lang w:val="nl-NL"/>
+        </w:rPr>
+        <w:t>metatarsale</w:t>
+      </w:r>
+      <w:proofErr w:type="spellEnd"/>
+      <w:r>
+        <w:rPr>
+          <w:b/>
+          <w:bCs/>
+          <w:color w:val="24303B"/>
+          <w:lang w:val="nl-NL"/>
+        </w:rPr>
+        <w:t xml:space="preserve"> kop</w:t>
+      </w:r>
+      <w:r>
+        <w:rPr>
+          <w:color w:val="24303B"/>
+          <w:lang w:val="nl-NL"/>
+        </w:rPr>
+        <w:t xml:space="preserve"> te bevinden in statische positie. Dit betekent dat, bij een ondersteuning met een apex op 10 mm van de distale rand, de distale rand zich 6–11 mm proximaal van het centrum van de </w:t>
+      </w:r>
+      <w:proofErr w:type="spellStart"/>
+      <w:r>
+        <w:rPr>
+          <w:color w:val="24303B"/>
+          <w:lang w:val="nl-NL"/>
+        </w:rPr>
+        <w:t>metatarsale</w:t>
+      </w:r>
+      <w:proofErr w:type="spellEnd"/>
+      <w:r>
+        <w:rPr>
+          <w:color w:val="24303B"/>
+          <w:lang w:val="nl-NL"/>
+        </w:rPr>
+        <w:t xml:space="preserve"> kop bevindt. </w:t>
       </w:r>
     </w:p>
     <w:sectPr>
-      <w:headerReference w:type="even" r:id="rId8"/>
-      <w:headerReference w:type="default" r:id="rId9"/>
-      <w:footerReference w:type="even" r:id="rId10"/>
-      <w:footerReference w:type="default" r:id="rId11"/>
-      <w:headerReference w:type="first" r:id="rId12"/>
-      <w:footerReference w:type="first" r:id="rId13"/>
-      <w:pgSz w:w="11906" w:h="16838" w:orient="portrait"/>
+      <w:headerReference w:type="even" r:id="rId11"/>
+      <w:headerReference w:type="default" r:id="rId12"/>
+      <w:footerReference w:type="even" r:id="rId13"/>
+      <w:footerReference w:type="default" r:id="rId14"/>
+      <w:headerReference w:type="first" r:id="rId15"/>
+      <w:footerReference w:type="first" r:id="rId16"/>
+      <w:pgSz w:w="11906" w:h="16838"/>
       <w:pgMar w:top="1440" w:right="1440" w:bottom="1440" w:left="1440" w:header="708" w:footer="708" w:gutter="0"/>
       <w:cols w:space="708"/>
       <w:docGrid w:linePitch="360"/>
@@ -2272,7 +1710,7 @@
 </file>
 
 <file path=word/endnotes.xml><?xml version="1.0" encoding="utf-8"?>
-<w:endnotes xmlns:wpc="http://schemas.microsoft.com/office/word/2010/wordprocessingCanvas" xmlns:cx="http://schemas.microsoft.com/office/drawing/2014/chartex" xmlns:cx1="http://schemas.microsoft.com/office/drawing/2015/9/8/chartex" xmlns:cx2="http://schemas.microsoft.com/office/drawing/2015/10/21/chartex" xmlns:cx3="http://schemas.microsoft.com/office/drawing/2016/5/9/chartex" xmlns:cx4="http://schemas.microsoft.com/office/drawing/2016/5/10/chartex" xmlns:cx5="http://schemas.microsoft.com/office/drawing/2016/5/11/chartex" xmlns:cx6="http://schemas.microsoft.com/office/drawing/2016/5/12/chartex" xmlns:cx7="http://schemas.microsoft.com/office/drawing/2016/5/13/chartex" xmlns:cx8="http://schemas.microsoft.com/office/drawing/2016/5/14/chartex" xmlns:mc="http://schemas.openxmlformats.org/markup-compatibility/2006" xmlns:aink="http://schemas.microsoft.com/office/drawing/2016/ink" xmlns:am3d="http://schemas.microsoft.com/office/drawing/2017/model3d" xmlns:o="urn:schemas-microsoft-com:office:office" xmlns:oel="http://schemas.microsoft.com/office/2019/extlst" xmlns:r="http://schemas.openxmlformats.org/officeDocument/2006/relationships" xmlns:m="http://schemas.openxmlformats.org/officeDocument/2006/math" xmlns:v="urn:schemas-microsoft-com:vml" xmlns:wp14="http://schemas.microsoft.com/office/word/2010/wordprocessingDrawing" xmlns:wp="http://schemas.openxmlformats.org/drawingml/2006/wordprocessingDrawing" xmlns:w10="urn:schemas-microsoft-com:office:word" xmlns:w="http://schemas.openxmlformats.org/wordprocessingml/2006/main" xmlns:w14="http://schemas.microsoft.com/office/word/2010/wordml" xmlns:w15="http://schemas.microsoft.com/office/word/2012/wordml" xmlns:w16cex="http://schemas.microsoft.com/office/word/2018/wordml/cex" xmlns:w16cid="http://schemas.microsoft.com/office/word/2016/wordml/cid" xmlns:w16="http://schemas.microsoft.com/office/word/2018/wordml" xmlns:w16du="http://schemas.microsoft.com/office/word/2023/wordml/word16du" xmlns:w16sdtdh="http://schemas.microsoft.com/office/word/2020/wordml/sdtdatahash" xmlns:w16sdtfl="http://schemas.microsoft.com/office/word/2024/wordml/sdtformatlock" xmlns:w16se="http://schemas.microsoft.com/office/word/2015/wordml/symex" xmlns:wpg="http://schemas.microsoft.com/office/word/2010/wordprocessingGroup" xmlns:wpi="http://schemas.microsoft.com/office/word/2010/wordprocessingInk" xmlns:wne="http://schemas.microsoft.com/office/word/2006/wordml" xmlns:wps="http://schemas.microsoft.com/office/word/2010/wordprocessingShape" mc:Ignorable="w14 w15 w16se w16cid w16 w16cex w16sdtdh w16sdtfl w16du wp14">
+<w:endnotes xmlns:wpc="http://schemas.microsoft.com/office/word/2010/wordprocessingCanvas" xmlns:cx="http://schemas.microsoft.com/office/drawing/2014/chartex" xmlns:cx1="http://schemas.microsoft.com/office/drawing/2015/9/8/chartex" xmlns:cx2="http://schemas.microsoft.com/office/drawing/2015/10/21/chartex" xmlns:cx3="http://schemas.microsoft.com/office/drawing/2016/5/9/chartex" xmlns:cx4="http://schemas.microsoft.com/office/drawing/2016/5/10/chartex" xmlns:cx5="http://schemas.microsoft.com/office/drawing/2016/5/11/chartex" xmlns:cx6="http://schemas.microsoft.com/office/drawing/2016/5/12/chartex" xmlns:cx7="http://schemas.microsoft.com/office/drawing/2016/5/13/chartex" xmlns:cx8="http://schemas.microsoft.com/office/drawing/2016/5/14/chartex" xmlns:mc="http://schemas.openxmlformats.org/markup-compatibility/2006" xmlns:aink="http://schemas.microsoft.com/office/drawing/2016/ink" xmlns:am3d="http://schemas.microsoft.com/office/drawing/2017/model3d" xmlns:o="urn:schemas-microsoft-com:office:office" xmlns:oel="http://schemas.microsoft.com/office/2019/extlst" xmlns:r="http://schemas.openxmlformats.org/officeDocument/2006/relationships" xmlns:m="http://schemas.openxmlformats.org/officeDocument/2006/math" xmlns:v="urn:schemas-microsoft-com:vml" xmlns:wp14="http://schemas.microsoft.com/office/word/2010/wordprocessingDrawing" xmlns:wp="http://schemas.openxmlformats.org/drawingml/2006/wordprocessingDrawing" xmlns:w10="urn:schemas-microsoft-com:office:word" xmlns:w="http://schemas.openxmlformats.org/wordprocessingml/2006/main" xmlns:w14="http://schemas.microsoft.com/office/word/2010/wordml" xmlns:w15="http://schemas.microsoft.com/office/word/2012/wordml" xmlns:w16cei="http://schemas.microsoft.com/office/word/2026/wordml/cei" xmlns:w16cex="http://schemas.microsoft.com/office/word/2018/wordml/cex" xmlns:w16cid="http://schemas.microsoft.com/office/word/2016/wordml/cid" xmlns:w16="http://schemas.microsoft.com/office/word/2018/wordml" xmlns:w16du="http://schemas.microsoft.com/office/word/2023/wordml/word16du" xmlns:w16sdtdh="http://schemas.microsoft.com/office/word/2020/wordml/sdtdatahash" xmlns:w16sdtfl="http://schemas.microsoft.com/office/word/2024/wordml/sdtformatlock" xmlns:w16se="http://schemas.microsoft.com/office/word/2015/wordml/symex" xmlns:wpg="http://schemas.microsoft.com/office/word/2010/wordprocessingGroup" xmlns:wpi="http://schemas.microsoft.com/office/word/2010/wordprocessingInk" xmlns:wne="http://schemas.microsoft.com/office/word/2006/wordml" xmlns:wps="http://schemas.microsoft.com/office/word/2010/wordprocessingShape" mc:Ignorable="w14 w15 w16se w16cid w16 w16cex w16sdtdh w16sdtfl w16du wp14">
   <w:endnote w:type="separator" w:id="-1">
     <w:p>
       <w:pPr>
@@ -2291,17 +1729,17 @@
 </file>
 
 <file path=word/footer1.xml><?xml version="1.0" encoding="utf-8"?>
-<w:ftr xmlns:wpc="http://schemas.microsoft.com/office/word/2010/wordprocessingCanvas" xmlns:cx="http://schemas.microsoft.com/office/drawing/2014/chartex" xmlns:cx1="http://schemas.microsoft.com/office/drawing/2015/9/8/chartex" xmlns:cx2="http://schemas.microsoft.com/office/drawing/2015/10/21/chartex" xmlns:cx3="http://schemas.microsoft.com/office/drawing/2016/5/9/chartex" xmlns:cx4="http://schemas.microsoft.com/office/drawing/2016/5/10/chartex" xmlns:cx5="http://schemas.microsoft.com/office/drawing/2016/5/11/chartex" xmlns:cx6="http://schemas.microsoft.com/office/drawing/2016/5/12/chartex" xmlns:cx7="http://schemas.microsoft.com/office/drawing/2016/5/13/chartex" xmlns:cx8="http://schemas.microsoft.com/office/drawing/2016/5/14/chartex" xmlns:mc="http://schemas.openxmlformats.org/markup-compatibility/2006" xmlns:aink="http://schemas.microsoft.com/office/drawing/2016/ink" xmlns:am3d="http://schemas.microsoft.com/office/drawing/2017/model3d" xmlns:o="urn:schemas-microsoft-com:office:office" xmlns:oel="http://schemas.microsoft.com/office/2019/extlst" xmlns:r="http://schemas.openxmlformats.org/officeDocument/2006/relationships" xmlns:m="http://schemas.openxmlformats.org/officeDocument/2006/math" xmlns:v="urn:schemas-microsoft-com:vml" xmlns:wp14="http://schemas.microsoft.com/office/word/2010/wordprocessingDrawing" xmlns:wp="http://schemas.openxmlformats.org/drawingml/2006/wordprocessingDrawing" xmlns:w10="urn:schemas-microsoft-com:office:word" xmlns:w="http://schemas.openxmlformats.org/wordprocessingml/2006/main" xmlns:w14="http://schemas.microsoft.com/office/word/2010/wordml" xmlns:w15="http://schemas.microsoft.com/office/word/2012/wordml" xmlns:w16cex="http://schemas.microsoft.com/office/word/2018/wordml/cex" xmlns:w16cid="http://schemas.microsoft.com/office/word/2016/wordml/cid" xmlns:w16="http://schemas.microsoft.com/office/word/2018/wordml" xmlns:w16du="http://schemas.microsoft.com/office/word/2023/wordml/word16du" xmlns:w16sdtdh="http://schemas.microsoft.com/office/word/2020/wordml/sdtdatahash" xmlns:w16sdtfl="http://schemas.microsoft.com/office/word/2024/wordml/sdtformatlock" xmlns:w16se="http://schemas.microsoft.com/office/word/2015/wordml/symex" xmlns:wpg="http://schemas.microsoft.com/office/word/2010/wordprocessingGroup" xmlns:wpi="http://schemas.microsoft.com/office/word/2010/wordprocessingInk" xmlns:wne="http://schemas.microsoft.com/office/word/2006/wordml" xmlns:wps="http://schemas.microsoft.com/office/word/2010/wordprocessingShape" mc:Ignorable="w14 w15 w16se w16cid w16 w16cex w16sdtdh w16sdtfl w16du wp14">
+<w:ftr xmlns:wpc="http://schemas.microsoft.com/office/word/2010/wordprocessingCanvas" xmlns:cx="http://schemas.microsoft.com/office/drawing/2014/chartex" xmlns:cx1="http://schemas.microsoft.com/office/drawing/2015/9/8/chartex" xmlns:cx2="http://schemas.microsoft.com/office/drawing/2015/10/21/chartex" xmlns:cx3="http://schemas.microsoft.com/office/drawing/2016/5/9/chartex" xmlns:cx4="http://schemas.microsoft.com/office/drawing/2016/5/10/chartex" xmlns:cx5="http://schemas.microsoft.com/office/drawing/2016/5/11/chartex" xmlns:cx6="http://schemas.microsoft.com/office/drawing/2016/5/12/chartex" xmlns:cx7="http://schemas.microsoft.com/office/drawing/2016/5/13/chartex" xmlns:cx8="http://schemas.microsoft.com/office/drawing/2016/5/14/chartex" xmlns:mc="http://schemas.openxmlformats.org/markup-compatibility/2006" xmlns:aink="http://schemas.microsoft.com/office/drawing/2016/ink" xmlns:am3d="http://schemas.microsoft.com/office/drawing/2017/model3d" xmlns:o="urn:schemas-microsoft-com:office:office" xmlns:oel="http://schemas.microsoft.com/office/2019/extlst" xmlns:r="http://schemas.openxmlformats.org/officeDocument/2006/relationships" xmlns:m="http://schemas.openxmlformats.org/officeDocument/2006/math" xmlns:v="urn:schemas-microsoft-com:vml" xmlns:wp14="http://schemas.microsoft.com/office/word/2010/wordprocessingDrawing" xmlns:wp="http://schemas.openxmlformats.org/drawingml/2006/wordprocessingDrawing" xmlns:w10="urn:schemas-microsoft-com:office:word" xmlns:w="http://schemas.openxmlformats.org/wordprocessingml/2006/main" xmlns:w14="http://schemas.microsoft.com/office/word/2010/wordml" xmlns:w15="http://schemas.microsoft.com/office/word/2012/wordml" xmlns:w16cei="http://schemas.microsoft.com/office/word/2026/wordml/cei" xmlns:w16cex="http://schemas.microsoft.com/office/word/2018/wordml/cex" xmlns:w16cid="http://schemas.microsoft.com/office/word/2016/wordml/cid" xmlns:w16="http://schemas.microsoft.com/office/word/2018/wordml" xmlns:w16du="http://schemas.microsoft.com/office/word/2023/wordml/word16du" xmlns:w16sdtdh="http://schemas.microsoft.com/office/word/2020/wordml/sdtdatahash" xmlns:w16sdtfl="http://schemas.microsoft.com/office/word/2024/wordml/sdtformatlock" xmlns:w16se="http://schemas.microsoft.com/office/word/2015/wordml/symex" xmlns:wpg="http://schemas.microsoft.com/office/word/2010/wordprocessingGroup" xmlns:wpi="http://schemas.microsoft.com/office/word/2010/wordprocessingInk" xmlns:wne="http://schemas.microsoft.com/office/word/2006/wordml" xmlns:wps="http://schemas.microsoft.com/office/word/2010/wordprocessingShape" mc:Ignorable="w14 w15 w16se w16cid w16 w16cex w16sdtdh w16sdtfl w16du wp14">
   <w:p>
     <w:pPr>
-      <w:pStyle w:val="Footer"/>
+      <w:pStyle w:val="Voettekst"/>
     </w:pPr>
   </w:p>
 </w:ftr>
 </file>
 
 <file path=word/footer2.xml><?xml version="1.0" encoding="utf-8"?>
-<w:ftr xmlns:wpc="http://schemas.microsoft.com/office/word/2010/wordprocessingCanvas" xmlns:cx="http://schemas.microsoft.com/office/drawing/2014/chartex" xmlns:cx1="http://schemas.microsoft.com/office/drawing/2015/9/8/chartex" xmlns:cx2="http://schemas.microsoft.com/office/drawing/2015/10/21/chartex" xmlns:cx3="http://schemas.microsoft.com/office/drawing/2016/5/9/chartex" xmlns:cx4="http://schemas.microsoft.com/office/drawing/2016/5/10/chartex" xmlns:cx5="http://schemas.microsoft.com/office/drawing/2016/5/11/chartex" xmlns:cx6="http://schemas.microsoft.com/office/drawing/2016/5/12/chartex" xmlns:cx7="http://schemas.microsoft.com/office/drawing/2016/5/13/chartex" xmlns:cx8="http://schemas.microsoft.com/office/drawing/2016/5/14/chartex" xmlns:mc="http://schemas.openxmlformats.org/markup-compatibility/2006" xmlns:aink="http://schemas.microsoft.com/office/drawing/2016/ink" xmlns:am3d="http://schemas.microsoft.com/office/drawing/2017/model3d" xmlns:o="urn:schemas-microsoft-com:office:office" xmlns:oel="http://schemas.microsoft.com/office/2019/extlst" xmlns:r="http://schemas.openxmlformats.org/officeDocument/2006/relationships" xmlns:m="http://schemas.openxmlformats.org/officeDocument/2006/math" xmlns:v="urn:schemas-microsoft-com:vml" xmlns:wp14="http://schemas.microsoft.com/office/word/2010/wordprocessingDrawing" xmlns:wp="http://schemas.openxmlformats.org/drawingml/2006/wordprocessingDrawing" xmlns:w10="urn:schemas-microsoft-com:office:word" xmlns:w="http://schemas.openxmlformats.org/wordprocessingml/2006/main" xmlns:w14="http://schemas.microsoft.com/office/word/2010/wordml" xmlns:w15="http://schemas.microsoft.com/office/word/2012/wordml" xmlns:w16cex="http://schemas.microsoft.com/office/word/2018/wordml/cex" xmlns:w16cid="http://schemas.microsoft.com/office/word/2016/wordml/cid" xmlns:w16="http://schemas.microsoft.com/office/word/2018/wordml" xmlns:w16du="http://schemas.microsoft.com/office/word/2023/wordml/word16du" xmlns:w16sdtdh="http://schemas.microsoft.com/office/word/2020/wordml/sdtdatahash" xmlns:w16sdtfl="http://schemas.microsoft.com/office/word/2024/wordml/sdtformatlock" xmlns:w16se="http://schemas.microsoft.com/office/word/2015/wordml/symex" xmlns:wpg="http://schemas.microsoft.com/office/word/2010/wordprocessingGroup" xmlns:wpi="http://schemas.microsoft.com/office/word/2010/wordprocessingInk" xmlns:wne="http://schemas.microsoft.com/office/word/2006/wordml" xmlns:wps="http://schemas.microsoft.com/office/word/2010/wordprocessingShape" mc:Ignorable="w14 w15 w16se w16cid w16 w16cex w16sdtdh w16sdtfl w16du wp14">
+<w:ftr xmlns:wpc="http://schemas.microsoft.com/office/word/2010/wordprocessingCanvas" xmlns:cx="http://schemas.microsoft.com/office/drawing/2014/chartex" xmlns:cx1="http://schemas.microsoft.com/office/drawing/2015/9/8/chartex" xmlns:cx2="http://schemas.microsoft.com/office/drawing/2015/10/21/chartex" xmlns:cx3="http://schemas.microsoft.com/office/drawing/2016/5/9/chartex" xmlns:cx4="http://schemas.microsoft.com/office/drawing/2016/5/10/chartex" xmlns:cx5="http://schemas.microsoft.com/office/drawing/2016/5/11/chartex" xmlns:cx6="http://schemas.microsoft.com/office/drawing/2016/5/12/chartex" xmlns:cx7="http://schemas.microsoft.com/office/drawing/2016/5/13/chartex" xmlns:cx8="http://schemas.microsoft.com/office/drawing/2016/5/14/chartex" xmlns:mc="http://schemas.openxmlformats.org/markup-compatibility/2006" xmlns:aink="http://schemas.microsoft.com/office/drawing/2016/ink" xmlns:am3d="http://schemas.microsoft.com/office/drawing/2017/model3d" xmlns:o="urn:schemas-microsoft-com:office:office" xmlns:oel="http://schemas.microsoft.com/office/2019/extlst" xmlns:r="http://schemas.openxmlformats.org/officeDocument/2006/relationships" xmlns:m="http://schemas.openxmlformats.org/officeDocument/2006/math" xmlns:v="urn:schemas-microsoft-com:vml" xmlns:wp14="http://schemas.microsoft.com/office/word/2010/wordprocessingDrawing" xmlns:wp="http://schemas.openxmlformats.org/drawingml/2006/wordprocessingDrawing" xmlns:w10="urn:schemas-microsoft-com:office:word" xmlns:w="http://schemas.openxmlformats.org/wordprocessingml/2006/main" xmlns:w14="http://schemas.microsoft.com/office/word/2010/wordml" xmlns:w15="http://schemas.microsoft.com/office/word/2012/wordml" xmlns:w16cei="http://schemas.microsoft.com/office/word/2026/wordml/cei" xmlns:w16cex="http://schemas.microsoft.com/office/word/2018/wordml/cex" xmlns:w16cid="http://schemas.microsoft.com/office/word/2016/wordml/cid" xmlns:w16="http://schemas.microsoft.com/office/word/2018/wordml" xmlns:w16du="http://schemas.microsoft.com/office/word/2023/wordml/word16du" xmlns:w16sdtdh="http://schemas.microsoft.com/office/word/2020/wordml/sdtdatahash" xmlns:w16sdtfl="http://schemas.microsoft.com/office/word/2024/wordml/sdtformatlock" xmlns:w16se="http://schemas.microsoft.com/office/word/2015/wordml/symex" xmlns:wpg="http://schemas.microsoft.com/office/word/2010/wordprocessingGroup" xmlns:wpi="http://schemas.microsoft.com/office/word/2010/wordprocessingInk" xmlns:wne="http://schemas.microsoft.com/office/word/2006/wordml" xmlns:wps="http://schemas.microsoft.com/office/word/2010/wordprocessingShape" mc:Ignorable="w14 w15 w16se w16cid w16 w16cex w16sdtdh w16sdtfl w16du wp14">
   <w:p>
     <w:pPr>
       <w:pBdr>
@@ -2336,7 +1774,7 @@
                   <pic:cNvPicPr/>
                 </pic:nvPicPr>
                 <pic:blipFill rotWithShape="1">
-                  <a:blip r:embed="rIdTplImgC">
+                  <a:blip r:embed="rId1">
                     <a:extLst>
                       <a:ext uri="{28A0092B-C50C-407E-A947-70E740481C1C}">
                         <a14:useLocalDpi xmlns:a14="http://schemas.microsoft.com/office/drawing/2010/main" val="0"/>
@@ -2383,54 +1821,7 @@
         <w:sz w:val="16"/>
         <w:szCs w:val="16"/>
       </w:rPr>
-      <w:t>PARADISE-</w:t>
-    </w:r>
-    <w:proofErr w:type="gramStart"/>
-    <w:r>
-      <w:rPr>
-        <w:color w:val="59636E"/>
-        <w:sz w:val="16"/>
-        <w:szCs w:val="16"/>
-      </w:rPr>
-      <w:t>studie  ·</w:t>
-    </w:r>
-    <w:proofErr w:type="gramEnd"/>
-    <w:r>
-      <w:rPr>
-        <w:color w:val="59636E"/>
-        <w:sz w:val="16"/>
-        <w:szCs w:val="16"/>
-      </w:rPr>
-      <w:t xml:space="preserve">  eCRF 10: Voorschrift aangepaste voetorthese (CMFO) </w:t>
-    </w:r>
-    <w:proofErr w:type="gramStart"/>
-    <w:r>
-      <w:rPr>
-        <w:color w:val="59636E"/>
-        <w:sz w:val="16"/>
-        <w:szCs w:val="16"/>
-      </w:rPr>
-      <w:t>·</w:t>
-    </w:r>
-    <w:proofErr w:type="gramEnd"/>
-    <w:r>
-      <w:rPr>
-        <w:color w:val="59636E"/>
-        <w:sz w:val="16"/>
-        <w:szCs w:val="16"/>
-      </w:rPr>
-      <w:t xml:space="preserve">  Versie </w:t>
-    </w:r>
-    <w:proofErr w:type="gramStart"/>
-    <w:r>
-      <w:rPr>
-        <w:i/>
-        <w:iCs/>
-        <w:color w:val="59636E"/>
-        <w:sz w:val="16"/>
-        <w:szCs w:val="16"/>
-      </w:rPr>
-      <w:t xml:space="preserve">[ </w:t>
+      <w:t xml:space="preserve">PARADISE-studie  ·  eCRF 10: Voorschrift aangepaste voetorthese (CMFO) ·  Versie </w:t>
     </w:r>
     <w:r>
       <w:rPr>
@@ -2440,29 +1831,7 @@
         <w:sz w:val="16"/>
         <w:szCs w:val="16"/>
       </w:rPr>
-      <w:t>1.0</w:t>
-    </w:r>
-    <w:proofErr w:type="gramEnd"/>
-    <w:r>
-      <w:rPr>
-        <w:i/>
-        <w:iCs/>
-        <w:color w:val="59636E"/>
-        <w:sz w:val="16"/>
-        <w:szCs w:val="16"/>
-      </w:rPr>
-      <w:t xml:space="preserve"> </w:t>
-    </w:r>
-    <w:proofErr w:type="gramStart"/>
-    <w:r>
-      <w:rPr>
-        <w:i/>
-        <w:iCs/>
-        <w:color w:val="59636E"/>
-        <w:sz w:val="16"/>
-        <w:szCs w:val="16"/>
-      </w:rPr>
-      <w:t>]</w:t>
+      <w:t>[ 1.0 ]</w:t>
     </w:r>
     <w:r>
       <w:rPr>
@@ -2470,27 +1839,7 @@
         <w:sz w:val="16"/>
         <w:szCs w:val="16"/>
       </w:rPr>
-      <w:t xml:space="preserve">  ·</w:t>
-    </w:r>
-    <w:proofErr w:type="gramEnd"/>
-    <w:r>
-      <w:rPr>
-        <w:color w:val="59636E"/>
-        <w:sz w:val="16"/>
-        <w:szCs w:val="16"/>
-      </w:rPr>
-      <w:t xml:space="preserve">  </w:t>
-    </w:r>
-    <w:proofErr w:type="gramStart"/>
-    <w:r>
-      <w:rPr>
-        <w:i/>
-        <w:iCs/>
-        <w:color w:val="59636E"/>
-        <w:sz w:val="16"/>
-        <w:szCs w:val="16"/>
-      </w:rPr>
-      <w:t xml:space="preserve">[ </w:t>
+      <w:t xml:space="preserve">  ·  </w:t>
     </w:r>
     <w:r>
       <w:rPr>
@@ -2500,66 +1849,15 @@
         <w:sz w:val="16"/>
         <w:szCs w:val="16"/>
       </w:rPr>
-      <w:t>27</w:t>
+      <w:t>[ 27/07/2026 ]</w:t>
     </w:r>
-    <w:proofErr w:type="gramEnd"/>
-    <w:r>
-      <w:rPr>
-        <w:i/>
-        <w:iCs/>
-        <w:color w:val="59636E"/>
-        <w:sz w:val="16"/>
-        <w:szCs w:val="16"/>
-      </w:rPr>
-      <w:t>/07/</w:t>
-    </w:r>
-    <w:proofErr w:type="gramStart"/>
-    <w:r>
-      <w:rPr>
-        <w:i/>
-        <w:iCs/>
-        <w:color w:val="59636E"/>
-        <w:sz w:val="16"/>
-        <w:szCs w:val="16"/>
-      </w:rPr>
-      <w:t>2026</w:t>
-    </w:r>
-    <w:r>
-      <w:rPr>
-        <w:i/>
-        <w:iCs/>
-        <w:color w:val="59636E"/>
-        <w:sz w:val="16"/>
-        <w:szCs w:val="16"/>
-      </w:rPr>
-      <w:t xml:space="preserve"> ]</w:t>
-    </w:r>
-    <w:proofErr w:type="gramEnd"/>
     <w:r>
       <w:rPr>
         <w:color w:val="59636E"/>
         <w:sz w:val="16"/>
         <w:szCs w:val="16"/>
       </w:rPr>
-      <w:t xml:space="preserve">  </w:t>
-    </w:r>
-    <w:proofErr w:type="gramStart"/>
-    <w:r>
-      <w:rPr>
-        <w:color w:val="59636E"/>
-        <w:sz w:val="16"/>
-        <w:szCs w:val="16"/>
-      </w:rPr>
-      <w:t>·  Pagina</w:t>
-    </w:r>
-    <w:proofErr w:type="gramEnd"/>
-    <w:r>
-      <w:rPr>
-        <w:color w:val="59636E"/>
-        <w:sz w:val="16"/>
-        <w:szCs w:val="16"/>
-      </w:rPr>
-      <w:t xml:space="preserve"> </w:t>
+      <w:t xml:space="preserve">  ·  Pagina </w:t>
     </w:r>
     <w:r>
       <w:rPr>
@@ -2656,17 +1954,17 @@
 </file>
 
 <file path=word/footer3.xml><?xml version="1.0" encoding="utf-8"?>
-<w:ftr xmlns:wpc="http://schemas.microsoft.com/office/word/2010/wordprocessingCanvas" xmlns:cx="http://schemas.microsoft.com/office/drawing/2014/chartex" xmlns:cx1="http://schemas.microsoft.com/office/drawing/2015/9/8/chartex" xmlns:cx2="http://schemas.microsoft.com/office/drawing/2015/10/21/chartex" xmlns:cx3="http://schemas.microsoft.com/office/drawing/2016/5/9/chartex" xmlns:cx4="http://schemas.microsoft.com/office/drawing/2016/5/10/chartex" xmlns:cx5="http://schemas.microsoft.com/office/drawing/2016/5/11/chartex" xmlns:cx6="http://schemas.microsoft.com/office/drawing/2016/5/12/chartex" xmlns:cx7="http://schemas.microsoft.com/office/drawing/2016/5/13/chartex" xmlns:cx8="http://schemas.microsoft.com/office/drawing/2016/5/14/chartex" xmlns:mc="http://schemas.openxmlformats.org/markup-compatibility/2006" xmlns:aink="http://schemas.microsoft.com/office/drawing/2016/ink" xmlns:am3d="http://schemas.microsoft.com/office/drawing/2017/model3d" xmlns:o="urn:schemas-microsoft-com:office:office" xmlns:oel="http://schemas.microsoft.com/office/2019/extlst" xmlns:r="http://schemas.openxmlformats.org/officeDocument/2006/relationships" xmlns:m="http://schemas.openxmlformats.org/officeDocument/2006/math" xmlns:v="urn:schemas-microsoft-com:vml" xmlns:wp14="http://schemas.microsoft.com/office/word/2010/wordprocessingDrawing" xmlns:wp="http://schemas.openxmlformats.org/drawingml/2006/wordprocessingDrawing" xmlns:w10="urn:schemas-microsoft-com:office:word" xmlns:w="http://schemas.openxmlformats.org/wordprocessingml/2006/main" xmlns:w14="http://schemas.microsoft.com/office/word/2010/wordml" xmlns:w15="http://schemas.microsoft.com/office/word/2012/wordml" xmlns:w16cex="http://schemas.microsoft.com/office/word/2018/wordml/cex" xmlns:w16cid="http://schemas.microsoft.com/office/word/2016/wordml/cid" xmlns:w16="http://schemas.microsoft.com/office/word/2018/wordml" xmlns:w16du="http://schemas.microsoft.com/office/word/2023/wordml/word16du" xmlns:w16sdtdh="http://schemas.microsoft.com/office/word/2020/wordml/sdtdatahash" xmlns:w16sdtfl="http://schemas.microsoft.com/office/word/2024/wordml/sdtformatlock" xmlns:w16se="http://schemas.microsoft.com/office/word/2015/wordml/symex" xmlns:wpg="http://schemas.microsoft.com/office/word/2010/wordprocessingGroup" xmlns:wpi="http://schemas.microsoft.com/office/word/2010/wordprocessingInk" xmlns:wne="http://schemas.microsoft.com/office/word/2006/wordml" xmlns:wps="http://schemas.microsoft.com/office/word/2010/wordprocessingShape" mc:Ignorable="w14 w15 w16se w16cid w16 w16cex w16sdtdh w16sdtfl w16du wp14">
+<w:ftr xmlns:wpc="http://schemas.microsoft.com/office/word/2010/wordprocessingCanvas" xmlns:cx="http://schemas.microsoft.com/office/drawing/2014/chartex" xmlns:cx1="http://schemas.microsoft.com/office/drawing/2015/9/8/chartex" xmlns:cx2="http://schemas.microsoft.com/office/drawing/2015/10/21/chartex" xmlns:cx3="http://schemas.microsoft.com/office/drawing/2016/5/9/chartex" xmlns:cx4="http://schemas.microsoft.com/office/drawing/2016/5/10/chartex" xmlns:cx5="http://schemas.microsoft.com/office/drawing/2016/5/11/chartex" xmlns:cx6="http://schemas.microsoft.com/office/drawing/2016/5/12/chartex" xmlns:cx7="http://schemas.microsoft.com/office/drawing/2016/5/13/chartex" xmlns:cx8="http://schemas.microsoft.com/office/drawing/2016/5/14/chartex" xmlns:mc="http://schemas.openxmlformats.org/markup-compatibility/2006" xmlns:aink="http://schemas.microsoft.com/office/drawing/2016/ink" xmlns:am3d="http://schemas.microsoft.com/office/drawing/2017/model3d" xmlns:o="urn:schemas-microsoft-com:office:office" xmlns:oel="http://schemas.microsoft.com/office/2019/extlst" xmlns:r="http://schemas.openxmlformats.org/officeDocument/2006/relationships" xmlns:m="http://schemas.openxmlformats.org/officeDocument/2006/math" xmlns:v="urn:schemas-microsoft-com:vml" xmlns:wp14="http://schemas.microsoft.com/office/word/2010/wordprocessingDrawing" xmlns:wp="http://schemas.openxmlformats.org/drawingml/2006/wordprocessingDrawing" xmlns:w10="urn:schemas-microsoft-com:office:word" xmlns:w="http://schemas.openxmlformats.org/wordprocessingml/2006/main" xmlns:w14="http://schemas.microsoft.com/office/word/2010/wordml" xmlns:w15="http://schemas.microsoft.com/office/word/2012/wordml" xmlns:w16cei="http://schemas.microsoft.com/office/word/2026/wordml/cei" xmlns:w16cex="http://schemas.microsoft.com/office/word/2018/wordml/cex" xmlns:w16cid="http://schemas.microsoft.com/office/word/2016/wordml/cid" xmlns:w16="http://schemas.microsoft.com/office/word/2018/wordml" xmlns:w16du="http://schemas.microsoft.com/office/word/2023/wordml/word16du" xmlns:w16sdtdh="http://schemas.microsoft.com/office/word/2020/wordml/sdtdatahash" xmlns:w16sdtfl="http://schemas.microsoft.com/office/word/2024/wordml/sdtformatlock" xmlns:w16se="http://schemas.microsoft.com/office/word/2015/wordml/symex" xmlns:wpg="http://schemas.microsoft.com/office/word/2010/wordprocessingGroup" xmlns:wpi="http://schemas.microsoft.com/office/word/2010/wordprocessingInk" xmlns:wne="http://schemas.microsoft.com/office/word/2006/wordml" xmlns:wps="http://schemas.microsoft.com/office/word/2010/wordprocessingShape" mc:Ignorable="w14 w15 w16se w16cid w16 w16cex w16sdtdh w16sdtfl w16du wp14">
   <w:p>
     <w:pPr>
-      <w:pStyle w:val="Footer"/>
+      <w:pStyle w:val="Voettekst"/>
     </w:pPr>
   </w:p>
 </w:ftr>
 </file>
 
 <file path=word/footnotes.xml><?xml version="1.0" encoding="utf-8"?>
-<w:footnotes xmlns:wpc="http://schemas.microsoft.com/office/word/2010/wordprocessingCanvas" xmlns:cx="http://schemas.microsoft.com/office/drawing/2014/chartex" xmlns:cx1="http://schemas.microsoft.com/office/drawing/2015/9/8/chartex" xmlns:cx2="http://schemas.microsoft.com/office/drawing/2015/10/21/chartex" xmlns:cx3="http://schemas.microsoft.com/office/drawing/2016/5/9/chartex" xmlns:cx4="http://schemas.microsoft.com/office/drawing/2016/5/10/chartex" xmlns:cx5="http://schemas.microsoft.com/office/drawing/2016/5/11/chartex" xmlns:cx6="http://schemas.microsoft.com/office/drawing/2016/5/12/chartex" xmlns:cx7="http://schemas.microsoft.com/office/drawing/2016/5/13/chartex" xmlns:cx8="http://schemas.microsoft.com/office/drawing/2016/5/14/chartex" xmlns:mc="http://schemas.openxmlformats.org/markup-compatibility/2006" xmlns:aink="http://schemas.microsoft.com/office/drawing/2016/ink" xmlns:am3d="http://schemas.microsoft.com/office/drawing/2017/model3d" xmlns:o="urn:schemas-microsoft-com:office:office" xmlns:oel="http://schemas.microsoft.com/office/2019/extlst" xmlns:r="http://schemas.openxmlformats.org/officeDocument/2006/relationships" xmlns:m="http://schemas.openxmlformats.org/officeDocument/2006/math" xmlns:v="urn:schemas-microsoft-com:vml" xmlns:wp14="http://schemas.microsoft.com/office/word/2010/wordprocessingDrawing" xmlns:wp="http://schemas.openxmlformats.org/drawingml/2006/wordprocessingDrawing" xmlns:w10="urn:schemas-microsoft-com:office:word" xmlns:w="http://schemas.openxmlformats.org/wordprocessingml/2006/main" xmlns:w14="http://schemas.microsoft.com/office/word/2010/wordml" xmlns:w15="http://schemas.microsoft.com/office/word/2012/wordml" xmlns:w16cex="http://schemas.microsoft.com/office/word/2018/wordml/cex" xmlns:w16cid="http://schemas.microsoft.com/office/word/2016/wordml/cid" xmlns:w16="http://schemas.microsoft.com/office/word/2018/wordml" xmlns:w16du="http://schemas.microsoft.com/office/word/2023/wordml/word16du" xmlns:w16sdtdh="http://schemas.microsoft.com/office/word/2020/wordml/sdtdatahash" xmlns:w16sdtfl="http://schemas.microsoft.com/office/word/2024/wordml/sdtformatlock" xmlns:w16se="http://schemas.microsoft.com/office/word/2015/wordml/symex" xmlns:wpg="http://schemas.microsoft.com/office/word/2010/wordprocessingGroup" xmlns:wpi="http://schemas.microsoft.com/office/word/2010/wordprocessingInk" xmlns:wne="http://schemas.microsoft.com/office/word/2006/wordml" xmlns:wps="http://schemas.microsoft.com/office/word/2010/wordprocessingShape" mc:Ignorable="w14 w15 w16se w16cid w16 w16cex w16sdtdh w16sdtfl w16du wp14">
+<w:footnotes xmlns:wpc="http://schemas.microsoft.com/office/word/2010/wordprocessingCanvas" xmlns:cx="http://schemas.microsoft.com/office/drawing/2014/chartex" xmlns:cx1="http://schemas.microsoft.com/office/drawing/2015/9/8/chartex" xmlns:cx2="http://schemas.microsoft.com/office/drawing/2015/10/21/chartex" xmlns:cx3="http://schemas.microsoft.com/office/drawing/2016/5/9/chartex" xmlns:cx4="http://schemas.microsoft.com/office/drawing/2016/5/10/chartex" xmlns:cx5="http://schemas.microsoft.com/office/drawing/2016/5/11/chartex" xmlns:cx6="http://schemas.microsoft.com/office/drawing/2016/5/12/chartex" xmlns:cx7="http://schemas.microsoft.com/office/drawing/2016/5/13/chartex" xmlns:cx8="http://schemas.microsoft.com/office/drawing/2016/5/14/chartex" xmlns:mc="http://schemas.openxmlformats.org/markup-compatibility/2006" xmlns:aink="http://schemas.microsoft.com/office/drawing/2016/ink" xmlns:am3d="http://schemas.microsoft.com/office/drawing/2017/model3d" xmlns:o="urn:schemas-microsoft-com:office:office" xmlns:oel="http://schemas.microsoft.com/office/2019/extlst" xmlns:r="http://schemas.openxmlformats.org/officeDocument/2006/relationships" xmlns:m="http://schemas.openxmlformats.org/officeDocument/2006/math" xmlns:v="urn:schemas-microsoft-com:vml" xmlns:wp14="http://schemas.microsoft.com/office/word/2010/wordprocessingDrawing" xmlns:wp="http://schemas.openxmlformats.org/drawingml/2006/wordprocessingDrawing" xmlns:w10="urn:schemas-microsoft-com:office:word" xmlns:w="http://schemas.openxmlformats.org/wordprocessingml/2006/main" xmlns:w14="http://schemas.microsoft.com/office/word/2010/wordml" xmlns:w15="http://schemas.microsoft.com/office/word/2012/wordml" xmlns:w16cei="http://schemas.microsoft.com/office/word/2026/wordml/cei" xmlns:w16cex="http://schemas.microsoft.com/office/word/2018/wordml/cex" xmlns:w16cid="http://schemas.microsoft.com/office/word/2016/wordml/cid" xmlns:w16="http://schemas.microsoft.com/office/word/2018/wordml" xmlns:w16du="http://schemas.microsoft.com/office/word/2023/wordml/word16du" xmlns:w16sdtdh="http://schemas.microsoft.com/office/word/2020/wordml/sdtdatahash" xmlns:w16sdtfl="http://schemas.microsoft.com/office/word/2024/wordml/sdtformatlock" xmlns:w16se="http://schemas.microsoft.com/office/word/2015/wordml/symex" xmlns:wpg="http://schemas.microsoft.com/office/word/2010/wordprocessingGroup" xmlns:wpi="http://schemas.microsoft.com/office/word/2010/wordprocessingInk" xmlns:wne="http://schemas.microsoft.com/office/word/2006/wordml" xmlns:wps="http://schemas.microsoft.com/office/word/2010/wordprocessingShape" mc:Ignorable="w14 w15 w16se w16cid w16 w16cex w16sdtdh w16sdtfl w16du wp14">
   <w:footnote w:type="separator" w:id="-1">
     <w:p>
       <w:pPr>
@@ -2685,20 +1983,19 @@
 </file>
 
 <file path=word/header1.xml><?xml version="1.0" encoding="utf-8"?>
-<w:hdr xmlns:wpc="http://schemas.microsoft.com/office/word/2010/wordprocessingCanvas" xmlns:cx="http://schemas.microsoft.com/office/drawing/2014/chartex" xmlns:cx1="http://schemas.microsoft.com/office/drawing/2015/9/8/chartex" xmlns:cx2="http://schemas.microsoft.com/office/drawing/2015/10/21/chartex" xmlns:cx3="http://schemas.microsoft.com/office/drawing/2016/5/9/chartex" xmlns:cx4="http://schemas.microsoft.com/office/drawing/2016/5/10/chartex" xmlns:cx5="http://schemas.microsoft.com/office/drawing/2016/5/11/chartex" xmlns:cx6="http://schemas.microsoft.com/office/drawing/2016/5/12/chartex" xmlns:cx7="http://schemas.microsoft.com/office/drawing/2016/5/13/chartex" xmlns:cx8="http://schemas.microsoft.com/office/drawing/2016/5/14/chartex" xmlns:mc="http://schemas.openxmlformats.org/markup-compatibility/2006" xmlns:aink="http://schemas.microsoft.com/office/drawing/2016/ink" xmlns:am3d="http://schemas.microsoft.com/office/drawing/2017/model3d" xmlns:o="urn:schemas-microsoft-com:office:office" xmlns:oel="http://schemas.microsoft.com/office/2019/extlst" xmlns:r="http://schemas.openxmlformats.org/officeDocument/2006/relationships" xmlns:m="http://schemas.openxmlformats.org/officeDocument/2006/math" xmlns:v="urn:schemas-microsoft-com:vml" xmlns:wp14="http://schemas.microsoft.com/office/word/2010/wordprocessingDrawing" xmlns:wp="http://schemas.openxmlformats.org/drawingml/2006/wordprocessingDrawing" xmlns:w10="urn:schemas-microsoft-com:office:word" xmlns:w="http://schemas.openxmlformats.org/wordprocessingml/2006/main" xmlns:w14="http://schemas.microsoft.com/office/word/2010/wordml" xmlns:w15="http://schemas.microsoft.com/office/word/2012/wordml" xmlns:w16cex="http://schemas.microsoft.com/office/word/2018/wordml/cex" xmlns:w16cid="http://schemas.microsoft.com/office/word/2016/wordml/cid" xmlns:w16="http://schemas.microsoft.com/office/word/2018/wordml" xmlns:w16du="http://schemas.microsoft.com/office/word/2023/wordml/word16du" xmlns:w16sdtdh="http://schemas.microsoft.com/office/word/2020/wordml/sdtdatahash" xmlns:w16sdtfl="http://schemas.microsoft.com/office/word/2024/wordml/sdtformatlock" xmlns:w16se="http://schemas.microsoft.com/office/word/2015/wordml/symex" xmlns:wpg="http://schemas.microsoft.com/office/word/2010/wordprocessingGroup" xmlns:wpi="http://schemas.microsoft.com/office/word/2010/wordprocessingInk" xmlns:wne="http://schemas.microsoft.com/office/word/2006/wordml" xmlns:wps="http://schemas.microsoft.com/office/word/2010/wordprocessingShape" mc:Ignorable="w14 w15 w16se w16cid w16 w16cex w16sdtdh w16sdtfl w16du wp14">
+<w:hdr xmlns:wpc="http://schemas.microsoft.com/office/word/2010/wordprocessingCanvas" xmlns:cx="http://schemas.microsoft.com/office/drawing/2014/chartex" xmlns:cx1="http://schemas.microsoft.com/office/drawing/2015/9/8/chartex" xmlns:cx2="http://schemas.microsoft.com/office/drawing/2015/10/21/chartex" xmlns:cx3="http://schemas.microsoft.com/office/drawing/2016/5/9/chartex" xmlns:cx4="http://schemas.microsoft.com/office/drawing/2016/5/10/chartex" xmlns:cx5="http://schemas.microsoft.com/office/drawing/2016/5/11/chartex" xmlns:cx6="http://schemas.microsoft.com/office/drawing/2016/5/12/chartex" xmlns:cx7="http://schemas.microsoft.com/office/drawing/2016/5/13/chartex" xmlns:cx8="http://schemas.microsoft.com/office/drawing/2016/5/14/chartex" xmlns:mc="http://schemas.openxmlformats.org/markup-compatibility/2006" xmlns:aink="http://schemas.microsoft.com/office/drawing/2016/ink" xmlns:am3d="http://schemas.microsoft.com/office/drawing/2017/model3d" xmlns:o="urn:schemas-microsoft-com:office:office" xmlns:oel="http://schemas.microsoft.com/office/2019/extlst" xmlns:r="http://schemas.openxmlformats.org/officeDocument/2006/relationships" xmlns:m="http://schemas.openxmlformats.org/officeDocument/2006/math" xmlns:v="urn:schemas-microsoft-com:vml" xmlns:wp14="http://schemas.microsoft.com/office/word/2010/wordprocessingDrawing" xmlns:wp="http://schemas.openxmlformats.org/drawingml/2006/wordprocessingDrawing" xmlns:w10="urn:schemas-microsoft-com:office:word" xmlns:w="http://schemas.openxmlformats.org/wordprocessingml/2006/main" xmlns:w14="http://schemas.microsoft.com/office/word/2010/wordml" xmlns:w15="http://schemas.microsoft.com/office/word/2012/wordml" xmlns:w16cei="http://schemas.microsoft.com/office/word/2026/wordml/cei" xmlns:w16cex="http://schemas.microsoft.com/office/word/2018/wordml/cex" xmlns:w16cid="http://schemas.microsoft.com/office/word/2016/wordml/cid" xmlns:w16="http://schemas.microsoft.com/office/word/2018/wordml" xmlns:w16du="http://schemas.microsoft.com/office/word/2023/wordml/word16du" xmlns:w16sdtdh="http://schemas.microsoft.com/office/word/2020/wordml/sdtdatahash" xmlns:w16sdtfl="http://schemas.microsoft.com/office/word/2024/wordml/sdtformatlock" xmlns:w16se="http://schemas.microsoft.com/office/word/2015/wordml/symex" xmlns:wpg="http://schemas.microsoft.com/office/word/2010/wordprocessingGroup" xmlns:wpi="http://schemas.microsoft.com/office/word/2010/wordprocessingInk" xmlns:wne="http://schemas.microsoft.com/office/word/2006/wordml" xmlns:wps="http://schemas.microsoft.com/office/word/2010/wordprocessingShape" mc:Ignorable="w14 w15 w16se w16cid w16 w16cex w16sdtdh w16sdtfl w16du wp14">
   <w:p>
     <w:pPr>
-      <w:pStyle w:val="Header"/>
+      <w:pStyle w:val="Koptekst"/>
     </w:pPr>
   </w:p>
 </w:hdr>
 </file>
 
 <file path=word/header2.xml><?xml version="1.0" encoding="utf-8"?>
-<w:hdr xmlns:wpc="http://schemas.microsoft.com/office/word/2010/wordprocessingCanvas" xmlns:cx="http://schemas.microsoft.com/office/drawing/2014/chartex" xmlns:cx1="http://schemas.microsoft.com/office/drawing/2015/9/8/chartex" xmlns:cx2="http://schemas.microsoft.com/office/drawing/2015/10/21/chartex" xmlns:cx3="http://schemas.microsoft.com/office/drawing/2016/5/9/chartex" xmlns:cx4="http://schemas.microsoft.com/office/drawing/2016/5/10/chartex" xmlns:cx5="http://schemas.microsoft.com/office/drawing/2016/5/11/chartex" xmlns:cx6="http://schemas.microsoft.com/office/drawing/2016/5/12/chartex" xmlns:cx7="http://schemas.microsoft.com/office/drawing/2016/5/13/chartex" xmlns:cx8="http://schemas.microsoft.com/office/drawing/2016/5/14/chartex" xmlns:mc="http://schemas.openxmlformats.org/markup-compatibility/2006" xmlns:aink="http://schemas.microsoft.com/office/drawing/2016/ink" xmlns:am3d="http://schemas.microsoft.com/office/drawing/2017/model3d" xmlns:o="urn:schemas-microsoft-com:office:office" xmlns:oel="http://schemas.microsoft.com/office/2019/extlst" xmlns:r="http://schemas.openxmlformats.org/officeDocument/2006/relationships" xmlns:m="http://schemas.openxmlformats.org/officeDocument/2006/math" xmlns:v="urn:schemas-microsoft-com:vml" xmlns:wp14="http://schemas.microsoft.com/office/word/2010/wordprocessingDrawing" xmlns:wp="http://schemas.openxmlformats.org/drawingml/2006/wordprocessingDrawing" xmlns:w10="urn:schemas-microsoft-com:office:word" xmlns:w="http://schemas.openxmlformats.org/wordprocessingml/2006/main" xmlns:w14="http://schemas.microsoft.com/office/word/2010/wordml" xmlns:w15="http://schemas.microsoft.com/office/word/2012/wordml" xmlns:w16cex="http://schemas.microsoft.com/office/word/2018/wordml/cex" xmlns:w16cid="http://schemas.microsoft.com/office/word/2016/wordml/cid" xmlns:w16="http://schemas.microsoft.com/office/word/2018/wordml" xmlns:w16du="http://schemas.microsoft.com/office/word/2023/wordml/word16du" xmlns:w16sdtdh="http://schemas.microsoft.com/office/word/2020/wordml/sdtdatahash" xmlns:w16sdtfl="http://schemas.microsoft.com/office/word/2024/wordml/sdtformatlock" xmlns:w16se="http://schemas.microsoft.com/office/word/2015/wordml/symex" xmlns:wpg="http://schemas.microsoft.com/office/word/2010/wordprocessingGroup" xmlns:wpi="http://schemas.microsoft.com/office/word/2010/wordprocessingInk" xmlns:wne="http://schemas.microsoft.com/office/word/2006/wordml" xmlns:wps="http://schemas.microsoft.com/office/word/2010/wordprocessingShape" mc:Ignorable="w14 w15 w16se w16cid w16 w16cex w16sdtdh w16sdtfl w16du wp14">
+<w:hdr xmlns:wpc="http://schemas.microsoft.com/office/word/2010/wordprocessingCanvas" xmlns:cx="http://schemas.microsoft.com/office/drawing/2014/chartex" xmlns:cx1="http://schemas.microsoft.com/office/drawing/2015/9/8/chartex" xmlns:cx2="http://schemas.microsoft.com/office/drawing/2015/10/21/chartex" xmlns:cx3="http://schemas.microsoft.com/office/drawing/2016/5/9/chartex" xmlns:cx4="http://schemas.microsoft.com/office/drawing/2016/5/10/chartex" xmlns:cx5="http://schemas.microsoft.com/office/drawing/2016/5/11/chartex" xmlns:cx6="http://schemas.microsoft.com/office/drawing/2016/5/12/chartex" xmlns:cx7="http://schemas.microsoft.com/office/drawing/2016/5/13/chartex" xmlns:cx8="http://schemas.microsoft.com/office/drawing/2016/5/14/chartex" xmlns:mc="http://schemas.openxmlformats.org/markup-compatibility/2006" xmlns:aink="http://schemas.microsoft.com/office/drawing/2016/ink" xmlns:am3d="http://schemas.microsoft.com/office/drawing/2017/model3d" xmlns:o="urn:schemas-microsoft-com:office:office" xmlns:oel="http://schemas.microsoft.com/office/2019/extlst" xmlns:r="http://schemas.openxmlformats.org/officeDocument/2006/relationships" xmlns:m="http://schemas.openxmlformats.org/officeDocument/2006/math" xmlns:v="urn:schemas-microsoft-com:vml" xmlns:wp14="http://schemas.microsoft.com/office/word/2010/wordprocessingDrawing" xmlns:wp="http://schemas.openxmlformats.org/drawingml/2006/wordprocessingDrawing" xmlns:w10="urn:schemas-microsoft-com:office:word" xmlns:w="http://schemas.openxmlformats.org/wordprocessingml/2006/main" xmlns:w14="http://schemas.microsoft.com/office/word/2010/wordml" xmlns:w15="http://schemas.microsoft.com/office/word/2012/wordml" xmlns:w16cei="http://schemas.microsoft.com/office/word/2026/wordml/cei" xmlns:w16cex="http://schemas.microsoft.com/office/word/2018/wordml/cex" xmlns:w16cid="http://schemas.microsoft.com/office/word/2016/wordml/cid" xmlns:w16="http://schemas.microsoft.com/office/word/2018/wordml" xmlns:w16du="http://schemas.microsoft.com/office/word/2023/wordml/word16du" xmlns:w16sdtdh="http://schemas.microsoft.com/office/word/2020/wordml/sdtdatahash" xmlns:w16sdtfl="http://schemas.microsoft.com/office/word/2024/wordml/sdtformatlock" xmlns:w16se="http://schemas.microsoft.com/office/word/2015/wordml/symex" xmlns:wpg="http://schemas.microsoft.com/office/word/2010/wordprocessingGroup" xmlns:wpi="http://schemas.microsoft.com/office/word/2010/wordprocessingInk" xmlns:wne="http://schemas.microsoft.com/office/word/2006/wordml" xmlns:wps="http://schemas.microsoft.com/office/word/2010/wordprocessingShape" mc:Ignorable="w14 w15 w16se w16cid w16 w16cex w16sdtdh w16sdtfl w16du wp14">
   <w:p>
     <w:pPr>
-      <w:pStyle w:val="Koptekst"/>
       <w:jc w:val="right"/>
     </w:pPr>
     <w:r>
@@ -2742,7 +2039,7 @@
                   <pic:cNvPicPr/>
                 </pic:nvPicPr>
                 <pic:blipFill>
-                  <a:blip r:embed="rIdTplImgA">
+                  <a:blip r:embed="rId1">
                     <a:extLst>
                       <a:ext uri="{28A0092B-C50C-407E-A947-70E740481C1C}">
                         <a14:useLocalDpi xmlns:a14="http://schemas.microsoft.com/office/drawing/2010/main" val="0"/>
@@ -2794,7 +2091,7 @@
                   <pic:cNvPicPr/>
                 </pic:nvPicPr>
                 <pic:blipFill>
-                  <a:blip r:embed="rIdTplImgB">
+                  <a:blip r:embed="rId2">
                     <a:extLst>
                       <a:ext uri="{28A0092B-C50C-407E-A947-70E740481C1C}">
                         <a14:useLocalDpi xmlns:a14="http://schemas.microsoft.com/office/drawing/2010/main" val="0"/>
@@ -2825,18 +2122,167 @@
 </file>
 
 <file path=word/header3.xml><?xml version="1.0" encoding="utf-8"?>
-<w:hdr xmlns:wpc="http://schemas.microsoft.com/office/word/2010/wordprocessingCanvas" xmlns:cx="http://schemas.microsoft.com/office/drawing/2014/chartex" xmlns:cx1="http://schemas.microsoft.com/office/drawing/2015/9/8/chartex" xmlns:cx2="http://schemas.microsoft.com/office/drawing/2015/10/21/chartex" xmlns:cx3="http://schemas.microsoft.com/office/drawing/2016/5/9/chartex" xmlns:cx4="http://schemas.microsoft.com/office/drawing/2016/5/10/chartex" xmlns:cx5="http://schemas.microsoft.com/office/drawing/2016/5/11/chartex" xmlns:cx6="http://schemas.microsoft.com/office/drawing/2016/5/12/chartex" xmlns:cx7="http://schemas.microsoft.com/office/drawing/2016/5/13/chartex" xmlns:cx8="http://schemas.microsoft.com/office/drawing/2016/5/14/chartex" xmlns:mc="http://schemas.openxmlformats.org/markup-compatibility/2006" xmlns:aink="http://schemas.microsoft.com/office/drawing/2016/ink" xmlns:am3d="http://schemas.microsoft.com/office/drawing/2017/model3d" xmlns:o="urn:schemas-microsoft-com:office:office" xmlns:oel="http://schemas.microsoft.com/office/2019/extlst" xmlns:r="http://schemas.openxmlformats.org/officeDocument/2006/relationships" xmlns:m="http://schemas.openxmlformats.org/officeDocument/2006/math" xmlns:v="urn:schemas-microsoft-com:vml" xmlns:wp14="http://schemas.microsoft.com/office/word/2010/wordprocessingDrawing" xmlns:wp="http://schemas.openxmlformats.org/drawingml/2006/wordprocessingDrawing" xmlns:w10="urn:schemas-microsoft-com:office:word" xmlns:w="http://schemas.openxmlformats.org/wordprocessingml/2006/main" xmlns:w14="http://schemas.microsoft.com/office/word/2010/wordml" xmlns:w15="http://schemas.microsoft.com/office/word/2012/wordml" xmlns:w16cex="http://schemas.microsoft.com/office/word/2018/wordml/cex" xmlns:w16cid="http://schemas.microsoft.com/office/word/2016/wordml/cid" xmlns:w16="http://schemas.microsoft.com/office/word/2018/wordml" xmlns:w16du="http://schemas.microsoft.com/office/word/2023/wordml/word16du" xmlns:w16sdtdh="http://schemas.microsoft.com/office/word/2020/wordml/sdtdatahash" xmlns:w16sdtfl="http://schemas.microsoft.com/office/word/2024/wordml/sdtformatlock" xmlns:w16se="http://schemas.microsoft.com/office/word/2015/wordml/symex" xmlns:wpg="http://schemas.microsoft.com/office/word/2010/wordprocessingGroup" xmlns:wpi="http://schemas.microsoft.com/office/word/2010/wordprocessingInk" xmlns:wne="http://schemas.microsoft.com/office/word/2006/wordml" xmlns:wps="http://schemas.microsoft.com/office/word/2010/wordprocessingShape" mc:Ignorable="w14 w15 w16se w16cid w16 w16cex w16sdtdh w16sdtfl w16du wp14">
+<w:hdr xmlns:wpc="http://schemas.microsoft.com/office/word/2010/wordprocessingCanvas" xmlns:cx="http://schemas.microsoft.com/office/drawing/2014/chartex" xmlns:cx1="http://schemas.microsoft.com/office/drawing/2015/9/8/chartex" xmlns:cx2="http://schemas.microsoft.com/office/drawing/2015/10/21/chartex" xmlns:cx3="http://schemas.microsoft.com/office/drawing/2016/5/9/chartex" xmlns:cx4="http://schemas.microsoft.com/office/drawing/2016/5/10/chartex" xmlns:cx5="http://schemas.microsoft.com/office/drawing/2016/5/11/chartex" xmlns:cx6="http://schemas.microsoft.com/office/drawing/2016/5/12/chartex" xmlns:cx7="http://schemas.microsoft.com/office/drawing/2016/5/13/chartex" xmlns:cx8="http://schemas.microsoft.com/office/drawing/2016/5/14/chartex" xmlns:mc="http://schemas.openxmlformats.org/markup-compatibility/2006" xmlns:aink="http://schemas.microsoft.com/office/drawing/2016/ink" xmlns:am3d="http://schemas.microsoft.com/office/drawing/2017/model3d" xmlns:o="urn:schemas-microsoft-com:office:office" xmlns:oel="http://schemas.microsoft.com/office/2019/extlst" xmlns:r="http://schemas.openxmlformats.org/officeDocument/2006/relationships" xmlns:m="http://schemas.openxmlformats.org/officeDocument/2006/math" xmlns:v="urn:schemas-microsoft-com:vml" xmlns:wp14="http://schemas.microsoft.com/office/word/2010/wordprocessingDrawing" xmlns:wp="http://schemas.openxmlformats.org/drawingml/2006/wordprocessingDrawing" xmlns:w10="urn:schemas-microsoft-com:office:word" xmlns:w="http://schemas.openxmlformats.org/wordprocessingml/2006/main" xmlns:w14="http://schemas.microsoft.com/office/word/2010/wordml" xmlns:w15="http://schemas.microsoft.com/office/word/2012/wordml" xmlns:w16cei="http://schemas.microsoft.com/office/word/2026/wordml/cei" xmlns:w16cex="http://schemas.microsoft.com/office/word/2018/wordml/cex" xmlns:w16cid="http://schemas.microsoft.com/office/word/2016/wordml/cid" xmlns:w16="http://schemas.microsoft.com/office/word/2018/wordml" xmlns:w16du="http://schemas.microsoft.com/office/word/2023/wordml/word16du" xmlns:w16sdtdh="http://schemas.microsoft.com/office/word/2020/wordml/sdtdatahash" xmlns:w16sdtfl="http://schemas.microsoft.com/office/word/2024/wordml/sdtformatlock" xmlns:w16se="http://schemas.microsoft.com/office/word/2015/wordml/symex" xmlns:wpg="http://schemas.microsoft.com/office/word/2010/wordprocessingGroup" xmlns:wpi="http://schemas.microsoft.com/office/word/2010/wordprocessingInk" xmlns:wne="http://schemas.microsoft.com/office/word/2006/wordml" xmlns:wps="http://schemas.microsoft.com/office/word/2010/wordprocessingShape" mc:Ignorable="w14 w15 w16se w16cid w16 w16cex w16sdtdh w16sdtfl w16du wp14">
   <w:p>
     <w:pPr>
-      <w:pStyle w:val="Header"/>
+      <w:pStyle w:val="Koptekst"/>
     </w:pPr>
   </w:p>
 </w:hdr>
 </file>
 
 <file path=word/numbering.xml><?xml version="1.0" encoding="utf-8"?>
-<w:numbering xmlns:wpc="http://schemas.microsoft.com/office/word/2010/wordprocessingCanvas" xmlns:cx="http://schemas.microsoft.com/office/drawing/2014/chartex" xmlns:cx1="http://schemas.microsoft.com/office/drawing/2015/9/8/chartex" xmlns:cx2="http://schemas.microsoft.com/office/drawing/2015/10/21/chartex" xmlns:cx3="http://schemas.microsoft.com/office/drawing/2016/5/9/chartex" xmlns:cx4="http://schemas.microsoft.com/office/drawing/2016/5/10/chartex" xmlns:cx5="http://schemas.microsoft.com/office/drawing/2016/5/11/chartex" xmlns:cx6="http://schemas.microsoft.com/office/drawing/2016/5/12/chartex" xmlns:cx7="http://schemas.microsoft.com/office/drawing/2016/5/13/chartex" xmlns:cx8="http://schemas.microsoft.com/office/drawing/2016/5/14/chartex" xmlns:mc="http://schemas.openxmlformats.org/markup-compatibility/2006" xmlns:aink="http://schemas.microsoft.com/office/drawing/2016/ink" xmlns:am3d="http://schemas.microsoft.com/office/drawing/2017/model3d" xmlns:o="urn:schemas-microsoft-com:office:office" xmlns:oel="http://schemas.microsoft.com/office/2019/extlst" xmlns:r="http://schemas.openxmlformats.org/officeDocument/2006/relationships" xmlns:m="http://schemas.openxmlformats.org/officeDocument/2006/math" xmlns:v="urn:schemas-microsoft-com:vml" xmlns:wp14="http://schemas.microsoft.com/office/word/2010/wordprocessingDrawing" xmlns:wp="http://schemas.openxmlformats.org/drawingml/2006/wordprocessingDrawing" xmlns:w10="urn:schemas-microsoft-com:office:word" xmlns:w="http://schemas.openxmlformats.org/wordprocessingml/2006/main" xmlns:w14="http://schemas.microsoft.com/office/word/2010/wordml" xmlns:w15="http://schemas.microsoft.com/office/word/2012/wordml" xmlns:w16cex="http://schemas.microsoft.com/office/word/2018/wordml/cex" xmlns:w16cid="http://schemas.microsoft.com/office/word/2016/wordml/cid" xmlns:w16="http://schemas.microsoft.com/office/word/2018/wordml" xmlns:w16du="http://schemas.microsoft.com/office/word/2023/wordml/word16du" xmlns:w16sdtdh="http://schemas.microsoft.com/office/word/2020/wordml/sdtdatahash" xmlns:w16sdtfl="http://schemas.microsoft.com/office/word/2024/wordml/sdtformatlock" xmlns:w16se="http://schemas.microsoft.com/office/word/2015/wordml/symex" xmlns:wpg="http://schemas.microsoft.com/office/word/2010/wordprocessingGroup" xmlns:wpi="http://schemas.microsoft.com/office/word/2010/wordprocessingInk" xmlns:wne="http://schemas.microsoft.com/office/word/2006/wordml" xmlns:wps="http://schemas.microsoft.com/office/word/2010/wordprocessingShape" mc:Ignorable="w14 w15 w16se w16cid w16 w16cex w16sdtdh w16sdtfl w16du wp14">
+<w:numbering xmlns:wpc="http://schemas.microsoft.com/office/word/2010/wordprocessingCanvas" xmlns:cx="http://schemas.microsoft.com/office/drawing/2014/chartex" xmlns:cx1="http://schemas.microsoft.com/office/drawing/2015/9/8/chartex" xmlns:cx2="http://schemas.microsoft.com/office/drawing/2015/10/21/chartex" xmlns:cx3="http://schemas.microsoft.com/office/drawing/2016/5/9/chartex" xmlns:cx4="http://schemas.microsoft.com/office/drawing/2016/5/10/chartex" xmlns:cx5="http://schemas.microsoft.com/office/drawing/2016/5/11/chartex" xmlns:cx6="http://schemas.microsoft.com/office/drawing/2016/5/12/chartex" xmlns:cx7="http://schemas.microsoft.com/office/drawing/2016/5/13/chartex" xmlns:cx8="http://schemas.microsoft.com/office/drawing/2016/5/14/chartex" xmlns:mc="http://schemas.openxmlformats.org/markup-compatibility/2006" xmlns:aink="http://schemas.microsoft.com/office/drawing/2016/ink" xmlns:am3d="http://schemas.microsoft.com/office/drawing/2017/model3d" xmlns:o="urn:schemas-microsoft-com:office:office" xmlns:oel="http://schemas.microsoft.com/office/2019/extlst" xmlns:r="http://schemas.openxmlformats.org/officeDocument/2006/relationships" xmlns:m="http://schemas.openxmlformats.org/officeDocument/2006/math" xmlns:v="urn:schemas-microsoft-com:vml" xmlns:wp14="http://schemas.microsoft.com/office/word/2010/wordprocessingDrawing" xmlns:wp="http://schemas.openxmlformats.org/drawingml/2006/wordprocessingDrawing" xmlns:w10="urn:schemas-microsoft-com:office:word" xmlns:w="http://schemas.openxmlformats.org/wordprocessingml/2006/main" xmlns:w14="http://schemas.microsoft.com/office/word/2010/wordml" xmlns:w15="http://schemas.microsoft.com/office/word/2012/wordml" xmlns:w16cei="http://schemas.microsoft.com/office/word/2026/wordml/cei" xmlns:w16cex="http://schemas.microsoft.com/office/word/2018/wordml/cex" xmlns:w16cid="http://schemas.microsoft.com/office/word/2016/wordml/cid" xmlns:w16="http://schemas.microsoft.com/office/word/2018/wordml" xmlns:w16du="http://schemas.microsoft.com/office/word/2023/wordml/word16du" xmlns:w16sdtdh="http://schemas.microsoft.com/office/word/2020/wordml/sdtdatahash" xmlns:w16sdtfl="http://schemas.microsoft.com/office/word/2024/wordml/sdtformatlock" xmlns:w16se="http://schemas.microsoft.com/office/word/2015/wordml/symex" xmlns:wpg="http://schemas.microsoft.com/office/word/2010/wordprocessingGroup" xmlns:wpi="http://schemas.microsoft.com/office/word/2010/wordprocessingInk" xmlns:wne="http://schemas.microsoft.com/office/word/2006/wordml" xmlns:wps="http://schemas.microsoft.com/office/word/2010/wordprocessingShape" mc:Ignorable="w14 w15 w16se w16cid w16 w16cex w16sdtdh w16sdtfl w16du wp14">
   <w:abstractNum w:abstractNumId="0" w15:restartNumberingAfterBreak="0">
+    <w:nsid w:val="308B0DDF"/>
+    <w:multiLevelType w:val="multilevel"/>
+    <w:tmpl w:val="B712BA32"/>
+    <w:lvl w:ilvl="0">
+      <w:start w:val="1"/>
+      <w:numFmt w:val="bullet"/>
+      <w:lvlText w:val=""/>
+      <w:lvlJc w:val="left"/>
+      <w:pPr>
+        <w:tabs>
+          <w:tab w:val="num" w:pos="720"/>
+        </w:tabs>
+        <w:ind w:left="720" w:hanging="360"/>
+      </w:pPr>
+      <w:rPr>
+        <w:rFonts w:ascii="Symbol" w:hAnsi="Symbol" w:hint="default"/>
+        <w:sz w:val="20"/>
+      </w:rPr>
+    </w:lvl>
+    <w:lvl w:ilvl="1">
+      <w:start w:val="1"/>
+      <w:numFmt w:val="bullet"/>
+      <w:lvlText w:val="o"/>
+      <w:lvlJc w:val="left"/>
+      <w:pPr>
+        <w:tabs>
+          <w:tab w:val="num" w:pos="1440"/>
+        </w:tabs>
+        <w:ind w:left="1440" w:hanging="360"/>
+      </w:pPr>
+      <w:rPr>
+        <w:rFonts w:ascii="Courier New" w:hAnsi="Courier New" w:cs="Times New Roman" w:hint="default"/>
+        <w:sz w:val="20"/>
+      </w:rPr>
+    </w:lvl>
+    <w:lvl w:ilvl="2">
+      <w:start w:val="1"/>
+      <w:numFmt w:val="bullet"/>
+      <w:lvlText w:val=""/>
+      <w:lvlJc w:val="left"/>
+      <w:pPr>
+        <w:tabs>
+          <w:tab w:val="num" w:pos="2160"/>
+        </w:tabs>
+        <w:ind w:left="2160" w:hanging="360"/>
+      </w:pPr>
+      <w:rPr>
+        <w:rFonts w:ascii="Wingdings" w:hAnsi="Wingdings" w:hint="default"/>
+        <w:sz w:val="20"/>
+      </w:rPr>
+    </w:lvl>
+    <w:lvl w:ilvl="3">
+      <w:start w:val="1"/>
+      <w:numFmt w:val="bullet"/>
+      <w:lvlText w:val=""/>
+      <w:lvlJc w:val="left"/>
+      <w:pPr>
+        <w:tabs>
+          <w:tab w:val="num" w:pos="2880"/>
+        </w:tabs>
+        <w:ind w:left="2880" w:hanging="360"/>
+      </w:pPr>
+      <w:rPr>
+        <w:rFonts w:ascii="Wingdings" w:hAnsi="Wingdings" w:hint="default"/>
+        <w:sz w:val="20"/>
+      </w:rPr>
+    </w:lvl>
+    <w:lvl w:ilvl="4">
+      <w:start w:val="1"/>
+      <w:numFmt w:val="bullet"/>
+      <w:lvlText w:val=""/>
+      <w:lvlJc w:val="left"/>
+      <w:pPr>
+        <w:tabs>
+          <w:tab w:val="num" w:pos="3600"/>
+        </w:tabs>
+        <w:ind w:left="3600" w:hanging="360"/>
+      </w:pPr>
+      <w:rPr>
+        <w:rFonts w:ascii="Wingdings" w:hAnsi="Wingdings" w:hint="default"/>
+        <w:sz w:val="20"/>
+      </w:rPr>
+    </w:lvl>
+    <w:lvl w:ilvl="5">
+      <w:start w:val="1"/>
+      <w:numFmt w:val="bullet"/>
+      <w:lvlText w:val=""/>
+      <w:lvlJc w:val="left"/>
+      <w:pPr>
+        <w:tabs>
+          <w:tab w:val="num" w:pos="4320"/>
+        </w:tabs>
+        <w:ind w:left="4320" w:hanging="360"/>
+      </w:pPr>
+      <w:rPr>
+        <w:rFonts w:ascii="Wingdings" w:hAnsi="Wingdings" w:hint="default"/>
+        <w:sz w:val="20"/>
+      </w:rPr>
+    </w:lvl>
+    <w:lvl w:ilvl="6">
+      <w:start w:val="1"/>
+      <w:numFmt w:val="bullet"/>
+      <w:lvlText w:val=""/>
+      <w:lvlJc w:val="left"/>
+      <w:pPr>
+        <w:tabs>
+          <w:tab w:val="num" w:pos="5040"/>
+        </w:tabs>
+        <w:ind w:left="5040" w:hanging="360"/>
+      </w:pPr>
+      <w:rPr>
+        <w:rFonts w:ascii="Wingdings" w:hAnsi="Wingdings" w:hint="default"/>
+        <w:sz w:val="20"/>
+      </w:rPr>
+    </w:lvl>
+    <w:lvl w:ilvl="7">
+      <w:start w:val="1"/>
+      <w:numFmt w:val="bullet"/>
+      <w:lvlText w:val=""/>
+      <w:lvlJc w:val="left"/>
+      <w:pPr>
+        <w:tabs>
+          <w:tab w:val="num" w:pos="5760"/>
+        </w:tabs>
+        <w:ind w:left="5760" w:hanging="360"/>
+      </w:pPr>
+      <w:rPr>
+        <w:rFonts w:ascii="Wingdings" w:hAnsi="Wingdings" w:hint="default"/>
+        <w:sz w:val="20"/>
+      </w:rPr>
+    </w:lvl>
+    <w:lvl w:ilvl="8">
+      <w:start w:val="1"/>
+      <w:numFmt w:val="bullet"/>
+      <w:lvlText w:val=""/>
+      <w:lvlJc w:val="left"/>
+      <w:pPr>
+        <w:tabs>
+          <w:tab w:val="num" w:pos="6480"/>
+        </w:tabs>
+        <w:ind w:left="6480" w:hanging="360"/>
+      </w:pPr>
+      <w:rPr>
+        <w:rFonts w:ascii="Wingdings" w:hAnsi="Wingdings" w:hint="default"/>
+        <w:sz w:val="20"/>
+      </w:rPr>
+    </w:lvl>
+  </w:abstractNum>
+  <w:abstractNum w:abstractNumId="1" w15:restartNumberingAfterBreak="0">
     <w:nsid w:val="516D0CF6"/>
     <w:multiLevelType w:val="hybridMultilevel"/>
     <w:tmpl w:val="2E443618"/>
@@ -2925,7 +2371,7 @@
       </w:pPr>
     </w:lvl>
   </w:abstractNum>
-  <w:abstractNum w:abstractNumId="1" w15:restartNumberingAfterBreak="0">
+  <w:abstractNum w:abstractNumId="2" w15:restartNumberingAfterBreak="0">
     <w:nsid w:val="738456F7"/>
     <w:multiLevelType w:val="multilevel"/>
     <w:tmpl w:val="13D41B5E"/>
@@ -2941,7 +2387,7 @@
         <w:ind w:left="720" w:hanging="360"/>
       </w:pPr>
       <w:rPr>
-        <w:rFonts w:hint="default" w:ascii="Symbol" w:hAnsi="Symbol"/>
+        <w:rFonts w:ascii="Symbol" w:hAnsi="Symbol" w:hint="default"/>
         <w:sz w:val="20"/>
       </w:rPr>
     </w:lvl>
@@ -2974,7 +2420,7 @@
         <w:ind w:left="2160" w:hanging="360"/>
       </w:pPr>
       <w:rPr>
-        <w:rFonts w:hint="default" w:ascii="Wingdings" w:hAnsi="Wingdings"/>
+        <w:rFonts w:ascii="Wingdings" w:hAnsi="Wingdings" w:hint="default"/>
         <w:sz w:val="20"/>
       </w:rPr>
     </w:lvl>
@@ -2990,7 +2436,7 @@
         <w:ind w:left="2880" w:hanging="360"/>
       </w:pPr>
       <w:rPr>
-        <w:rFonts w:hint="default" w:ascii="Wingdings" w:hAnsi="Wingdings"/>
+        <w:rFonts w:ascii="Wingdings" w:hAnsi="Wingdings" w:hint="default"/>
         <w:sz w:val="20"/>
       </w:rPr>
     </w:lvl>
@@ -3006,7 +2452,7 @@
         <w:ind w:left="3600" w:hanging="360"/>
       </w:pPr>
       <w:rPr>
-        <w:rFonts w:hint="default" w:ascii="Wingdings" w:hAnsi="Wingdings"/>
+        <w:rFonts w:ascii="Wingdings" w:hAnsi="Wingdings" w:hint="default"/>
         <w:sz w:val="20"/>
       </w:rPr>
     </w:lvl>
@@ -3022,7 +2468,7 @@
         <w:ind w:left="4320" w:hanging="360"/>
       </w:pPr>
       <w:rPr>
-        <w:rFonts w:hint="default" w:ascii="Wingdings" w:hAnsi="Wingdings"/>
+        <w:rFonts w:ascii="Wingdings" w:hAnsi="Wingdings" w:hint="default"/>
         <w:sz w:val="20"/>
       </w:rPr>
     </w:lvl>
@@ -3038,7 +2484,7 @@
         <w:ind w:left="5040" w:hanging="360"/>
       </w:pPr>
       <w:rPr>
-        <w:rFonts w:hint="default" w:ascii="Wingdings" w:hAnsi="Wingdings"/>
+        <w:rFonts w:ascii="Wingdings" w:hAnsi="Wingdings" w:hint="default"/>
         <w:sz w:val="20"/>
       </w:rPr>
     </w:lvl>
@@ -3054,7 +2500,7 @@
         <w:ind w:left="5760" w:hanging="360"/>
       </w:pPr>
       <w:rPr>
-        <w:rFonts w:hint="default" w:ascii="Wingdings" w:hAnsi="Wingdings"/>
+        <w:rFonts w:ascii="Wingdings" w:hAnsi="Wingdings" w:hint="default"/>
         <w:sz w:val="20"/>
       </w:rPr>
     </w:lvl>
@@ -3070,26 +2516,38 @@
         <w:ind w:left="6480" w:hanging="360"/>
       </w:pPr>
       <w:rPr>
-        <w:rFonts w:hint="default" w:ascii="Wingdings" w:hAnsi="Wingdings"/>
+        <w:rFonts w:ascii="Wingdings" w:hAnsi="Wingdings" w:hint="default"/>
         <w:sz w:val="20"/>
       </w:rPr>
     </w:lvl>
   </w:abstractNum>
   <w:num w:numId="1" w16cid:durableId="1794711100">
-    <w:abstractNumId w:val="0"/>
+    <w:abstractNumId w:val="1"/>
   </w:num>
   <w:num w:numId="2" w16cid:durableId="58946002">
-    <w:abstractNumId w:val="1"/>
+    <w:abstractNumId w:val="2"/>
+  </w:num>
+  <w:num w:numId="3" w16cid:durableId="1134520091">
+    <w:abstractNumId w:val="0"/>
+    <w:lvlOverride w:ilvl="0"/>
+    <w:lvlOverride w:ilvl="1"/>
+    <w:lvlOverride w:ilvl="2"/>
+    <w:lvlOverride w:ilvl="3"/>
+    <w:lvlOverride w:ilvl="4"/>
+    <w:lvlOverride w:ilvl="5"/>
+    <w:lvlOverride w:ilvl="6"/>
+    <w:lvlOverride w:ilvl="7"/>
+    <w:lvlOverride w:ilvl="8"/>
   </w:num>
 </w:numbering>
 </file>
 
 <file path=word/styles.xml><?xml version="1.0" encoding="utf-8"?>
-<w:styles xmlns:wp14="http://schemas.microsoft.com/office/word/2010/wordprocessingDrawing" xmlns:mc="http://schemas.openxmlformats.org/markup-compatibility/2006" xmlns:r="http://schemas.openxmlformats.org/officeDocument/2006/relationships" xmlns:w="http://schemas.openxmlformats.org/wordprocessingml/2006/main" xmlns:w14="http://schemas.microsoft.com/office/word/2010/wordml" xmlns:w15="http://schemas.microsoft.com/office/word/2012/wordml" xmlns:w16cex="http://schemas.microsoft.com/office/word/2018/wordml/cex" xmlns:w16cid="http://schemas.microsoft.com/office/word/2016/wordml/cid" xmlns:w16="http://schemas.microsoft.com/office/word/2018/wordml" xmlns:w16du="http://schemas.microsoft.com/office/word/2023/wordml/word16du" xmlns:w16sdtdh="http://schemas.microsoft.com/office/word/2020/wordml/sdtdatahash" xmlns:w16sdtfl="http://schemas.microsoft.com/office/word/2024/wordml/sdtformatlock" xmlns:w16se="http://schemas.microsoft.com/office/word/2015/wordml/symex" mc:Ignorable="w14 w15 w16se w16cid w16 w16cex w16sdtdh w16sdtfl w16du wp14">
+<w:styles xmlns:mc="http://schemas.openxmlformats.org/markup-compatibility/2006" xmlns:r="http://schemas.openxmlformats.org/officeDocument/2006/relationships" xmlns:w="http://schemas.openxmlformats.org/wordprocessingml/2006/main" xmlns:w14="http://schemas.microsoft.com/office/word/2010/wordml" xmlns:w15="http://schemas.microsoft.com/office/word/2012/wordml" xmlns:w16cex="http://schemas.microsoft.com/office/word/2018/wordml/cex" xmlns:w16cid="http://schemas.microsoft.com/office/word/2016/wordml/cid" xmlns:w16="http://schemas.microsoft.com/office/word/2018/wordml" xmlns:w16du="http://schemas.microsoft.com/office/word/2023/wordml/word16du" xmlns:w16sdtdh="http://schemas.microsoft.com/office/word/2020/wordml/sdtdatahash" xmlns:w16sdtfl="http://schemas.microsoft.com/office/word/2024/wordml/sdtformatlock" xmlns:w16se="http://schemas.microsoft.com/office/word/2015/wordml/symex" mc:Ignorable="w14 w15 w16se w16cid w16 w16cex w16sdtdh w16sdtfl w16du">
   <w:docDefaults>
     <w:rPrDefault>
       <w:rPr>
-        <w:rFonts w:asciiTheme="minorHAnsi" w:hAnsiTheme="minorHAnsi" w:eastAsiaTheme="minorHAnsi" w:cstheme="minorBidi"/>
+        <w:rFonts w:asciiTheme="minorHAnsi" w:eastAsiaTheme="minorHAnsi" w:hAnsiTheme="minorHAnsi" w:cstheme="minorBidi"/>
         <w:kern w:val="2"/>
         <w:sz w:val="24"/>
         <w:szCs w:val="24"/>
@@ -3106,14 +2564,14 @@
   <w:latentStyles w:defLockedState="0" w:defUIPriority="99" w:defSemiHidden="0" w:defUnhideWhenUsed="0" w:defQFormat="0" w:count="376">
     <w:lsdException w:name="Normal" w:uiPriority="0" w:qFormat="1"/>
     <w:lsdException w:name="heading 1" w:uiPriority="9" w:qFormat="1"/>
-    <w:lsdException w:name="heading 2" w:uiPriority="9" w:semiHidden="1" w:unhideWhenUsed="1" w:qFormat="1"/>
-    <w:lsdException w:name="heading 3" w:uiPriority="9" w:semiHidden="1" w:unhideWhenUsed="1" w:qFormat="1"/>
-    <w:lsdException w:name="heading 4" w:uiPriority="9" w:semiHidden="1" w:unhideWhenUsed="1" w:qFormat="1"/>
-    <w:lsdException w:name="heading 5" w:uiPriority="9" w:semiHidden="1" w:unhideWhenUsed="1" w:qFormat="1"/>
-    <w:lsdException w:name="heading 6" w:uiPriority="9" w:semiHidden="1" w:unhideWhenUsed="1" w:qFormat="1"/>
-    <w:lsdException w:name="heading 7" w:uiPriority="9" w:semiHidden="1" w:unhideWhenUsed="1" w:qFormat="1"/>
-    <w:lsdException w:name="heading 8" w:uiPriority="9" w:semiHidden="1" w:unhideWhenUsed="1" w:qFormat="1"/>
-    <w:lsdException w:name="heading 9" w:uiPriority="9" w:semiHidden="1" w:unhideWhenUsed="1" w:qFormat="1"/>
+    <w:lsdException w:name="heading 2" w:semiHidden="1" w:uiPriority="9" w:unhideWhenUsed="1" w:qFormat="1"/>
+    <w:lsdException w:name="heading 3" w:semiHidden="1" w:uiPriority="9" w:unhideWhenUsed="1" w:qFormat="1"/>
+    <w:lsdException w:name="heading 4" w:semiHidden="1" w:uiPriority="9" w:unhideWhenUsed="1" w:qFormat="1"/>
+    <w:lsdException w:name="heading 5" w:semiHidden="1" w:uiPriority="9" w:unhideWhenUsed="1" w:qFormat="1"/>
+    <w:lsdException w:name="heading 6" w:semiHidden="1" w:uiPriority="9" w:unhideWhenUsed="1" w:qFormat="1"/>
+    <w:lsdException w:name="heading 7" w:semiHidden="1" w:uiPriority="9" w:unhideWhenUsed="1" w:qFormat="1"/>
+    <w:lsdException w:name="heading 8" w:semiHidden="1" w:uiPriority="9" w:unhideWhenUsed="1" w:qFormat="1"/>
+    <w:lsdException w:name="heading 9" w:semiHidden="1" w:uiPriority="9" w:unhideWhenUsed="1" w:qFormat="1"/>
     <w:lsdException w:name="index 1" w:semiHidden="1" w:unhideWhenUsed="1"/>
     <w:lsdException w:name="index 2" w:semiHidden="1" w:unhideWhenUsed="1"/>
     <w:lsdException w:name="index 3" w:semiHidden="1" w:unhideWhenUsed="1"/>
@@ -3123,22 +2581,22 @@
     <w:lsdException w:name="index 7" w:semiHidden="1" w:unhideWhenUsed="1"/>
     <w:lsdException w:name="index 8" w:semiHidden="1" w:unhideWhenUsed="1"/>
     <w:lsdException w:name="index 9" w:semiHidden="1" w:unhideWhenUsed="1"/>
-    <w:lsdException w:name="toc 1" w:uiPriority="39" w:semiHidden="1" w:unhideWhenUsed="1"/>
-    <w:lsdException w:name="toc 2" w:uiPriority="39" w:semiHidden="1" w:unhideWhenUsed="1"/>
-    <w:lsdException w:name="toc 3" w:uiPriority="39" w:semiHidden="1" w:unhideWhenUsed="1"/>
-    <w:lsdException w:name="toc 4" w:uiPriority="39" w:semiHidden="1" w:unhideWhenUsed="1"/>
-    <w:lsdException w:name="toc 5" w:uiPriority="39" w:semiHidden="1" w:unhideWhenUsed="1"/>
-    <w:lsdException w:name="toc 6" w:uiPriority="39" w:semiHidden="1" w:unhideWhenUsed="1"/>
-    <w:lsdException w:name="toc 7" w:uiPriority="39" w:semiHidden="1" w:unhideWhenUsed="1"/>
-    <w:lsdException w:name="toc 8" w:uiPriority="39" w:semiHidden="1" w:unhideWhenUsed="1"/>
-    <w:lsdException w:name="toc 9" w:uiPriority="39" w:semiHidden="1" w:unhideWhenUsed="1"/>
+    <w:lsdException w:name="toc 1" w:semiHidden="1" w:uiPriority="39" w:unhideWhenUsed="1"/>
+    <w:lsdException w:name="toc 2" w:semiHidden="1" w:uiPriority="39" w:unhideWhenUsed="1"/>
+    <w:lsdException w:name="toc 3" w:semiHidden="1" w:uiPriority="39" w:unhideWhenUsed="1"/>
+    <w:lsdException w:name="toc 4" w:semiHidden="1" w:uiPriority="39" w:unhideWhenUsed="1"/>
+    <w:lsdException w:name="toc 5" w:semiHidden="1" w:uiPriority="39" w:unhideWhenUsed="1"/>
+    <w:lsdException w:name="toc 6" w:semiHidden="1" w:uiPriority="39" w:unhideWhenUsed="1"/>
+    <w:lsdException w:name="toc 7" w:semiHidden="1" w:uiPriority="39" w:unhideWhenUsed="1"/>
+    <w:lsdException w:name="toc 8" w:semiHidden="1" w:uiPriority="39" w:unhideWhenUsed="1"/>
+    <w:lsdException w:name="toc 9" w:semiHidden="1" w:uiPriority="39" w:unhideWhenUsed="1"/>
     <w:lsdException w:name="Normal Indent" w:semiHidden="1" w:unhideWhenUsed="1"/>
     <w:lsdException w:name="footnote text" w:semiHidden="1" w:unhideWhenUsed="1"/>
     <w:lsdException w:name="annotation text" w:semiHidden="1" w:unhideWhenUsed="1"/>
     <w:lsdException w:name="header" w:semiHidden="1" w:unhideWhenUsed="1"/>
     <w:lsdException w:name="footer" w:semiHidden="1" w:unhideWhenUsed="1"/>
     <w:lsdException w:name="index heading" w:semiHidden="1" w:unhideWhenUsed="1"/>
-    <w:lsdException w:name="caption" w:uiPriority="35" w:semiHidden="1" w:unhideWhenUsed="1" w:qFormat="1"/>
+    <w:lsdException w:name="caption" w:semiHidden="1" w:uiPriority="35" w:unhideWhenUsed="1" w:qFormat="1"/>
     <w:lsdException w:name="table of figures" w:semiHidden="1" w:unhideWhenUsed="1"/>
     <w:lsdException w:name="envelope address" w:semiHidden="1" w:unhideWhenUsed="1"/>
     <w:lsdException w:name="envelope return" w:semiHidden="1" w:unhideWhenUsed="1"/>
@@ -3169,7 +2627,7 @@
     <w:lsdException w:name="Title" w:uiPriority="10" w:qFormat="1"/>
     <w:lsdException w:name="Closing" w:semiHidden="1" w:unhideWhenUsed="1"/>
     <w:lsdException w:name="Signature" w:semiHidden="1" w:unhideWhenUsed="1"/>
-    <w:lsdException w:name="Default Paragraph Font" w:uiPriority="1" w:semiHidden="1" w:unhideWhenUsed="1"/>
+    <w:lsdException w:name="Default Paragraph Font" w:semiHidden="1" w:uiPriority="1" w:unhideWhenUsed="1"/>
     <w:lsdException w:name="Body Text" w:semiHidden="1" w:unhideWhenUsed="1"/>
     <w:lsdException w:name="Body Text Indent" w:semiHidden="1" w:unhideWhenUsed="1"/>
     <w:lsdException w:name="List Continue" w:semiHidden="1" w:unhideWhenUsed="1"/>
@@ -3369,8 +2827,8 @@
     <w:lsdException w:name="Subtle Reference" w:uiPriority="31" w:qFormat="1"/>
     <w:lsdException w:name="Intense Reference" w:uiPriority="32" w:qFormat="1"/>
     <w:lsdException w:name="Book Title" w:uiPriority="33" w:qFormat="1"/>
-    <w:lsdException w:name="Bibliography" w:uiPriority="37" w:semiHidden="1" w:unhideWhenUsed="1"/>
-    <w:lsdException w:name="TOC Heading" w:uiPriority="39" w:semiHidden="1" w:unhideWhenUsed="1" w:qFormat="1"/>
+    <w:lsdException w:name="Bibliography" w:semiHidden="1" w:uiPriority="37" w:unhideWhenUsed="1"/>
+    <w:lsdException w:name="TOC Heading" w:semiHidden="1" w:uiPriority="39" w:unhideWhenUsed="1" w:qFormat="1"/>
     <w:lsdException w:name="Plain Table 1" w:uiPriority="41"/>
     <w:lsdException w:name="Plain Table 2" w:uiPriority="42"/>
     <w:lsdException w:name="Plain Table 3" w:uiPriority="43"/>
@@ -3481,7 +2939,7 @@
     <w:lsdException w:name="Unresolved Mention" w:semiHidden="1" w:unhideWhenUsed="1"/>
     <w:lsdException w:name="Smart Link" w:semiHidden="1" w:unhideWhenUsed="1"/>
   </w:latentStyles>
-  <w:style w:type="paragraph" w:styleId="Normal" w:default="1">
+  <w:style w:type="paragraph" w:default="1" w:styleId="Standaard">
     <w:name w:val="Normal"/>
     <w:qFormat/>
     <w:rsid w:val="00C22F06"/>
@@ -3489,16 +2947,16 @@
       <w:spacing w:line="259" w:lineRule="auto"/>
     </w:pPr>
     <w:rPr>
-      <w:rFonts w:ascii="Arial" w:hAnsi="Arial" w:eastAsia="Arial" w:cs="Arial"/>
+      <w:rFonts w:ascii="Arial" w:eastAsia="Arial" w:hAnsi="Arial" w:cs="Arial"/>
       <w:sz w:val="22"/>
       <w:szCs w:val="22"/>
     </w:rPr>
   </w:style>
-  <w:style w:type="paragraph" w:styleId="Heading1">
+  <w:style w:type="paragraph" w:styleId="Kop1">
     <w:name w:val="heading 1"/>
-    <w:basedOn w:val="Normal"/>
-    <w:next w:val="Normal"/>
-    <w:link w:val="Heading1Char"/>
+    <w:basedOn w:val="Standaard"/>
+    <w:next w:val="Standaard"/>
+    <w:link w:val="Kop1Char"/>
     <w:uiPriority w:val="9"/>
     <w:qFormat/>
     <w:rsid w:val="003539DF"/>
@@ -3509,17 +2967,17 @@
       <w:outlineLvl w:val="0"/>
     </w:pPr>
     <w:rPr>
-      <w:rFonts w:asciiTheme="majorHAnsi" w:hAnsiTheme="majorHAnsi" w:eastAsiaTheme="majorEastAsia" w:cstheme="majorBidi"/>
+      <w:rFonts w:asciiTheme="majorHAnsi" w:eastAsiaTheme="majorEastAsia" w:hAnsiTheme="majorHAnsi" w:cstheme="majorBidi"/>
       <w:color w:val="0F4761" w:themeColor="accent1" w:themeShade="BF"/>
       <w:sz w:val="40"/>
       <w:szCs w:val="40"/>
     </w:rPr>
   </w:style>
-  <w:style w:type="paragraph" w:styleId="Heading2">
+  <w:style w:type="paragraph" w:styleId="Kop2">
     <w:name w:val="heading 2"/>
-    <w:basedOn w:val="Normal"/>
-    <w:next w:val="Normal"/>
-    <w:link w:val="Heading2Char"/>
+    <w:basedOn w:val="Standaard"/>
+    <w:next w:val="Standaard"/>
+    <w:link w:val="Kop2Char"/>
     <w:uiPriority w:val="9"/>
     <w:semiHidden/>
     <w:unhideWhenUsed/>
@@ -3532,17 +2990,17 @@
       <w:outlineLvl w:val="1"/>
     </w:pPr>
     <w:rPr>
-      <w:rFonts w:asciiTheme="majorHAnsi" w:hAnsiTheme="majorHAnsi" w:eastAsiaTheme="majorEastAsia" w:cstheme="majorBidi"/>
+      <w:rFonts w:asciiTheme="majorHAnsi" w:eastAsiaTheme="majorEastAsia" w:hAnsiTheme="majorHAnsi" w:cstheme="majorBidi"/>
       <w:color w:val="0F4761" w:themeColor="accent1" w:themeShade="BF"/>
       <w:sz w:val="32"/>
       <w:szCs w:val="32"/>
     </w:rPr>
   </w:style>
-  <w:style w:type="paragraph" w:styleId="Heading3">
+  <w:style w:type="paragraph" w:styleId="Kop3">
     <w:name w:val="heading 3"/>
-    <w:basedOn w:val="Normal"/>
-    <w:next w:val="Normal"/>
-    <w:link w:val="Heading3Char"/>
+    <w:basedOn w:val="Standaard"/>
+    <w:next w:val="Standaard"/>
+    <w:link w:val="Kop3Char"/>
     <w:uiPriority w:val="9"/>
     <w:semiHidden/>
     <w:unhideWhenUsed/>
@@ -3561,11 +3019,11 @@
       <w:szCs w:val="28"/>
     </w:rPr>
   </w:style>
-  <w:style w:type="paragraph" w:styleId="Heading4">
+  <w:style w:type="paragraph" w:styleId="Kop4">
     <w:name w:val="heading 4"/>
-    <w:basedOn w:val="Normal"/>
-    <w:next w:val="Normal"/>
-    <w:link w:val="Heading4Char"/>
+    <w:basedOn w:val="Standaard"/>
+    <w:next w:val="Standaard"/>
+    <w:link w:val="Kop4Char"/>
     <w:uiPriority w:val="9"/>
     <w:semiHidden/>
     <w:unhideWhenUsed/>
@@ -3584,11 +3042,11 @@
       <w:color w:val="0F4761" w:themeColor="accent1" w:themeShade="BF"/>
     </w:rPr>
   </w:style>
-  <w:style w:type="paragraph" w:styleId="Heading5">
+  <w:style w:type="paragraph" w:styleId="Kop5">
     <w:name w:val="heading 5"/>
-    <w:basedOn w:val="Normal"/>
-    <w:next w:val="Normal"/>
-    <w:link w:val="Heading5Char"/>
+    <w:basedOn w:val="Standaard"/>
+    <w:next w:val="Standaard"/>
+    <w:link w:val="Kop5Char"/>
     <w:uiPriority w:val="9"/>
     <w:semiHidden/>
     <w:unhideWhenUsed/>
@@ -3605,11 +3063,11 @@
       <w:color w:val="0F4761" w:themeColor="accent1" w:themeShade="BF"/>
     </w:rPr>
   </w:style>
-  <w:style w:type="paragraph" w:styleId="Heading6">
+  <w:style w:type="paragraph" w:styleId="Kop6">
     <w:name w:val="heading 6"/>
-    <w:basedOn w:val="Normal"/>
-    <w:next w:val="Normal"/>
-    <w:link w:val="Heading6Char"/>
+    <w:basedOn w:val="Standaard"/>
+    <w:next w:val="Standaard"/>
+    <w:link w:val="Kop6Char"/>
     <w:uiPriority w:val="9"/>
     <w:semiHidden/>
     <w:unhideWhenUsed/>
@@ -3628,11 +3086,11 @@
       <w:color w:val="595959" w:themeColor="text1" w:themeTint="A6"/>
     </w:rPr>
   </w:style>
-  <w:style w:type="paragraph" w:styleId="Heading7">
+  <w:style w:type="paragraph" w:styleId="Kop7">
     <w:name w:val="heading 7"/>
-    <w:basedOn w:val="Normal"/>
-    <w:next w:val="Normal"/>
-    <w:link w:val="Heading7Char"/>
+    <w:basedOn w:val="Standaard"/>
+    <w:next w:val="Standaard"/>
+    <w:link w:val="Kop7Char"/>
     <w:uiPriority w:val="9"/>
     <w:semiHidden/>
     <w:unhideWhenUsed/>
@@ -3649,11 +3107,11 @@
       <w:color w:val="595959" w:themeColor="text1" w:themeTint="A6"/>
     </w:rPr>
   </w:style>
-  <w:style w:type="paragraph" w:styleId="Heading8">
+  <w:style w:type="paragraph" w:styleId="Kop8">
     <w:name w:val="heading 8"/>
-    <w:basedOn w:val="Normal"/>
-    <w:next w:val="Normal"/>
-    <w:link w:val="Heading8Char"/>
+    <w:basedOn w:val="Standaard"/>
+    <w:next w:val="Standaard"/>
+    <w:link w:val="Kop8Char"/>
     <w:uiPriority w:val="9"/>
     <w:semiHidden/>
     <w:unhideWhenUsed/>
@@ -3672,11 +3130,11 @@
       <w:color w:val="272727" w:themeColor="text1" w:themeTint="D8"/>
     </w:rPr>
   </w:style>
-  <w:style w:type="paragraph" w:styleId="Heading9">
+  <w:style w:type="paragraph" w:styleId="Kop9">
     <w:name w:val="heading 9"/>
-    <w:basedOn w:val="Normal"/>
-    <w:next w:val="Normal"/>
-    <w:link w:val="Heading9Char"/>
+    <w:basedOn w:val="Standaard"/>
+    <w:next w:val="Standaard"/>
+    <w:link w:val="Kop9Char"/>
     <w:uiPriority w:val="9"/>
     <w:semiHidden/>
     <w:unhideWhenUsed/>
@@ -3693,13 +3151,13 @@
       <w:color w:val="272727" w:themeColor="text1" w:themeTint="D8"/>
     </w:rPr>
   </w:style>
-  <w:style w:type="character" w:styleId="DefaultParagraphFont" w:default="1">
+  <w:style w:type="character" w:default="1" w:styleId="Standaardalinea-lettertype">
     <w:name w:val="Default Paragraph Font"/>
     <w:uiPriority w:val="1"/>
     <w:semiHidden/>
     <w:unhideWhenUsed/>
   </w:style>
-  <w:style w:type="table" w:styleId="TableNormal" w:default="1">
+  <w:style w:type="table" w:default="1" w:styleId="Standaardtabel">
     <w:name w:val="Normal Table"/>
     <w:uiPriority w:val="99"/>
     <w:semiHidden/>
@@ -3714,43 +3172,43 @@
       </w:tblCellMar>
     </w:tblPr>
   </w:style>
-  <w:style w:type="numbering" w:styleId="NoList" w:default="1">
+  <w:style w:type="numbering" w:default="1" w:styleId="Geenlijst">
     <w:name w:val="No List"/>
     <w:uiPriority w:val="99"/>
     <w:semiHidden/>
     <w:unhideWhenUsed/>
   </w:style>
-  <w:style w:type="character" w:styleId="Heading1Char" w:customStyle="1">
-    <w:name w:val="Heading 1 Char"/>
-    <w:basedOn w:val="DefaultParagraphFont"/>
-    <w:link w:val="Heading1"/>
+  <w:style w:type="character" w:customStyle="1" w:styleId="Kop1Char">
+    <w:name w:val="Kop 1 Char"/>
+    <w:basedOn w:val="Standaardalinea-lettertype"/>
+    <w:link w:val="Kop1"/>
     <w:uiPriority w:val="9"/>
     <w:rsid w:val="003539DF"/>
     <w:rPr>
-      <w:rFonts w:asciiTheme="majorHAnsi" w:hAnsiTheme="majorHAnsi" w:eastAsiaTheme="majorEastAsia" w:cstheme="majorBidi"/>
+      <w:rFonts w:asciiTheme="majorHAnsi" w:eastAsiaTheme="majorEastAsia" w:hAnsiTheme="majorHAnsi" w:cstheme="majorBidi"/>
       <w:color w:val="0F4761" w:themeColor="accent1" w:themeShade="BF"/>
       <w:sz w:val="40"/>
       <w:szCs w:val="40"/>
     </w:rPr>
   </w:style>
-  <w:style w:type="character" w:styleId="Heading2Char" w:customStyle="1">
-    <w:name w:val="Heading 2 Char"/>
-    <w:basedOn w:val="DefaultParagraphFont"/>
-    <w:link w:val="Heading2"/>
+  <w:style w:type="character" w:customStyle="1" w:styleId="Kop2Char">
+    <w:name w:val="Kop 2 Char"/>
+    <w:basedOn w:val="Standaardalinea-lettertype"/>
+    <w:link w:val="Kop2"/>
     <w:uiPriority w:val="9"/>
     <w:semiHidden/>
     <w:rsid w:val="003539DF"/>
     <w:rPr>
-      <w:rFonts w:asciiTheme="majorHAnsi" w:hAnsiTheme="majorHAnsi" w:eastAsiaTheme="majorEastAsia" w:cstheme="majorBidi"/>
+      <w:rFonts w:asciiTheme="majorHAnsi" w:eastAsiaTheme="majorEastAsia" w:hAnsiTheme="majorHAnsi" w:cstheme="majorBidi"/>
       <w:color w:val="0F4761" w:themeColor="accent1" w:themeShade="BF"/>
       <w:sz w:val="32"/>
       <w:szCs w:val="32"/>
     </w:rPr>
   </w:style>
-  <w:style w:type="character" w:styleId="Heading3Char" w:customStyle="1">
-    <w:name w:val="Heading 3 Char"/>
-    <w:basedOn w:val="DefaultParagraphFont"/>
-    <w:link w:val="Heading3"/>
+  <w:style w:type="character" w:customStyle="1" w:styleId="Kop3Char">
+    <w:name w:val="Kop 3 Char"/>
+    <w:basedOn w:val="Standaardalinea-lettertype"/>
+    <w:link w:val="Kop3"/>
     <w:uiPriority w:val="9"/>
     <w:semiHidden/>
     <w:rsid w:val="003539DF"/>
@@ -3761,10 +3219,10 @@
       <w:szCs w:val="28"/>
     </w:rPr>
   </w:style>
-  <w:style w:type="character" w:styleId="Heading4Char" w:customStyle="1">
-    <w:name w:val="Heading 4 Char"/>
-    <w:basedOn w:val="DefaultParagraphFont"/>
-    <w:link w:val="Heading4"/>
+  <w:style w:type="character" w:customStyle="1" w:styleId="Kop4Char">
+    <w:name w:val="Kop 4 Char"/>
+    <w:basedOn w:val="Standaardalinea-lettertype"/>
+    <w:link w:val="Kop4"/>
     <w:uiPriority w:val="9"/>
     <w:semiHidden/>
     <w:rsid w:val="003539DF"/>
@@ -3775,10 +3233,10 @@
       <w:color w:val="0F4761" w:themeColor="accent1" w:themeShade="BF"/>
     </w:rPr>
   </w:style>
-  <w:style w:type="character" w:styleId="Heading5Char" w:customStyle="1">
-    <w:name w:val="Heading 5 Char"/>
-    <w:basedOn w:val="DefaultParagraphFont"/>
-    <w:link w:val="Heading5"/>
+  <w:style w:type="character" w:customStyle="1" w:styleId="Kop5Char">
+    <w:name w:val="Kop 5 Char"/>
+    <w:basedOn w:val="Standaardalinea-lettertype"/>
+    <w:link w:val="Kop5"/>
     <w:uiPriority w:val="9"/>
     <w:semiHidden/>
     <w:rsid w:val="003539DF"/>
@@ -3787,10 +3245,10 @@
       <w:color w:val="0F4761" w:themeColor="accent1" w:themeShade="BF"/>
     </w:rPr>
   </w:style>
-  <w:style w:type="character" w:styleId="Heading6Char" w:customStyle="1">
-    <w:name w:val="Heading 6 Char"/>
-    <w:basedOn w:val="DefaultParagraphFont"/>
-    <w:link w:val="Heading6"/>
+  <w:style w:type="character" w:customStyle="1" w:styleId="Kop6Char">
+    <w:name w:val="Kop 6 Char"/>
+    <w:basedOn w:val="Standaardalinea-lettertype"/>
+    <w:link w:val="Kop6"/>
     <w:uiPriority w:val="9"/>
     <w:semiHidden/>
     <w:rsid w:val="003539DF"/>
@@ -3801,10 +3259,10 @@
       <w:color w:val="595959" w:themeColor="text1" w:themeTint="A6"/>
     </w:rPr>
   </w:style>
-  <w:style w:type="character" w:styleId="Heading7Char" w:customStyle="1">
-    <w:name w:val="Heading 7 Char"/>
-    <w:basedOn w:val="DefaultParagraphFont"/>
-    <w:link w:val="Heading7"/>
+  <w:style w:type="character" w:customStyle="1" w:styleId="Kop7Char">
+    <w:name w:val="Kop 7 Char"/>
+    <w:basedOn w:val="Standaardalinea-lettertype"/>
+    <w:link w:val="Kop7"/>
     <w:uiPriority w:val="9"/>
     <w:semiHidden/>
     <w:rsid w:val="003539DF"/>
@@ -3813,10 +3271,10 @@
       <w:color w:val="595959" w:themeColor="text1" w:themeTint="A6"/>
     </w:rPr>
   </w:style>
-  <w:style w:type="character" w:styleId="Heading8Char" w:customStyle="1">
-    <w:name w:val="Heading 8 Char"/>
-    <w:basedOn w:val="DefaultParagraphFont"/>
-    <w:link w:val="Heading8"/>
+  <w:style w:type="character" w:customStyle="1" w:styleId="Kop8Char">
+    <w:name w:val="Kop 8 Char"/>
+    <w:basedOn w:val="Standaardalinea-lettertype"/>
+    <w:link w:val="Kop8"/>
     <w:uiPriority w:val="9"/>
     <w:semiHidden/>
     <w:rsid w:val="003539DF"/>
@@ -3827,10 +3285,10 @@
       <w:color w:val="272727" w:themeColor="text1" w:themeTint="D8"/>
     </w:rPr>
   </w:style>
-  <w:style w:type="character" w:styleId="Heading9Char" w:customStyle="1">
-    <w:name w:val="Heading 9 Char"/>
-    <w:basedOn w:val="DefaultParagraphFont"/>
-    <w:link w:val="Heading9"/>
+  <w:style w:type="character" w:customStyle="1" w:styleId="Kop9Char">
+    <w:name w:val="Kop 9 Char"/>
+    <w:basedOn w:val="Standaardalinea-lettertype"/>
+    <w:link w:val="Kop9"/>
     <w:uiPriority w:val="9"/>
     <w:semiHidden/>
     <w:rsid w:val="003539DF"/>
@@ -3839,11 +3297,11 @@
       <w:color w:val="272727" w:themeColor="text1" w:themeTint="D8"/>
     </w:rPr>
   </w:style>
-  <w:style w:type="paragraph" w:styleId="Title">
+  <w:style w:type="paragraph" w:styleId="Titel">
     <w:name w:val="Title"/>
-    <w:basedOn w:val="Normal"/>
-    <w:next w:val="Normal"/>
-    <w:link w:val="TitleChar"/>
+    <w:basedOn w:val="Standaard"/>
+    <w:next w:val="Standaard"/>
+    <w:link w:val="TitelChar"/>
     <w:uiPriority w:val="10"/>
     <w:qFormat/>
     <w:rsid w:val="003539DF"/>
@@ -3852,32 +3310,32 @@
       <w:contextualSpacing/>
     </w:pPr>
     <w:rPr>
-      <w:rFonts w:asciiTheme="majorHAnsi" w:hAnsiTheme="majorHAnsi" w:eastAsiaTheme="majorEastAsia" w:cstheme="majorBidi"/>
+      <w:rFonts w:asciiTheme="majorHAnsi" w:eastAsiaTheme="majorEastAsia" w:hAnsiTheme="majorHAnsi" w:cstheme="majorBidi"/>
       <w:spacing w:val="-10"/>
       <w:kern w:val="28"/>
       <w:sz w:val="56"/>
       <w:szCs w:val="56"/>
     </w:rPr>
   </w:style>
-  <w:style w:type="character" w:styleId="TitleChar" w:customStyle="1">
-    <w:name w:val="Title Char"/>
-    <w:basedOn w:val="DefaultParagraphFont"/>
-    <w:link w:val="Title"/>
+  <w:style w:type="character" w:customStyle="1" w:styleId="TitelChar">
+    <w:name w:val="Titel Char"/>
+    <w:basedOn w:val="Standaardalinea-lettertype"/>
+    <w:link w:val="Titel"/>
     <w:uiPriority w:val="10"/>
     <w:rsid w:val="003539DF"/>
     <w:rPr>
-      <w:rFonts w:asciiTheme="majorHAnsi" w:hAnsiTheme="majorHAnsi" w:eastAsiaTheme="majorEastAsia" w:cstheme="majorBidi"/>
+      <w:rFonts w:asciiTheme="majorHAnsi" w:eastAsiaTheme="majorEastAsia" w:hAnsiTheme="majorHAnsi" w:cstheme="majorBidi"/>
       <w:spacing w:val="-10"/>
       <w:kern w:val="28"/>
       <w:sz w:val="56"/>
       <w:szCs w:val="56"/>
     </w:rPr>
   </w:style>
-  <w:style w:type="paragraph" w:styleId="Subtitle">
+  <w:style w:type="paragraph" w:styleId="Ondertitel">
     <w:name w:val="Subtitle"/>
-    <w:basedOn w:val="Normal"/>
-    <w:next w:val="Normal"/>
-    <w:link w:val="SubtitleChar"/>
+    <w:basedOn w:val="Standaard"/>
+    <w:next w:val="Standaard"/>
+    <w:link w:val="OndertitelChar"/>
     <w:uiPriority w:val="11"/>
     <w:qFormat/>
     <w:rsid w:val="003539DF"/>
@@ -3894,10 +3352,10 @@
       <w:szCs w:val="28"/>
     </w:rPr>
   </w:style>
-  <w:style w:type="character" w:styleId="SubtitleChar" w:customStyle="1">
-    <w:name w:val="Subtitle Char"/>
-    <w:basedOn w:val="DefaultParagraphFont"/>
-    <w:link w:val="Subtitle"/>
+  <w:style w:type="character" w:customStyle="1" w:styleId="OndertitelChar">
+    <w:name w:val="Ondertitel Char"/>
+    <w:basedOn w:val="Standaardalinea-lettertype"/>
+    <w:link w:val="Ondertitel"/>
     <w:uiPriority w:val="11"/>
     <w:rsid w:val="003539DF"/>
     <w:rPr>
@@ -3908,11 +3366,11 @@
       <w:szCs w:val="28"/>
     </w:rPr>
   </w:style>
-  <w:style w:type="paragraph" w:styleId="Quote">
+  <w:style w:type="paragraph" w:styleId="Citaat">
     <w:name w:val="Quote"/>
-    <w:basedOn w:val="Normal"/>
-    <w:next w:val="Normal"/>
-    <w:link w:val="QuoteChar"/>
+    <w:basedOn w:val="Standaard"/>
+    <w:next w:val="Standaard"/>
+    <w:link w:val="CitaatChar"/>
     <w:uiPriority w:val="29"/>
     <w:qFormat/>
     <w:rsid w:val="003539DF"/>
@@ -3926,10 +3384,10 @@
       <w:color w:val="404040" w:themeColor="text1" w:themeTint="BF"/>
     </w:rPr>
   </w:style>
-  <w:style w:type="character" w:styleId="QuoteChar" w:customStyle="1">
-    <w:name w:val="Quote Char"/>
-    <w:basedOn w:val="DefaultParagraphFont"/>
-    <w:link w:val="Quote"/>
+  <w:style w:type="character" w:customStyle="1" w:styleId="CitaatChar">
+    <w:name w:val="Citaat Char"/>
+    <w:basedOn w:val="Standaardalinea-lettertype"/>
+    <w:link w:val="Citaat"/>
     <w:uiPriority w:val="29"/>
     <w:rsid w:val="003539DF"/>
     <w:rPr>
@@ -3938,10 +3396,10 @@
       <w:color w:val="404040" w:themeColor="text1" w:themeTint="BF"/>
     </w:rPr>
   </w:style>
-  <w:style w:type="paragraph" w:styleId="ListParagraph">
+  <w:style w:type="paragraph" w:styleId="Lijstalinea">
     <w:name w:val="List Paragraph"/>
-    <w:basedOn w:val="Normal"/>
-    <w:link w:val="ListParagraphChar"/>
+    <w:basedOn w:val="Standaard"/>
+    <w:link w:val="LijstalineaChar"/>
     <w:uiPriority w:val="34"/>
     <w:qFormat/>
     <w:rsid w:val="003539DF"/>
@@ -3950,9 +3408,9 @@
       <w:contextualSpacing/>
     </w:pPr>
   </w:style>
-  <w:style w:type="character" w:styleId="IntenseEmphasis">
+  <w:style w:type="character" w:styleId="Intensievebenadrukking">
     <w:name w:val="Intense Emphasis"/>
-    <w:basedOn w:val="DefaultParagraphFont"/>
+    <w:basedOn w:val="Standaardalinea-lettertype"/>
     <w:uiPriority w:val="21"/>
     <w:qFormat/>
     <w:rsid w:val="003539DF"/>
@@ -3962,18 +3420,18 @@
       <w:color w:val="0F4761" w:themeColor="accent1" w:themeShade="BF"/>
     </w:rPr>
   </w:style>
-  <w:style w:type="paragraph" w:styleId="IntenseQuote">
+  <w:style w:type="paragraph" w:styleId="Duidelijkcitaat">
     <w:name w:val="Intense Quote"/>
-    <w:basedOn w:val="Normal"/>
-    <w:next w:val="Normal"/>
-    <w:link w:val="IntenseQuoteChar"/>
+    <w:basedOn w:val="Standaard"/>
+    <w:next w:val="Standaard"/>
+    <w:link w:val="DuidelijkcitaatChar"/>
     <w:uiPriority w:val="30"/>
     <w:qFormat/>
     <w:rsid w:val="003539DF"/>
     <w:pPr>
       <w:pBdr>
-        <w:top w:val="single" w:color="0F4761" w:themeColor="accent1" w:themeShade="BF" w:sz="4" w:space="10"/>
-        <w:bottom w:val="single" w:color="0F4761" w:themeColor="accent1" w:themeShade="BF" w:sz="4" w:space="10"/>
+        <w:top w:val="single" w:sz="4" w:space="10" w:color="0F4761" w:themeColor="accent1" w:themeShade="BF"/>
+        <w:bottom w:val="single" w:sz="4" w:space="10" w:color="0F4761" w:themeColor="accent1" w:themeShade="BF"/>
       </w:pBdr>
       <w:spacing w:before="360" w:after="360"/>
       <w:ind w:left="864" w:right="864"/>
@@ -3985,10 +3443,10 @@
       <w:color w:val="0F4761" w:themeColor="accent1" w:themeShade="BF"/>
     </w:rPr>
   </w:style>
-  <w:style w:type="character" w:styleId="IntenseQuoteChar" w:customStyle="1">
-    <w:name w:val="Intense Quote Char"/>
-    <w:basedOn w:val="DefaultParagraphFont"/>
-    <w:link w:val="IntenseQuote"/>
+  <w:style w:type="character" w:customStyle="1" w:styleId="DuidelijkcitaatChar">
+    <w:name w:val="Duidelijk citaat Char"/>
+    <w:basedOn w:val="Standaardalinea-lettertype"/>
+    <w:link w:val="Duidelijkcitaat"/>
     <w:uiPriority w:val="30"/>
     <w:rsid w:val="003539DF"/>
     <w:rPr>
@@ -3997,9 +3455,9 @@
       <w:color w:val="0F4761" w:themeColor="accent1" w:themeShade="BF"/>
     </w:rPr>
   </w:style>
-  <w:style w:type="character" w:styleId="IntenseReference">
+  <w:style w:type="character" w:styleId="Intensieveverwijzing">
     <w:name w:val="Intense Reference"/>
-    <w:basedOn w:val="DefaultParagraphFont"/>
+    <w:basedOn w:val="Standaardalinea-lettertype"/>
     <w:uiPriority w:val="32"/>
     <w:qFormat/>
     <w:rsid w:val="003539DF"/>
@@ -4011,17 +3469,17 @@
       <w:spacing w:val="5"/>
     </w:rPr>
   </w:style>
-  <w:style w:type="character" w:styleId="ListParagraphChar" w:customStyle="1">
-    <w:name w:val="List Paragraph Char"/>
-    <w:basedOn w:val="DefaultParagraphFont"/>
-    <w:link w:val="ListParagraph"/>
+  <w:style w:type="character" w:customStyle="1" w:styleId="LijstalineaChar">
+    <w:name w:val="Lijstalinea Char"/>
+    <w:basedOn w:val="Standaardalinea-lettertype"/>
+    <w:link w:val="Lijstalinea"/>
     <w:uiPriority w:val="34"/>
     <w:qFormat/>
     <w:rsid w:val="00C22F06"/>
   </w:style>
-  <w:style w:type="table" w:styleId="TableGrid">
+  <w:style w:type="table" w:styleId="Tabelraster">
     <w:name w:val="Table Grid"/>
-    <w:basedOn w:val="TableNormal"/>
+    <w:basedOn w:val="Standaardtabel"/>
     <w:uiPriority w:val="39"/>
     <w:rsid w:val="00C22F06"/>
     <w:pPr>
@@ -4033,19 +3491,19 @@
     </w:rPr>
     <w:tblPr>
       <w:tblBorders>
-        <w:top w:val="single" w:color="auto" w:sz="4" w:space="0"/>
-        <w:left w:val="single" w:color="auto" w:sz="4" w:space="0"/>
-        <w:bottom w:val="single" w:color="auto" w:sz="4" w:space="0"/>
-        <w:right w:val="single" w:color="auto" w:sz="4" w:space="0"/>
-        <w:insideH w:val="single" w:color="auto" w:sz="4" w:space="0"/>
-        <w:insideV w:val="single" w:color="auto" w:sz="4" w:space="0"/>
+        <w:top w:val="single" w:sz="4" w:space="0" w:color="auto"/>
+        <w:left w:val="single" w:sz="4" w:space="0" w:color="auto"/>
+        <w:bottom w:val="single" w:sz="4" w:space="0" w:color="auto"/>
+        <w:right w:val="single" w:sz="4" w:space="0" w:color="auto"/>
+        <w:insideH w:val="single" w:sz="4" w:space="0" w:color="auto"/>
+        <w:insideV w:val="single" w:sz="4" w:space="0" w:color="auto"/>
       </w:tblBorders>
     </w:tblPr>
   </w:style>
-  <w:style w:type="paragraph" w:styleId="Header">
+  <w:style w:type="paragraph" w:styleId="Koptekst">
     <w:name w:val="header"/>
-    <w:basedOn w:val="Normal"/>
-    <w:link w:val="HeaderChar"/>
+    <w:basedOn w:val="Standaard"/>
+    <w:link w:val="KoptekstChar"/>
     <w:uiPriority w:val="99"/>
     <w:unhideWhenUsed/>
     <w:rsid w:val="00F65961"/>
@@ -4057,10 +3515,10 @@
       <w:spacing w:after="0" w:line="240" w:lineRule="auto"/>
     </w:pPr>
   </w:style>
-  <w:style w:type="character" w:styleId="HeaderChar" w:customStyle="1">
-    <w:name w:val="Header Char"/>
-    <w:basedOn w:val="DefaultParagraphFont"/>
-    <w:link w:val="Header"/>
+  <w:style w:type="character" w:customStyle="1" w:styleId="KoptekstChar">
+    <w:name w:val="Koptekst Char"/>
+    <w:basedOn w:val="Standaardalinea-lettertype"/>
+    <w:link w:val="Koptekst"/>
     <w:uiPriority w:val="99"/>
     <w:rsid w:val="00F65961"/>
     <w:rPr>
@@ -4069,10 +3527,10 @@
       <w:lang w:val="en-GB"/>
     </w:rPr>
   </w:style>
-  <w:style w:type="paragraph" w:styleId="Footer">
+  <w:style w:type="paragraph" w:styleId="Voettekst">
     <w:name w:val="footer"/>
-    <w:basedOn w:val="Normal"/>
-    <w:link w:val="FooterChar"/>
+    <w:basedOn w:val="Standaard"/>
+    <w:link w:val="VoettekstChar"/>
     <w:uiPriority w:val="99"/>
     <w:unhideWhenUsed/>
     <w:rsid w:val="00F65961"/>
@@ -4084,10 +3542,10 @@
       <w:spacing w:after="0" w:line="240" w:lineRule="auto"/>
     </w:pPr>
   </w:style>
-  <w:style w:type="character" w:styleId="FooterChar" w:customStyle="1">
-    <w:name w:val="Footer Char"/>
-    <w:basedOn w:val="DefaultParagraphFont"/>
-    <w:link w:val="Footer"/>
+  <w:style w:type="character" w:customStyle="1" w:styleId="VoettekstChar">
+    <w:name w:val="Voettekst Char"/>
+    <w:basedOn w:val="Standaardalinea-lettertype"/>
+    <w:link w:val="Voettekst"/>
     <w:uiPriority w:val="99"/>
     <w:rsid w:val="00F65961"/>
     <w:rPr>
@@ -4096,9 +3554,9 @@
       <w:lang w:val="en-GB"/>
     </w:rPr>
   </w:style>
-  <w:style w:type="character" w:styleId="CommentReference">
+  <w:style w:type="character" w:customStyle="1" w:styleId="CommentReference">
     <w:name w:val="Comment Reference"/>
-    <w:basedOn w:val="DefaultParagraphFont"/>
+    <w:basedOn w:val="Standaardalinea-lettertype"/>
     <w:uiPriority w:val="99"/>
     <w:semiHidden/>
     <w:unhideWhenUsed/>
@@ -4108,9 +3566,9 @@
       <w:szCs w:val="16"/>
     </w:rPr>
   </w:style>
-  <w:style w:type="paragraph" w:styleId="CommentText">
+  <w:style w:type="paragraph" w:customStyle="1" w:styleId="CommentText">
     <w:name w:val="Comment Text"/>
-    <w:basedOn w:val="Normal"/>
+    <w:basedOn w:val="Standaard"/>
     <w:link w:val="CommentTextChar"/>
     <w:uiPriority w:val="99"/>
     <w:unhideWhenUsed/>
@@ -4124,9 +3582,9 @@
       <w:lang w:val="en-GB"/>
     </w:rPr>
   </w:style>
-  <w:style w:type="character" w:styleId="CommentTextChar" w:customStyle="1">
+  <w:style w:type="character" w:customStyle="1" w:styleId="CommentTextChar">
     <w:name w:val="Comment Text Char"/>
-    <w:basedOn w:val="DefaultParagraphFont"/>
+    <w:basedOn w:val="Standaardalinea-lettertype"/>
     <w:link w:val="CommentText"/>
     <w:uiPriority w:val="99"/>
     <w:rsid w:val="002C3698"/>
@@ -4136,11 +3594,26 @@
       <w:lang w:val="en-GB"/>
     </w:rPr>
   </w:style>
+  <w:style w:type="paragraph" w:styleId="Revisie">
+    <w:name w:val="Revision"/>
+    <w:hidden/>
+    <w:uiPriority w:val="99"/>
+    <w:semiHidden/>
+    <w:rsid w:val="00850A44"/>
+    <w:pPr>
+      <w:spacing w:after="0" w:line="240" w:lineRule="auto"/>
+    </w:pPr>
+    <w:rPr>
+      <w:rFonts w:ascii="Arial" w:eastAsia="Arial" w:hAnsi="Arial" w:cs="Arial"/>
+      <w:sz w:val="22"/>
+      <w:szCs w:val="22"/>
+    </w:rPr>
+  </w:style>
 </w:styles>
 </file>
 
 <file path=word/theme/theme1.xml><?xml version="1.0" encoding="utf-8"?>
-<a:theme xmlns:a="http://schemas.openxmlformats.org/drawingml/2006/main" xmlns:thm15="http://schemas.microsoft.com/office/thememl/2012/main" name="Office Theme">
+<a:theme xmlns:a="http://schemas.openxmlformats.org/drawingml/2006/main" name="Office Theme">
   <a:themeElements>
     <a:clrScheme name="Office">
       <a:dk1>
@@ -4626,13 +4099,36 @@
 </file>
 
 <file path=customXml/itemProps1.xml><?xml version="1.0" encoding="utf-8"?>
-<ds:datastoreItem xmlns:ds="http://schemas.openxmlformats.org/officeDocument/2006/customXml" ds:itemID="{EAD0F7BE-66E1-4E68-AAC7-82B5AB2FA5A0}"/>
+<ds:datastoreItem xmlns:ds="http://schemas.openxmlformats.org/officeDocument/2006/customXml" ds:itemID="{EAD0F7BE-66E1-4E68-AAC7-82B5AB2FA5A0}">
+  <ds:schemaRefs>
+    <ds:schemaRef ds:uri="http://schemas.microsoft.com/office/2006/metadata/contentType"/>
+    <ds:schemaRef ds:uri="http://schemas.microsoft.com/office/2006/metadata/properties/metaAttributes"/>
+    <ds:schemaRef ds:uri="http://www.w3.org/2001/XMLSchema"/>
+    <ds:schemaRef ds:uri="http://schemas.microsoft.com/office/2006/metadata/properties"/>
+    <ds:schemaRef ds:uri="f44e6bd5-09db-4117-8b15-adf399208dc6"/>
+    <ds:schemaRef ds:uri="http://schemas.microsoft.com/office/2006/documentManagement/types"/>
+    <ds:schemaRef ds:uri="http://schemas.microsoft.com/office/infopath/2007/PartnerControls"/>
+    <ds:schemaRef ds:uri="http://schemas.openxmlformats.org/package/2006/metadata/core-properties"/>
+    <ds:schemaRef ds:uri="http://purl.org/dc/elements/1.1/"/>
+    <ds:schemaRef ds:uri="http://purl.org/dc/terms/"/>
+    <ds:schemaRef ds:uri="http://schemas.microsoft.com/internal/obd"/>
+  </ds:schemaRefs>
+</ds:datastoreItem>
 </file>
 
 <file path=customXml/itemProps2.xml><?xml version="1.0" encoding="utf-8"?>
-<ds:datastoreItem xmlns:ds="http://schemas.openxmlformats.org/officeDocument/2006/customXml" ds:itemID="{9713DB19-A361-4C50-BB6C-FB00E414249B}"/>
+<ds:datastoreItem xmlns:ds="http://schemas.openxmlformats.org/officeDocument/2006/customXml" ds:itemID="{9713DB19-A361-4C50-BB6C-FB00E414249B}">
+  <ds:schemaRefs>
+    <ds:schemaRef ds:uri="http://schemas.microsoft.com/sharepoint/v3/contenttype/forms"/>
+  </ds:schemaRefs>
+</ds:datastoreItem>
 </file>
 
 <file path=customXml/itemProps3.xml><?xml version="1.0" encoding="utf-8"?>
-<ds:datastoreItem xmlns:ds="http://schemas.openxmlformats.org/officeDocument/2006/customXml" ds:itemID="{9BD9F565-47C0-431F-8862-776BEFFAEAB9}"/>
+<ds:datastoreItem xmlns:ds="http://schemas.openxmlformats.org/officeDocument/2006/customXml" ds:itemID="{9BD9F565-47C0-431F-8862-776BEFFAEAB9}">
+  <ds:schemaRefs>
+    <ds:schemaRef ds:uri="http://schemas.microsoft.com/office/2006/metadata/properties"/>
+    <ds:schemaRef ds:uri="http://schemas.microsoft.com/office/infopath/2007/PartnerControls"/>
+  </ds:schemaRefs>
+</ds:datastoreItem>
 </file>
</xml_diff>